<commit_message>
Reorder case studies: Linewide 2, Hunter Transmission, then ETP
Co-Authored-By: Claude Opus 5.5 <noreply@anthropic.com>
Claude-Session: https://claude.ai/code/session_01G8J7cEdz3LEcSZ5RNRYq9r
</commit_message>
<xml_diff>
--- a/TSG_Capability_Statement_UGL.docx
+++ b/TSG_Capability_Statement_UGL.docx
@@ -1,6 +1,6 @@
 
 <file path=word/document.xml><?xml version="1.0" encoding="utf-8"?>
-<w:document xmlns:wpc="http://schemas.microsoft.com/office/word/2010/wordprocessingCanvas" xmlns:cx="http://schemas.microsoft.com/office/drawing/2014/chartex" xmlns:cx1="http://schemas.microsoft.com/office/drawing/2015/9/8/chartex" xmlns:cx2="http://schemas.microsoft.com/office/drawing/2015/10/21/chartex" xmlns:cx3="http://schemas.microsoft.com/office/drawing/2016/5/9/chartex" xmlns:cx4="http://schemas.microsoft.com/office/drawing/2016/5/10/chartex" xmlns:cx5="http://schemas.microsoft.com/office/drawing/2016/5/11/chartex" xmlns:cx6="http://schemas.microsoft.com/office/drawing/2016/5/12/chartex" xmlns:cx7="http://schemas.microsoft.com/office/drawing/2016/5/13/chartex" xmlns:cx8="http://schemas.microsoft.com/office/drawing/2016/5/14/chartex" xmlns:mc="http://schemas.openxmlformats.org/markup-compatibility/2006" xmlns:m="http://schemas.openxmlformats.org/officeDocument/2006/math" xmlns:aink="http://schemas.microsoft.com/office/drawing/2016/ink" xmlns:am3d="http://schemas.microsoft.com/office/drawing/2017/model3d" xmlns:oel="http://schemas.microsoft.com/office/2019/extlst" xmlns:r="http://schemas.openxmlformats.org/officeDocument/2006/relationships" xmlns:wp14="http://schemas.microsoft.com/office/word/2010/wordprocessingDrawing" xmlns:wp="http://schemas.openxmlformats.org/drawingml/2006/wordprocessingDrawing" xmlns:wpg="http://schemas.microsoft.com/office/word/2010/wordprocessingGroup" xmlns:wpi="http://schemas.microsoft.com/office/word/2010/wordprocessingInk" xmlns:wps="http://schemas.microsoft.com/office/word/2010/wordprocessingShape" xmlns:o="urn:schemas-microsoft-com:office:office" xmlns:v="urn:schemas-microsoft-com:vml" xmlns:w10="urn:schemas-microsoft-com:office:word" xmlns:w="http://schemas.openxmlformats.org/wordprocessingml/2006/main" xmlns:w14="http://schemas.microsoft.com/office/word/2010/wordml" xmlns:w15="http://schemas.microsoft.com/office/word/2012/wordml" xmlns:w16cex="http://schemas.microsoft.com/office/word/2018/wordml/cex" xmlns:w16cid="http://schemas.microsoft.com/office/word/2016/wordml/cid" xmlns:w16="http://schemas.microsoft.com/office/word/2018/wordml" xmlns:w16sdtdh="http://schemas.microsoft.com/office/word/2020/wordml/sdtdatahash" xmlns:w16sdtfl="http://schemas.microsoft.com/office/word/2024/wordml/sdtformatlock" xmlns:w16se="http://schemas.microsoft.com/office/word/2015/wordml/symex" xmlns:w16du="http://schemas.microsoft.com/office/word/2023/wordml/word16du" xmlns:wne="http://schemas.microsoft.com/office/word/2006/wordml" mc:Ignorable="w14 w15 w16se w16cid w16 w16cex w16sdtdh w16sdtfl w16du wp14">
+<w:document xmlns:wpc="http://schemas.microsoft.com/office/word/2010/wordprocessingCanvas" xmlns:cx="http://schemas.microsoft.com/office/drawing/2014/chartex" xmlns:cx1="http://schemas.microsoft.com/office/drawing/2015/9/8/chartex" xmlns:cx2="http://schemas.microsoft.com/office/drawing/2015/10/21/chartex" xmlns:cx3="http://schemas.microsoft.com/office/drawing/2016/5/9/chartex" xmlns:cx4="http://schemas.microsoft.com/office/drawing/2016/5/10/chartex" xmlns:cx5="http://schemas.microsoft.com/office/drawing/2016/5/11/chartex" xmlns:cx6="http://schemas.microsoft.com/office/drawing/2016/5/12/chartex" xmlns:cx7="http://schemas.microsoft.com/office/drawing/2016/5/13/chartex" xmlns:cx8="http://schemas.microsoft.com/office/drawing/2016/5/14/chartex" xmlns:mc="http://schemas.openxmlformats.org/markup-compatibility/2006" xmlns:aink="http://schemas.microsoft.com/office/drawing/2016/ink" xmlns:am3d="http://schemas.microsoft.com/office/drawing/2017/model3d" xmlns:o="urn:schemas-microsoft-com:office:office" xmlns:oel="http://schemas.microsoft.com/office/2019/extlst" xmlns:r="http://schemas.openxmlformats.org/officeDocument/2006/relationships" xmlns:m="http://schemas.openxmlformats.org/officeDocument/2006/math" xmlns:v="urn:schemas-microsoft-com:vml" xmlns:wp14="http://schemas.microsoft.com/office/word/2010/wordprocessingDrawing" xmlns:wp="http://schemas.openxmlformats.org/drawingml/2006/wordprocessingDrawing" xmlns:w10="urn:schemas-microsoft-com:office:word" xmlns:w="http://schemas.openxmlformats.org/wordprocessingml/2006/main" xmlns:w14="http://schemas.microsoft.com/office/word/2010/wordml" xmlns:w15="http://schemas.microsoft.com/office/word/2012/wordml" xmlns:w16cex="http://schemas.microsoft.com/office/word/2018/wordml/cex" xmlns:w16cid="http://schemas.microsoft.com/office/word/2016/wordml/cid" xmlns:w16="http://schemas.microsoft.com/office/word/2018/wordml" xmlns:w16du="http://schemas.microsoft.com/office/word/2023/wordml/word16du" xmlns:w16sdtdh="http://schemas.microsoft.com/office/word/2020/wordml/sdtdatahash" xmlns:w16sdtfl="http://schemas.microsoft.com/office/word/2024/wordml/sdtformatlock" xmlns:w16se="http://schemas.microsoft.com/office/word/2015/wordml/symex" xmlns:wpg="http://schemas.microsoft.com/office/word/2010/wordprocessingGroup" xmlns:wpi="http://schemas.microsoft.com/office/word/2010/wordprocessingInk" xmlns:wne="http://schemas.microsoft.com/office/word/2006/wordml" xmlns:wps="http://schemas.microsoft.com/office/word/2010/wordprocessingShape" mc:Ignorable="w14 w15 w16se w16cid w16 w16cex w16sdtdh w16sdtfl w16du wp14">
   <w:background w:color="FBF8F2"/>
   <w:body>
     <w:p>
@@ -12,7 +12,7 @@
           <w:noProof/>
         </w:rPr>
         <w:drawing>
-          <wp:anchor distT="0" distB="0" distL="0" distR="0" simplePos="0" relativeHeight="251658251" behindDoc="1" locked="0" layoutInCell="1" allowOverlap="1" wp14:anchorId="49A174BF" wp14:editId="49A174C0">
+          <wp:anchor distT="0" distB="0" distL="0" distR="0" simplePos="0" relativeHeight="251659776" behindDoc="1" locked="0" layoutInCell="1" allowOverlap="1" wp14:anchorId="49A174BF" wp14:editId="49A174C0">
             <wp:simplePos x="0" y="0"/>
             <wp:positionH relativeFrom="page">
               <wp:posOffset>0</wp:posOffset>
@@ -57,6 +57,11 @@
             </a:graphic>
           </wp:anchor>
         </w:drawing>
+      </w:r>
+      <w:r>
+        <w:rPr>
+          <w:noProof/>
+        </w:rPr>
         <w:drawing>
           <wp:inline distT="0" distB="0" distL="0" distR="0" wp14:anchorId="49A174C1" wp14:editId="49A174C2">
             <wp:extent cx="2190750" cy="447675"/>
@@ -183,7 +188,29 @@
           <w:sz w:val="18"/>
           <w:szCs w:val="18"/>
         </w:rPr>
-        <w:t xml:space="preserve">Prepared for UGL  |  October 2026</w:t>
+        <w:t xml:space="preserve">Prepared for </w:t>
+      </w:r>
+      <w:proofErr w:type="gramStart"/>
+      <w:r>
+        <w:rPr>
+          <w:rFonts w:ascii="Poppins" w:eastAsia="Poppins" w:hAnsi="Poppins" w:cs="Poppins"/>
+          <w:color w:val="F9F6F2"/>
+          <w:spacing w:val="20"/>
+          <w:sz w:val="18"/>
+          <w:szCs w:val="18"/>
+        </w:rPr>
+        <w:t>UGL  |</w:t>
+      </w:r>
+      <w:proofErr w:type="gramEnd"/>
+      <w:r>
+        <w:rPr>
+          <w:rFonts w:ascii="Poppins" w:eastAsia="Poppins" w:hAnsi="Poppins" w:cs="Poppins"/>
+          <w:color w:val="F9F6F2"/>
+          <w:spacing w:val="20"/>
+          <w:sz w:val="18"/>
+          <w:szCs w:val="18"/>
+        </w:rPr>
+        <w:t xml:space="preserve">  October 2026</w:t>
       </w:r>
     </w:p>
     <w:p>
@@ -212,16 +239,16 @@
         </w:rPr>
         <w:lastRenderedPageBreak/>
         <w:drawing>
-          <wp:anchor distT="0" distB="0" distL="0" distR="0" simplePos="0" relativeHeight="251658252" behindDoc="1" locked="0" layoutInCell="1" allowOverlap="1" wp14:anchorId="49A174C3" wp14:editId="49A174C4">
+          <wp:anchor distT="0" distB="0" distL="0" distR="0" simplePos="0" relativeHeight="251660800" behindDoc="1" locked="0" layoutInCell="1" allowOverlap="1" wp14:anchorId="49A174C3" wp14:editId="4939270A">
             <wp:simplePos x="0" y="0"/>
             <wp:positionH relativeFrom="page">
-              <wp:posOffset>0</wp:posOffset>
+              <wp:align>left</wp:align>
             </wp:positionH>
             <wp:positionV relativeFrom="page">
-              <wp:posOffset>0</wp:posOffset>
+              <wp:posOffset>8627</wp:posOffset>
             </wp:positionV>
             <wp:extent cx="7562850" cy="10696575"/>
-            <wp:effectExtent l="0" t="0" r="0" b="0"/>
+            <wp:effectExtent l="0" t="0" r="0" b="9525"/>
             <wp:wrapNone/>
             <wp:docPr id="334654081" name="Picture 537264480"/>
             <wp:cNvGraphicFramePr>
@@ -257,6 +284,11 @@
             </a:graphic>
           </wp:anchor>
         </w:drawing>
+      </w:r>
+      <w:r>
+        <w:rPr>
+          <w:noProof/>
+        </w:rPr>
         <w:drawing>
           <wp:inline distT="0" distB="0" distL="0" distR="0" wp14:anchorId="49A174C5" wp14:editId="49A174C6">
             <wp:extent cx="1905000" cy="390525"/>
@@ -310,7 +342,7 @@
           <w:sz w:val="17"/>
           <w:szCs w:val="17"/>
         </w:rPr>
-        <w:t xml:space="preserve">A personal note</w:t>
+        <w:t>A personal note</w:t>
       </w:r>
     </w:p>
     <w:p>
@@ -332,7 +364,7 @@
           <w:sz w:val="40"/>
           <w:szCs w:val="40"/>
         </w:rPr>
-        <w:t xml:space="preserve">share our story</w:t>
+        <w:t>share our story</w:t>
       </w:r>
       <w:r>
         <w:rPr>
@@ -348,7 +380,7 @@
         <w:spacing w:after="200" w:line="300" w:lineRule="auto"/>
       </w:pPr>
       <w:r>
-        <w:t xml:space="preserve">Dear Matthew,</w:t>
+        <w:t>Dear Matthew,</w:t>
       </w:r>
     </w:p>
     <w:p>
@@ -356,7 +388,7 @@
         <w:spacing w:after="200" w:line="300" w:lineRule="auto"/>
       </w:pPr>
       <w:r>
-        <w:t xml:space="preserve">Thank you for your interest in The Strategy Group, and for the opportunity to share a little more about who we are and how we work.</w:t>
+        <w:t>Thank you for your interest in The Strategy Group, and for the opportunity to share a little more about who we are and how we work.</w:t>
       </w:r>
     </w:p>
     <w:p>
@@ -364,7 +396,39 @@
         <w:spacing w:after="200" w:line="300" w:lineRule="auto"/>
       </w:pPr>
       <w:r>
-        <w:t xml:space="preserve">Over the past five years, we have had the privilege of working alongside CPB Contractors, and more recently the CPB and UGL joint venture, on some of the most significant infrastructure pursuits in New South Wales. From the Eastern Tunnelling Package, where we were embedded with the team for more than five years, to Sydney Metro West Linewide 2, the Hunter Transmission Project, New England REZ and now GoFar, we have seen first-hand what your teams are capable of when they put the client at the centre of every conversation.</w:t>
+        <w:t>Over the past five years, we have had the privilege of working alongside UGL</w:t>
+      </w:r>
+      <w:r>
+        <w:t>/CPB</w:t>
+      </w:r>
+      <w:r>
+        <w:t xml:space="preserve"> on some of the most significant infrastructure pursuits in New South Wales. From Sydney Metro West </w:t>
+      </w:r>
+      <w:proofErr w:type="spellStart"/>
+      <w:r>
+        <w:t>Linewide</w:t>
+      </w:r>
+      <w:proofErr w:type="spellEnd"/>
+      <w:r>
+        <w:t xml:space="preserve"> 2</w:t>
+      </w:r>
+      <w:r>
+        <w:t xml:space="preserve">, where we were embedded with the team </w:t>
+      </w:r>
+      <w:r>
+        <w:t>during the tender period</w:t>
+      </w:r>
+      <w:r>
+        <w:t xml:space="preserve">, to </w:t>
+      </w:r>
+      <w:r>
+        <w:t>the Hunter Transmission Project</w:t>
+      </w:r>
+      <w:r>
+        <w:t xml:space="preserve"> and</w:t>
+      </w:r>
+      <w:r>
+        <w:t xml:space="preserve"> New England REZ, we have seen first-hand what your teams are capable of when they put the client at the centre of every conversation.</w:t>
       </w:r>
     </w:p>
     <w:p>
@@ -372,7 +436,19 @@
         <w:spacing w:after="200" w:line="300" w:lineRule="auto"/>
       </w:pPr>
       <w:r>
-        <w:t xml:space="preserve">What has stayed with me most is not the bids themselves, but the people. We have watched engineers and project leaders who are deeply expert in their fields grow into confident, empathetic communicators who can sit across the table from an evaluation panel and show, not just tell, that they understand what the client needs. That shift does not come from a template. It comes from trust, honest feedback and a willingness to do things differently, and the CPB and UGL teams have shown all three.</w:t>
+        <w:t xml:space="preserve">What has stayed with me most is not the bids themselves, but the people. We have watched engineers and project leaders who are deeply expert in their fields grow into confident, empathetic communicators who can sit across the table from an evaluation panel and show, not just tell, that they understand what the client needs. That shift </w:t>
+      </w:r>
+      <w:r>
+        <w:t>has taken place through</w:t>
+      </w:r>
+      <w:r>
+        <w:t xml:space="preserve"> trust, honest feedback and a willingness to do things differently, and the UGL</w:t>
+      </w:r>
+      <w:r>
+        <w:t xml:space="preserve"> &amp; CPB teams that we’ve worked with </w:t>
+      </w:r>
+      <w:r>
+        <w:t>have shown all three.</w:t>
       </w:r>
     </w:p>
     <w:p>
@@ -380,7 +456,13 @@
         <w:spacing w:after="200" w:line="300" w:lineRule="auto"/>
       </w:pPr>
       <w:r>
-        <w:t xml:space="preserve">In this statement, we set out how we support major project teams and share the engagements we have been part of with CPB and UGL, so you can see our work through the lens of your own pursuits.</w:t>
+        <w:t>In this statement, we set out how we support major project teams and share the engagements we have been part of with UGL</w:t>
+      </w:r>
+      <w:r>
+        <w:t>/CPB</w:t>
+      </w:r>
+      <w:r>
+        <w:t>, so you can see our work through the lens of your own pursuits.</w:t>
       </w:r>
     </w:p>
     <w:p>
@@ -388,7 +470,10 @@
         <w:spacing w:after="200" w:line="300" w:lineRule="auto"/>
       </w:pPr>
       <w:r>
-        <w:t xml:space="preserve">I would welcome the opportunity to meet with you, introduce you to some of our team and hear more about what lies ahead for UGL. We see this as the start of a conversation, and a partnership we would be proud to deepen.</w:t>
+        <w:t>I would welcome the opportunity to meet with you, introduce you to some of our team and hear more about what lies ahead for UGL. We see this as the start of a conversation, and a partnership we would be</w:t>
+      </w:r>
+      <w:r>
+        <w:t xml:space="preserve"> delighted to build on.</w:t>
       </w:r>
     </w:p>
     <w:p>
@@ -396,7 +481,7 @@
         <w:spacing w:after="360" w:line="300" w:lineRule="auto"/>
       </w:pPr>
       <w:r>
-        <w:t xml:space="preserve">Warm regards,</w:t>
+        <w:t>Warm regards,</w:t>
       </w:r>
     </w:p>
     <w:p>
@@ -408,10 +493,10 @@
           <w:noProof/>
         </w:rPr>
         <w:drawing>
-          <wp:inline distT="0" distB="0" distL="0" distR="0" wp14:anchorId="49A174E7" wp14:editId="053C306C">
-            <wp:extent cx="610235" cy="732282"/>
-            <wp:effectExtent l="0" t="0" r="6350" b="0"/>
-            <wp:docPr id="1999967808" name="Picture 618884352"/>
+          <wp:inline distT="0" distB="0" distL="0" distR="0" wp14:anchorId="568A9184" wp14:editId="0B861EDB">
+            <wp:extent cx="750498" cy="750498"/>
+            <wp:effectExtent l="0" t="0" r="0" b="0"/>
+            <wp:docPr id="137467485" name="Picture 137467485"/>
             <wp:cNvGraphicFramePr>
               <a:graphicFrameLocks xmlns:a="http://schemas.openxmlformats.org/drawingml/2006/main" noChangeAspect="1"/>
             </wp:cNvGraphicFramePr>
@@ -424,14 +509,15 @@
                       <a:picLocks noChangeAspect="1" noChangeArrowheads="1"/>
                     </pic:cNvPicPr>
                   </pic:nvPicPr>
-                  <pic:blipFill>
-                    <a:blip r:embed="rId45" cstate="print">
+                  <pic:blipFill rotWithShape="1">
+                    <a:blip r:embed="rId19" cstate="print">
                       <a:extLst>
                         <a:ext uri="{28A0092B-C50C-407E-A947-70E740481C1C}">
                           <a14:useLocalDpi xmlns:a14="http://schemas.microsoft.com/office/drawing/2010/main" val="0"/>
                         </a:ext>
                       </a:extLst>
                     </a:blip>
+                    <a:srcRect t="2031" b="14635"/>
                     <a:stretch>
                       <a:fillRect/>
                     </a:stretch>
@@ -439,16 +525,20 @@
                   <pic:spPr bwMode="auto">
                     <a:xfrm>
                       <a:off x="0" y="0"/>
-                      <a:ext cx="610235" cy="732282"/>
+                      <a:ext cx="759023" cy="759023"/>
                     </a:xfrm>
                     <a:prstGeom prst="ellipse">
                       <a:avLst/>
                     </a:prstGeom>
-                    <a:ln w="190500" cap="rnd">
+                    <a:ln>
                       <a:noFill/>
-                      <a:prstDash val="solid"/>
                     </a:ln>
                     <a:effectLst/>
+                    <a:extLst>
+                      <a:ext uri="{53640926-AAD7-44D8-BBD7-CCE9431645EC}">
+                        <a14:shadowObscured xmlns:a14="http://schemas.microsoft.com/office/drawing/2010/main"/>
+                      </a:ext>
+                    </a:extLst>
                   </pic:spPr>
                 </pic:pic>
               </a:graphicData>
@@ -467,7 +557,7 @@
           <w:sz w:val="24"/>
           <w:szCs w:val="24"/>
         </w:rPr>
-        <w:t xml:space="preserve">Jeffrey Tobias</w:t>
+        <w:t>Jeffrey Tobias</w:t>
       </w:r>
     </w:p>
     <w:p>
@@ -480,14 +570,14 @@
           <w:sz w:val="18"/>
           <w:szCs w:val="18"/>
         </w:rPr>
-        <w:t xml:space="preserve">Managing Director, The Strategy Group</w:t>
+        <w:t>Managing Director, The Strategy Group</w:t>
       </w:r>
     </w:p>
     <w:p>
       <w:pPr>
         <w:sectPr>
-          <w:headerReference w:type="default" r:id="rId19"/>
-          <w:footerReference w:type="default" r:id="rId20"/>
+          <w:headerReference w:type="default" r:id="rId20"/>
+          <w:footerReference w:type="default" r:id="rId21"/>
           <w:pgSz w:w="11906" w:h="16838"/>
           <w:pgMar w:top="1000" w:right="1134" w:bottom="1000" w:left="1418" w:header="500" w:footer="500" w:gutter="0"/>
           <w:cols w:space="720"/>
@@ -505,7 +595,7 @@
         </w:rPr>
         <w:lastRenderedPageBreak/>
         <w:drawing>
-          <wp:anchor distT="0" distB="0" distL="0" distR="0" simplePos="0" relativeHeight="251658252" behindDoc="1" locked="0" layoutInCell="1" allowOverlap="1" wp14:anchorId="49A174C3" wp14:editId="49A174C4">
+          <wp:anchor distT="0" distB="0" distL="0" distR="0" simplePos="0" relativeHeight="251661824" behindDoc="1" locked="0" layoutInCell="1" allowOverlap="1" wp14:anchorId="49A174C3" wp14:editId="49A174C4">
             <wp:simplePos x="0" y="0"/>
             <wp:positionH relativeFrom="page">
               <wp:posOffset>0</wp:posOffset>
@@ -550,6 +640,11 @@
             </a:graphic>
           </wp:anchor>
         </w:drawing>
+      </w:r>
+      <w:r>
+        <w:rPr>
+          <w:noProof/>
+        </w:rPr>
         <w:drawing>
           <wp:inline distT="0" distB="0" distL="0" distR="0" wp14:anchorId="49A174C5" wp14:editId="49A174C6">
             <wp:extent cx="1905000" cy="390525"/>
@@ -833,7 +928,25 @@
           <w:szCs w:val="22"/>
         </w:rPr>
         <w:tab/>
-        <w:t>About The Strategy Group</w:t>
+        <w:t xml:space="preserve">About </w:t>
+      </w:r>
+      <w:proofErr w:type="gramStart"/>
+      <w:r>
+        <w:rPr>
+          <w:rFonts w:ascii="Poppins" w:eastAsia="Poppins" w:hAnsi="Poppins" w:cs="Poppins"/>
+          <w:sz w:val="22"/>
+          <w:szCs w:val="22"/>
+        </w:rPr>
+        <w:t>The</w:t>
+      </w:r>
+      <w:proofErr w:type="gramEnd"/>
+      <w:r>
+        <w:rPr>
+          <w:rFonts w:ascii="Poppins" w:eastAsia="Poppins" w:hAnsi="Poppins" w:cs="Poppins"/>
+          <w:sz w:val="22"/>
+          <w:szCs w:val="22"/>
+        </w:rPr>
+        <w:t xml:space="preserve"> Strategy Group</w:t>
       </w:r>
       <w:r>
         <w:rPr>
@@ -934,8 +1047,8 @@
     <w:p>
       <w:pPr>
         <w:sectPr>
-          <w:headerReference w:type="default" r:id="rId19"/>
-          <w:footerReference w:type="default" r:id="rId20"/>
+          <w:headerReference w:type="default" r:id="rId22"/>
+          <w:footerReference w:type="default" r:id="rId23"/>
           <w:pgSz w:w="11906" w:h="16838"/>
           <w:pgMar w:top="1000" w:right="1134" w:bottom="1000" w:left="1418" w:header="500" w:footer="500" w:gutter="0"/>
           <w:cols w:space="720"/>
@@ -953,7 +1066,7 @@
         </w:rPr>
         <w:lastRenderedPageBreak/>
         <w:drawing>
-          <wp:anchor distT="0" distB="0" distL="0" distR="0" simplePos="0" relativeHeight="251658243" behindDoc="0" locked="0" layoutInCell="1" allowOverlap="1" wp14:anchorId="49A174C7" wp14:editId="49A174C8">
+          <wp:anchor distT="0" distB="0" distL="0" distR="0" simplePos="0" relativeHeight="251650560" behindDoc="0" locked="0" layoutInCell="1" allowOverlap="1" wp14:anchorId="49A174C7" wp14:editId="49A174C8">
             <wp:simplePos x="0" y="0"/>
             <wp:positionH relativeFrom="page">
               <wp:posOffset>0</wp:posOffset>
@@ -978,7 +1091,7 @@
                     </pic:cNvPicPr>
                   </pic:nvPicPr>
                   <pic:blipFill>
-                    <a:blip r:embed="rId21"/>
+                    <a:blip r:embed="rId24"/>
                     <a:srcRect/>
                     <a:stretch>
                       <a:fillRect/>
@@ -1064,7 +1177,7 @@
         <w:spacing w:after="280" w:line="300" w:lineRule="auto"/>
       </w:pPr>
       <w:r>
-        <w:t xml:space="preserve">We work alongside contractors, joint ventures and project leaders to uncover client priorities, turn those insights into a clear strategic position, align the people who must deliver it and prepare for the moments when the client judges the team, whether online or in person. Our role can begin before a formal procurement and continue after award as relationships and requirements evolve.</w:t>
+        <w:t>We work alongside contractors, joint ventures and project leaders to uncover client priorities, turn those insights into a clear strategic position, align the people who must deliver it and prepare for the moments when the client judges the team, whether online or in person. Our role can begin before a formal procurement and continue after award as relationships and requirements evolve.</w:t>
       </w:r>
     </w:p>
     <w:tbl>
@@ -1169,7 +1282,7 @@
                 <w:sz w:val="16"/>
                 <w:szCs w:val="16"/>
               </w:rPr>
-              <w:t xml:space="preserve">Projects delivered across multiple industries</w:t>
+              <w:t>Projects delivered across multiple industries</w:t>
             </w:r>
           </w:p>
         </w:tc>
@@ -1294,7 +1407,7 @@
                           <pic:cNvPicPr/>
                         </pic:nvPicPr>
                         <pic:blipFill>
-                          <a:blip r:embed="rId22"/>
+                          <a:blip r:embed="rId25"/>
                           <a:stretch>
                             <a:fillRect/>
                           </a:stretch>
@@ -1391,7 +1504,7 @@
                           <pic:cNvPicPr/>
                         </pic:nvPicPr>
                         <pic:blipFill>
-                          <a:blip r:embed="rId23"/>
+                          <a:blip r:embed="rId26"/>
                           <a:stretch>
                             <a:fillRect/>
                           </a:stretch>
@@ -1421,7 +1534,7 @@
                 <w:sz w:val="19"/>
                 <w:szCs w:val="19"/>
               </w:rPr>
-              <w:t xml:space="preserve">One coherent team across partners, disciplines and client facing interactions.</w:t>
+              <w:t>One coherent team across partners, disciplines and client facing interactions.</w:t>
             </w:r>
           </w:p>
         </w:tc>
@@ -1496,7 +1609,7 @@
                           <pic:cNvPicPr/>
                         </pic:nvPicPr>
                         <pic:blipFill>
-                          <a:blip r:embed="rId24"/>
+                          <a:blip r:embed="rId27"/>
                           <a:stretch>
                             <a:fillRect/>
                           </a:stretch>
@@ -1593,7 +1706,7 @@
                           <pic:cNvPicPr/>
                         </pic:nvPicPr>
                         <pic:blipFill>
-                          <a:blip r:embed="rId25"/>
+                          <a:blip r:embed="rId28"/>
                           <a:stretch>
                             <a:fillRect/>
                           </a:stretch>
@@ -1640,7 +1753,7 @@
         </w:rPr>
         <w:lastRenderedPageBreak/>
         <w:drawing>
-          <wp:anchor distT="0" distB="0" distL="0" distR="0" simplePos="0" relativeHeight="251658249" behindDoc="1" locked="0" layoutInCell="1" allowOverlap="1" wp14:anchorId="49A174C9" wp14:editId="49A174CA">
+          <wp:anchor distT="0" distB="0" distL="0" distR="0" simplePos="0" relativeHeight="251657728" behindDoc="1" locked="0" layoutInCell="1" allowOverlap="1" wp14:anchorId="49A174C9" wp14:editId="49A174CA">
             <wp:simplePos x="0" y="0"/>
             <wp:positionH relativeFrom="page">
               <wp:posOffset>0</wp:posOffset>
@@ -1665,7 +1778,7 @@
                     </pic:cNvPicPr>
                   </pic:nvPicPr>
                   <pic:blipFill>
-                    <a:blip r:embed="rId26"/>
+                    <a:blip r:embed="rId29"/>
                     <a:srcRect/>
                     <a:stretch>
                       <a:fillRect/>
@@ -1685,8 +1798,13 @@
             </a:graphic>
           </wp:anchor>
         </w:drawing>
+      </w:r>
+      <w:r>
+        <w:rPr>
+          <w:noProof/>
+        </w:rPr>
         <w:drawing>
-          <wp:anchor distT="0" distB="0" distL="0" distR="0" simplePos="0" relativeHeight="251658247" behindDoc="0" locked="0" layoutInCell="1" allowOverlap="1" wp14:anchorId="49A174CB" wp14:editId="49A174CC">
+          <wp:anchor distT="0" distB="0" distL="0" distR="0" simplePos="0" relativeHeight="251654656" behindDoc="0" locked="0" layoutInCell="1" allowOverlap="1" wp14:anchorId="49A174CB" wp14:editId="49A174CC">
             <wp:simplePos x="0" y="0"/>
             <wp:positionH relativeFrom="page">
               <wp:posOffset>0</wp:posOffset>
@@ -1711,7 +1829,7 @@
                     </pic:cNvPicPr>
                   </pic:nvPicPr>
                   <pic:blipFill>
-                    <a:blip r:embed="rId27"/>
+                    <a:blip r:embed="rId30"/>
                     <a:srcRect/>
                     <a:stretch>
                       <a:fillRect/>
@@ -2021,7 +2139,23 @@
                 <w:sz w:val="17"/>
                 <w:szCs w:val="17"/>
               </w:rPr>
-              <w:t xml:space="preserve">Cross partner and cross national integration</w:t>
+              <w:t xml:space="preserve">Cross partner and </w:t>
+            </w:r>
+            <w:proofErr w:type="gramStart"/>
+            <w:r>
+              <w:rPr>
+                <w:sz w:val="17"/>
+                <w:szCs w:val="17"/>
+              </w:rPr>
+              <w:t>cross national</w:t>
+            </w:r>
+            <w:proofErr w:type="gramEnd"/>
+            <w:r>
+              <w:rPr>
+                <w:sz w:val="17"/>
+                <w:szCs w:val="17"/>
+              </w:rPr>
+              <w:t xml:space="preserve"> integration</w:t>
             </w:r>
           </w:p>
           <w:p>
@@ -2055,7 +2189,7 @@
                 <w:sz w:val="17"/>
                 <w:szCs w:val="17"/>
               </w:rPr>
-              <w:t xml:space="preserve">Customer centricity coaching</w:t>
+              <w:t>Customer centricity coaching</w:t>
             </w:r>
           </w:p>
           <w:p>
@@ -2221,7 +2355,7 @@
                 <w:sz w:val="17"/>
                 <w:szCs w:val="17"/>
               </w:rPr>
-              <w:t xml:space="preserve">Readiness for every client facing moment</w:t>
+              <w:t>Readiness for every client facing moment</w:t>
             </w:r>
           </w:p>
         </w:tc>
@@ -2256,7 +2390,7 @@
         </w:rPr>
         <w:lastRenderedPageBreak/>
         <w:drawing>
-          <wp:anchor distT="0" distB="0" distL="0" distR="0" simplePos="0" relativeHeight="251658240" behindDoc="0" locked="0" layoutInCell="1" allowOverlap="1" wp14:anchorId="49A174CD" wp14:editId="49A174CE">
+          <wp:anchor distT="0" distB="0" distL="0" distR="0" simplePos="0" relativeHeight="251647488" behindDoc="0" locked="0" layoutInCell="1" allowOverlap="1" wp14:anchorId="49A174CD" wp14:editId="49A174CE">
             <wp:simplePos x="0" y="0"/>
             <wp:positionH relativeFrom="page">
               <wp:posOffset>0</wp:posOffset>
@@ -2281,7 +2415,7 @@
                     </pic:cNvPicPr>
                   </pic:nvPicPr>
                   <pic:blipFill>
-                    <a:blip r:embed="rId27"/>
+                    <a:blip r:embed="rId30"/>
                     <a:srcRect/>
                     <a:stretch>
                       <a:fillRect/>
@@ -2338,7 +2472,7 @@
         <w:spacing w:after="300" w:line="300" w:lineRule="auto"/>
       </w:pPr>
       <w:r>
-        <w:t xml:space="preserve">Clients form a view of a team long before the contract is signed and keep testing it long after. We focus our support on the points in the project life cycle where that view is shaped.</w:t>
+        <w:t>Clients form a view of a team long before the contract is signed and keep testing it long after. We focus our support on the points in the project life cycle where that view is shaped.</w:t>
       </w:r>
     </w:p>
     <w:tbl>
@@ -2652,7 +2786,7 @@
                 <w:sz w:val="18"/>
                 <w:szCs w:val="18"/>
               </w:rPr>
-              <w:t xml:space="preserve">What does the contractor need to achieve and how will it add value?</w:t>
+              <w:t>What does the contractor need to achieve and how will it add value?</w:t>
             </w:r>
           </w:p>
           <w:p>
@@ -2885,7 +3019,7 @@
                 <w:sz w:val="16"/>
                 <w:szCs w:val="16"/>
               </w:rPr>
-              <w:t xml:space="preserve">Cross partner alignment</w:t>
+              <w:t>Cross partner alignment</w:t>
             </w:r>
           </w:p>
           <w:p>
@@ -3001,7 +3135,7 @@
                 <w:sz w:val="18"/>
                 <w:szCs w:val="18"/>
               </w:rPr>
-              <w:t xml:space="preserve">Does this feel like one team who we can work with under pressure?</w:t>
+              <w:t>Does this feel like one team who we can work with under pressure?</w:t>
             </w:r>
           </w:p>
           <w:p>
@@ -3328,7 +3462,7 @@
                     </pic:cNvPicPr>
                   </pic:nvPicPr>
                   <pic:blipFill>
-                    <a:blip r:embed="rId28"/>
+                    <a:blip r:embed="rId31"/>
                     <a:srcRect/>
                     <a:stretch>
                       <a:fillRect/>
@@ -3383,7 +3517,7 @@
         </w:rPr>
         <w:lastRenderedPageBreak/>
         <w:drawing>
-          <wp:anchor distT="0" distB="0" distL="0" distR="0" simplePos="0" relativeHeight="251658250" behindDoc="1" locked="0" layoutInCell="1" allowOverlap="1" wp14:anchorId="49A174D1" wp14:editId="49A174D2">
+          <wp:anchor distT="0" distB="0" distL="0" distR="0" simplePos="0" relativeHeight="251658752" behindDoc="1" locked="0" layoutInCell="1" allowOverlap="1" wp14:anchorId="49A174D1" wp14:editId="49A174D2">
             <wp:simplePos x="0" y="0"/>
             <wp:positionH relativeFrom="page">
               <wp:posOffset>0</wp:posOffset>
@@ -3408,7 +3542,7 @@
                     </pic:cNvPicPr>
                   </pic:nvPicPr>
                   <pic:blipFill>
-                    <a:blip r:embed="rId29"/>
+                    <a:blip r:embed="rId32"/>
                     <a:srcRect/>
                     <a:stretch>
                       <a:fillRect/>
@@ -3428,8 +3562,13 @@
             </a:graphic>
           </wp:anchor>
         </w:drawing>
+      </w:r>
+      <w:r>
+        <w:rPr>
+          <w:noProof/>
+        </w:rPr>
         <w:drawing>
-          <wp:anchor distT="0" distB="0" distL="0" distR="0" simplePos="0" relativeHeight="251658244" behindDoc="0" locked="0" layoutInCell="1" allowOverlap="1" wp14:anchorId="49A174D3" wp14:editId="49A174D4">
+          <wp:anchor distT="0" distB="0" distL="0" distR="0" simplePos="0" relativeHeight="251651584" behindDoc="0" locked="0" layoutInCell="1" allowOverlap="1" wp14:anchorId="49A174D3" wp14:editId="49A174D4">
             <wp:simplePos x="0" y="0"/>
             <wp:positionH relativeFrom="page">
               <wp:posOffset>0</wp:posOffset>
@@ -3454,7 +3593,7 @@
                     </pic:cNvPicPr>
                   </pic:nvPicPr>
                   <pic:blipFill>
-                    <a:blip r:embed="rId30"/>
+                    <a:blip r:embed="rId33"/>
                     <a:srcRect/>
                     <a:stretch>
                       <a:fillRect/>
@@ -3511,7 +3650,7 @@
         <w:spacing w:after="260" w:line="300" w:lineRule="auto"/>
       </w:pPr>
       <w:r>
-        <w:t xml:space="preserve">Our human centred approach turns what we learn into decisions, behaviours and moments the client can see for themselves.</w:t>
+        <w:t>Our human centred approach turns what we learn into decisions, behaviours and moments the client can see for themselves.</w:t>
       </w:r>
     </w:p>
     <w:tbl>
@@ -3988,8 +4127,8 @@
     <w:p>
       <w:pPr>
         <w:sectPr>
-          <w:headerReference w:type="default" r:id="rId31"/>
-          <w:footerReference w:type="default" r:id="rId32"/>
+          <w:headerReference w:type="default" r:id="rId34"/>
+          <w:footerReference w:type="default" r:id="rId35"/>
           <w:pgSz w:w="11906" w:h="16838"/>
           <w:pgMar w:top="1000" w:right="1134" w:bottom="1000" w:left="1418" w:header="500" w:footer="500" w:gutter="0"/>
           <w:cols w:space="720"/>
@@ -4007,7 +4146,7 @@
         </w:rPr>
         <w:lastRenderedPageBreak/>
         <w:drawing>
-          <wp:anchor distT="0" distB="0" distL="0" distR="0" simplePos="0" relativeHeight="251658253" behindDoc="1" locked="0" layoutInCell="1" allowOverlap="1" wp14:anchorId="49A174D5" wp14:editId="49A174D6">
+          <wp:anchor distT="0" distB="0" distL="0" distR="0" simplePos="0" relativeHeight="251662848" behindDoc="1" locked="0" layoutInCell="1" allowOverlap="1" wp14:anchorId="49A174D5" wp14:editId="49A174D6">
             <wp:simplePos x="0" y="0"/>
             <wp:positionH relativeFrom="page">
               <wp:posOffset>0</wp:posOffset>
@@ -4032,7 +4171,7 @@
                     </pic:cNvPicPr>
                   </pic:nvPicPr>
                   <pic:blipFill>
-                    <a:blip r:embed="rId33"/>
+                    <a:blip r:embed="rId36"/>
                     <a:srcRect/>
                     <a:stretch>
                       <a:fillRect/>
@@ -4134,7 +4273,7 @@
           <w:noProof/>
         </w:rPr>
         <w:drawing>
-          <wp:anchor distT="0" distB="0" distL="114300" distR="114300" simplePos="0" relativeHeight="251659278" behindDoc="0" locked="0" layoutInCell="1" allowOverlap="1" wp14:anchorId="0F490398" wp14:editId="66F7616D">
+          <wp:anchor distT="0" distB="0" distL="114300" distR="114300" simplePos="0" relativeHeight="251664896" behindDoc="0" locked="0" layoutInCell="1" allowOverlap="1" wp14:anchorId="0F490398" wp14:editId="66F7616D">
             <wp:simplePos x="0" y="0"/>
             <wp:positionH relativeFrom="column">
               <wp:posOffset>0</wp:posOffset>
@@ -4157,7 +4296,7 @@
                     <pic:cNvPicPr/>
                   </pic:nvPicPr>
                   <pic:blipFill>
-                    <a:blip r:embed="rId34" cstate="print">
+                    <a:blip r:embed="rId37" cstate="print">
                       <a:extLst>
                         <a:ext uri="{28A0092B-C50C-407E-A947-70E740481C1C}">
                           <a14:useLocalDpi xmlns:a14="http://schemas.microsoft.com/office/drawing/2010/main" val="0"/>
@@ -4229,7 +4368,7 @@
           <w:noProof/>
         </w:rPr>
         <w:drawing>
-          <wp:anchor distT="0" distB="0" distL="114300" distR="114300" simplePos="0" relativeHeight="251660302" behindDoc="0" locked="0" layoutInCell="1" allowOverlap="1" wp14:anchorId="6129BA64" wp14:editId="1673790B">
+          <wp:anchor distT="0" distB="0" distL="114300" distR="114300" simplePos="0" relativeHeight="251665920" behindDoc="0" locked="0" layoutInCell="1" allowOverlap="1" wp14:anchorId="6129BA64" wp14:editId="1673790B">
             <wp:simplePos x="0" y="0"/>
             <wp:positionH relativeFrom="column">
               <wp:posOffset>0</wp:posOffset>
@@ -4252,7 +4391,7 @@
                     <pic:cNvPicPr/>
                   </pic:nvPicPr>
                   <pic:blipFill>
-                    <a:blip r:embed="rId35" cstate="print">
+                    <a:blip r:embed="rId38" cstate="print">
                       <a:extLst>
                         <a:ext uri="{28A0092B-C50C-407E-A947-70E740481C1C}">
                           <a14:useLocalDpi xmlns:a14="http://schemas.microsoft.com/office/drawing/2010/main" val="0"/>
@@ -4324,7 +4463,7 @@
           <w:noProof/>
         </w:rPr>
         <w:drawing>
-          <wp:anchor distT="0" distB="0" distL="114300" distR="114300" simplePos="0" relativeHeight="251661326" behindDoc="0" locked="0" layoutInCell="1" allowOverlap="1" wp14:anchorId="79500E82" wp14:editId="5EC714BD">
+          <wp:anchor distT="0" distB="0" distL="114300" distR="114300" simplePos="0" relativeHeight="251666944" behindDoc="0" locked="0" layoutInCell="1" allowOverlap="1" wp14:anchorId="79500E82" wp14:editId="5EC714BD">
             <wp:simplePos x="0" y="0"/>
             <wp:positionH relativeFrom="column">
               <wp:posOffset>0</wp:posOffset>
@@ -4347,7 +4486,7 @@
                     <pic:cNvPicPr/>
                   </pic:nvPicPr>
                   <pic:blipFill>
-                    <a:blip r:embed="rId36" cstate="print">
+                    <a:blip r:embed="rId39" cstate="print">
                       <a:extLst>
                         <a:ext uri="{28A0092B-C50C-407E-A947-70E740481C1C}">
                           <a14:useLocalDpi xmlns:a14="http://schemas.microsoft.com/office/drawing/2010/main" val="0"/>
@@ -4419,7 +4558,7 @@
           <w:noProof/>
         </w:rPr>
         <w:drawing>
-          <wp:anchor distT="0" distB="0" distL="114300" distR="114300" simplePos="0" relativeHeight="251662350" behindDoc="0" locked="0" layoutInCell="1" allowOverlap="1" wp14:anchorId="117D1BD1" wp14:editId="0DC1CC4B">
+          <wp:anchor distT="0" distB="0" distL="114300" distR="114300" simplePos="0" relativeHeight="251667968" behindDoc="0" locked="0" layoutInCell="1" allowOverlap="1" wp14:anchorId="117D1BD1" wp14:editId="0DC1CC4B">
             <wp:simplePos x="0" y="0"/>
             <wp:positionH relativeFrom="column">
               <wp:posOffset>-45720</wp:posOffset>
@@ -4442,7 +4581,7 @@
                     <pic:cNvPicPr/>
                   </pic:nvPicPr>
                   <pic:blipFill>
-                    <a:blip r:embed="rId37" cstate="print">
+                    <a:blip r:embed="rId40" cstate="print">
                       <a:extLst>
                         <a:ext uri="{28A0092B-C50C-407E-A947-70E740481C1C}">
                           <a14:useLocalDpi xmlns:a14="http://schemas.microsoft.com/office/drawing/2010/main" val="0"/>
@@ -4484,8 +4623,8 @@
     <w:p>
       <w:pPr>
         <w:sectPr>
-          <w:headerReference w:type="default" r:id="rId38"/>
-          <w:footerReference w:type="default" r:id="rId39"/>
+          <w:headerReference w:type="default" r:id="rId41"/>
+          <w:footerReference w:type="default" r:id="rId42"/>
           <w:pgSz w:w="11906" w:h="16838"/>
           <w:pgMar w:top="1000" w:right="1134" w:bottom="1000" w:left="1418" w:header="500" w:footer="500" w:gutter="0"/>
           <w:cols w:space="720"/>
@@ -4504,7 +4643,7 @@
         </w:rPr>
         <w:lastRenderedPageBreak/>
         <w:drawing>
-          <wp:anchor distT="0" distB="0" distL="0" distR="0" simplePos="0" relativeHeight="251658246" behindDoc="0" locked="0" layoutInCell="1" allowOverlap="1" wp14:anchorId="49A174D7" wp14:editId="49A174D8">
+          <wp:anchor distT="0" distB="0" distL="0" distR="0" simplePos="0" relativeHeight="251653632" behindDoc="0" locked="0" layoutInCell="1" allowOverlap="1" wp14:anchorId="49A174D7" wp14:editId="49A174D8">
             <wp:simplePos x="0" y="0"/>
             <wp:positionH relativeFrom="page">
               <wp:posOffset>0</wp:posOffset>
@@ -4529,7 +4668,7 @@
                     </pic:cNvPicPr>
                   </pic:nvPicPr>
                   <pic:blipFill>
-                    <a:blip r:embed="rId40"/>
+                    <a:blip r:embed="rId43"/>
                     <a:srcRect/>
                     <a:stretch>
                       <a:fillRect/>
@@ -4582,7 +4721,7 @@
           <w:sz w:val="44"/>
           <w:szCs w:val="44"/>
         </w:rPr>
-        <w:t xml:space="preserve">Our work with CPB Contractors and UGL</w:t>
+        <w:t>Our work with CPB Contractors and UGL</w:t>
       </w:r>
     </w:p>
     <w:p>
@@ -4590,7 +4729,7 @@
         <w:spacing w:after="280" w:line="300" w:lineRule="auto"/>
       </w:pPr>
       <w:r>
-        <w:t xml:space="preserve">We have partnered with CPB Contractors and UGL across rail, tunnelling, transmission and renewable energy pursuits. Each engagement has built on the last, deepening our understanding of how your teams work and what your clients expect.</w:t>
+        <w:t>We have partnered with CPB Contractors and UGL across rail, tunnelling, transmission and renewable energy pursuits. Each engagement has built on the last, deepening our understanding of how your teams work and what your clients expect.</w:t>
       </w:r>
     </w:p>
     <w:tbl>
@@ -4617,9 +4756,7 @@
             <w:tcW w:w="3500" w:type="dxa"/>
             <w:tcBorders>
               <w:top w:val="single" w:sz="24" w:space="0" w:color="F48047"/>
-              <w:left w:val="none" w:sz="0" w:space="0" w:color="auto"/>
               <w:bottom w:val="single" w:sz="18" w:space="0" w:color="FBF8F2"/>
-              <w:right w:val="none" w:sz="0" w:space="0" w:color="auto"/>
             </w:tcBorders>
             <w:shd w:val="clear" w:color="auto" w:fill="EFECE7"/>
             <w:tcMar>
@@ -4632,16 +4769,14 @@
           </w:tcPr>
           <w:p>
             <w:pPr>
-              <w:spacing w:after="0" w:line="264" w:lineRule="auto"/>
+              <w:spacing w:line="264" w:lineRule="auto"/>
             </w:pPr>
             <w:r>
               <w:rPr>
                 <w:rFonts w:ascii="Poppins Medium" w:eastAsia="Poppins Medium" w:hAnsi="Poppins Medium" w:cs="Poppins Medium"/>
                 <w:color w:val="F48047"/>
-                <w:sz w:val="20"/>
-                <w:szCs w:val="20"/>
-              </w:rPr>
-              <w:t xml:space="preserve">Engagement</w:t>
+              </w:rPr>
+              <w:t>Engagement</w:t>
             </w:r>
           </w:p>
         </w:tc>
@@ -4650,9 +4785,7 @@
             <w:tcW w:w="5854" w:type="dxa"/>
             <w:tcBorders>
               <w:top w:val="single" w:sz="24" w:space="0" w:color="F48047"/>
-              <w:left w:val="none" w:sz="0" w:space="0" w:color="auto"/>
               <w:bottom w:val="single" w:sz="18" w:space="0" w:color="FBF8F2"/>
-              <w:right w:val="none" w:sz="0" w:space="0" w:color="auto"/>
             </w:tcBorders>
             <w:shd w:val="clear" w:color="auto" w:fill="EFECE7"/>
             <w:tcMar>
@@ -4665,16 +4798,14 @@
           </w:tcPr>
           <w:p>
             <w:pPr>
-              <w:spacing w:after="0" w:line="264" w:lineRule="auto"/>
+              <w:spacing w:line="264" w:lineRule="auto"/>
             </w:pPr>
             <w:r>
               <w:rPr>
                 <w:rFonts w:ascii="Poppins Medium" w:eastAsia="Poppins Medium" w:hAnsi="Poppins Medium" w:cs="Poppins Medium"/>
                 <w:color w:val="F48047"/>
-                <w:sz w:val="20"/>
-                <w:szCs w:val="20"/>
-              </w:rPr>
-              <w:t xml:space="preserve">Our role and outcome</w:t>
+              </w:rPr>
+              <w:t>Our role and outcome</w:t>
             </w:r>
           </w:p>
         </w:tc>
@@ -4687,10 +4818,7 @@
           <w:tcPr>
             <w:tcW w:w="3500" w:type="dxa"/>
             <w:tcBorders>
-              <w:top w:val="none" w:sz="0" w:space="0" w:color="auto"/>
-              <w:left w:val="none" w:sz="0" w:space="0" w:color="auto"/>
               <w:bottom w:val="single" w:sz="18" w:space="0" w:color="FBF8F2"/>
-              <w:right w:val="none" w:sz="0" w:space="0" w:color="auto"/>
             </w:tcBorders>
             <w:shd w:val="clear" w:color="auto" w:fill="F3F0EA"/>
             <w:tcMar>
@@ -4712,12 +4840,32 @@
                 <w:sz w:val="19"/>
                 <w:szCs w:val="19"/>
               </w:rPr>
-              <w:t xml:space="preserve">Eastern Tunnelling Package</w:t>
-            </w:r>
-          </w:p>
-          <w:p>
-            <w:pPr>
-              <w:spacing w:after="0" w:line="264" w:lineRule="auto"/>
+              <w:t xml:space="preserve">Sydney Metro West </w:t>
+            </w:r>
+            <w:proofErr w:type="spellStart"/>
+            <w:r>
+              <w:rPr>
+                <w:rFonts w:ascii="Poppins Medium" w:eastAsia="Poppins Medium" w:hAnsi="Poppins Medium" w:cs="Poppins Medium"/>
+                <w:color w:val="3D3C3C"/>
+                <w:sz w:val="19"/>
+                <w:szCs w:val="19"/>
+              </w:rPr>
+              <w:t>Linewide</w:t>
+            </w:r>
+            <w:proofErr w:type="spellEnd"/>
+            <w:r>
+              <w:rPr>
+                <w:rFonts w:ascii="Poppins Medium" w:eastAsia="Poppins Medium" w:hAnsi="Poppins Medium" w:cs="Poppins Medium"/>
+                <w:color w:val="3D3C3C"/>
+                <w:sz w:val="19"/>
+                <w:szCs w:val="19"/>
+              </w:rPr>
+              <w:t xml:space="preserve"> 2</w:t>
+            </w:r>
+          </w:p>
+          <w:p>
+            <w:pPr>
+              <w:spacing w:line="264" w:lineRule="auto"/>
             </w:pPr>
             <w:r>
               <w:rPr>
@@ -4725,7 +4873,25 @@
                 <w:sz w:val="15"/>
                 <w:szCs w:val="15"/>
               </w:rPr>
-              <w:t xml:space="preserve">John Holland, CPB Contractors and Ghella JV  |  Sydney Metro West</w:t>
+              <w:t xml:space="preserve">CPB Contractors and UGL </w:t>
+            </w:r>
+            <w:proofErr w:type="gramStart"/>
+            <w:r>
+              <w:rPr>
+                <w:color w:val="616173"/>
+                <w:sz w:val="15"/>
+                <w:szCs w:val="15"/>
+              </w:rPr>
+              <w:t>JV  |</w:t>
+            </w:r>
+            <w:proofErr w:type="gramEnd"/>
+            <w:r>
+              <w:rPr>
+                <w:color w:val="616173"/>
+                <w:sz w:val="15"/>
+                <w:szCs w:val="15"/>
+              </w:rPr>
+              <w:t xml:space="preserve">  Sydney Metro</w:t>
             </w:r>
           </w:p>
         </w:tc>
@@ -4733,10 +4899,7 @@
           <w:tcPr>
             <w:tcW w:w="5854" w:type="dxa"/>
             <w:tcBorders>
-              <w:top w:val="none" w:sz="0" w:space="0" w:color="auto"/>
-              <w:left w:val="none" w:sz="0" w:space="0" w:color="auto"/>
               <w:bottom w:val="single" w:sz="18" w:space="0" w:color="FBF8F2"/>
-              <w:right w:val="none" w:sz="0" w:space="0" w:color="auto"/>
             </w:tcBorders>
             <w:shd w:val="clear" w:color="auto" w:fill="F3F0EA"/>
             <w:tcMar>
@@ -4749,14 +4912,14 @@
           </w:tcPr>
           <w:p>
             <w:pPr>
-              <w:spacing w:after="0" w:line="264" w:lineRule="auto"/>
+              <w:spacing w:line="264" w:lineRule="auto"/>
             </w:pPr>
             <w:r>
               <w:rPr>
                 <w:sz w:val="17"/>
                 <w:szCs w:val="17"/>
               </w:rPr>
-              <w:t xml:space="preserve">Embedded support for more than five years, from tender strategy and client interactives through award and into delivery. The JV won the $1.6bn contract.</w:t>
+              <w:t>Strategy workshop, unique selling proposition, customer-centric training and coaching, and preparation and debriefs for every client interactive.</w:t>
             </w:r>
           </w:p>
         </w:tc>
@@ -4769,10 +4932,7 @@
           <w:tcPr>
             <w:tcW w:w="3500" w:type="dxa"/>
             <w:tcBorders>
-              <w:top w:val="none" w:sz="0" w:space="0" w:color="auto"/>
-              <w:left w:val="none" w:sz="0" w:space="0" w:color="auto"/>
               <w:bottom w:val="single" w:sz="18" w:space="0" w:color="FBF8F2"/>
-              <w:right w:val="none" w:sz="0" w:space="0" w:color="auto"/>
             </w:tcBorders>
             <w:shd w:val="clear" w:color="auto" w:fill="F3F0EA"/>
             <w:tcMar>
@@ -4794,12 +4954,12 @@
                 <w:sz w:val="19"/>
                 <w:szCs w:val="19"/>
               </w:rPr>
-              <w:t xml:space="preserve">Sydney Metro West Linewide 2</w:t>
-            </w:r>
-          </w:p>
-          <w:p>
-            <w:pPr>
-              <w:spacing w:after="0" w:line="264" w:lineRule="auto"/>
+              <w:t>Hunter Transmission Project</w:t>
+            </w:r>
+          </w:p>
+          <w:p>
+            <w:pPr>
+              <w:spacing w:line="264" w:lineRule="auto"/>
             </w:pPr>
             <w:r>
               <w:rPr>
@@ -4807,18 +4967,43 @@
                 <w:sz w:val="15"/>
                 <w:szCs w:val="15"/>
               </w:rPr>
-              <w:t xml:space="preserve">CPB Contractors and UGL JV  |  Sydney Metro</w:t>
-            </w:r>
+              <w:t xml:space="preserve">CPB Contractors and UGL </w:t>
+            </w:r>
+            <w:proofErr w:type="gramStart"/>
+            <w:r>
+              <w:rPr>
+                <w:color w:val="616173"/>
+                <w:sz w:val="15"/>
+                <w:szCs w:val="15"/>
+              </w:rPr>
+              <w:t>JV  |</w:t>
+            </w:r>
+            <w:proofErr w:type="gramEnd"/>
+            <w:r>
+              <w:rPr>
+                <w:color w:val="616173"/>
+                <w:sz w:val="15"/>
+                <w:szCs w:val="15"/>
+              </w:rPr>
+              <w:t xml:space="preserve">  </w:t>
+            </w:r>
+            <w:proofErr w:type="spellStart"/>
+            <w:r>
+              <w:rPr>
+                <w:color w:val="616173"/>
+                <w:sz w:val="15"/>
+                <w:szCs w:val="15"/>
+              </w:rPr>
+              <w:t>Transgrid</w:t>
+            </w:r>
+            <w:proofErr w:type="spellEnd"/>
           </w:p>
         </w:tc>
         <w:tc>
           <w:tcPr>
             <w:tcW w:w="5854" w:type="dxa"/>
             <w:tcBorders>
-              <w:top w:val="none" w:sz="0" w:space="0" w:color="auto"/>
-              <w:left w:val="none" w:sz="0" w:space="0" w:color="auto"/>
               <w:bottom w:val="single" w:sz="18" w:space="0" w:color="FBF8F2"/>
-              <w:right w:val="none" w:sz="0" w:space="0" w:color="auto"/>
             </w:tcBorders>
             <w:shd w:val="clear" w:color="auto" w:fill="F3F0EA"/>
             <w:tcMar>
@@ -4831,14 +5016,14 @@
           </w:tcPr>
           <w:p>
             <w:pPr>
-              <w:spacing w:after="0" w:line="264" w:lineRule="auto"/>
+              <w:spacing w:line="264" w:lineRule="auto"/>
             </w:pPr>
             <w:r>
               <w:rPr>
                 <w:sz w:val="17"/>
                 <w:szCs w:val="17"/>
               </w:rPr>
-              <w:t xml:space="preserve">Strategy workshop, unique selling proposition, customer-centric training and coaching, and preparation and debriefs for every client interactive.</w:t>
+              <w:t>Engagement strategy, rehearsal and debriefs across five client interactives. The JV progressed from a field of four to the final two.</w:t>
             </w:r>
           </w:p>
         </w:tc>
@@ -4851,10 +5036,7 @@
           <w:tcPr>
             <w:tcW w:w="3500" w:type="dxa"/>
             <w:tcBorders>
-              <w:top w:val="none" w:sz="0" w:space="0" w:color="auto"/>
-              <w:left w:val="none" w:sz="0" w:space="0" w:color="auto"/>
               <w:bottom w:val="single" w:sz="18" w:space="0" w:color="FBF8F2"/>
-              <w:right w:val="none" w:sz="0" w:space="0" w:color="auto"/>
             </w:tcBorders>
             <w:shd w:val="clear" w:color="auto" w:fill="F3F0EA"/>
             <w:tcMar>
@@ -4876,12 +5058,18 @@
                 <w:sz w:val="19"/>
                 <w:szCs w:val="19"/>
               </w:rPr>
-              <w:t xml:space="preserve">Hunter Transmission Project</w:t>
-            </w:r>
-          </w:p>
-          <w:p>
-            <w:pPr>
-              <w:spacing w:after="0" w:line="264" w:lineRule="auto"/>
+              <w:t>Eastern Tunnelling Package</w:t>
+            </w:r>
+          </w:p>
+          <w:p>
+            <w:pPr>
+              <w:spacing w:after="30" w:line="264" w:lineRule="auto"/>
+              <w:rPr>
+                <w:rFonts w:ascii="Poppins Medium" w:eastAsia="Poppins Medium" w:hAnsi="Poppins Medium" w:cs="Poppins Medium"/>
+                <w:color w:val="3D3C3C"/>
+                <w:sz w:val="19"/>
+                <w:szCs w:val="19"/>
+              </w:rPr>
             </w:pPr>
             <w:r>
               <w:rPr>
@@ -4889,7 +5077,43 @@
                 <w:sz w:val="15"/>
                 <w:szCs w:val="15"/>
               </w:rPr>
-              <w:t xml:space="preserve">CPB Contractors and UGL JV  |  Transgrid</w:t>
+              <w:t xml:space="preserve">John Holland, CPB Contractors and </w:t>
+            </w:r>
+            <w:proofErr w:type="spellStart"/>
+            <w:r>
+              <w:rPr>
+                <w:color w:val="616173"/>
+                <w:sz w:val="15"/>
+                <w:szCs w:val="15"/>
+              </w:rPr>
+              <w:t>Ghella</w:t>
+            </w:r>
+            <w:proofErr w:type="spellEnd"/>
+            <w:r>
+              <w:rPr>
+                <w:color w:val="616173"/>
+                <w:sz w:val="15"/>
+                <w:szCs w:val="15"/>
+              </w:rPr>
+              <w:t xml:space="preserve"> </w:t>
+            </w:r>
+            <w:proofErr w:type="gramStart"/>
+            <w:r>
+              <w:rPr>
+                <w:color w:val="616173"/>
+                <w:sz w:val="15"/>
+                <w:szCs w:val="15"/>
+              </w:rPr>
+              <w:t>JV  |</w:t>
+            </w:r>
+            <w:proofErr w:type="gramEnd"/>
+            <w:r>
+              <w:rPr>
+                <w:color w:val="616173"/>
+                <w:sz w:val="15"/>
+                <w:szCs w:val="15"/>
+              </w:rPr>
+              <w:t xml:space="preserve">  Sydney Metro West</w:t>
             </w:r>
           </w:p>
         </w:tc>
@@ -4897,10 +5121,7 @@
           <w:tcPr>
             <w:tcW w:w="5854" w:type="dxa"/>
             <w:tcBorders>
-              <w:top w:val="none" w:sz="0" w:space="0" w:color="auto"/>
-              <w:left w:val="none" w:sz="0" w:space="0" w:color="auto"/>
               <w:bottom w:val="single" w:sz="18" w:space="0" w:color="FBF8F2"/>
-              <w:right w:val="none" w:sz="0" w:space="0" w:color="auto"/>
             </w:tcBorders>
             <w:shd w:val="clear" w:color="auto" w:fill="F3F0EA"/>
             <w:tcMar>
@@ -4913,14 +5134,18 @@
           </w:tcPr>
           <w:p>
             <w:pPr>
-              <w:spacing w:after="0" w:line="264" w:lineRule="auto"/>
-            </w:pPr>
-            <w:r>
+              <w:spacing w:line="264" w:lineRule="auto"/>
               <w:rPr>
                 <w:sz w:val="17"/>
                 <w:szCs w:val="17"/>
               </w:rPr>
-              <w:t xml:space="preserve">Engagement strategy, rehearsal and debriefs across five client interactives. The JV progressed from a field of four to the final two.</w:t>
+            </w:pPr>
+            <w:r>
+              <w:rPr>
+                <w:sz w:val="17"/>
+                <w:szCs w:val="17"/>
+              </w:rPr>
+              <w:t>Embedded support for more than five years, from tender strategy and client interactives through award and into delivery. The JV won the $1.6bn contract.</w:t>
             </w:r>
           </w:p>
         </w:tc>
@@ -4933,10 +5158,7 @@
           <w:tcPr>
             <w:tcW w:w="3500" w:type="dxa"/>
             <w:tcBorders>
-              <w:top w:val="none" w:sz="0" w:space="0" w:color="auto"/>
-              <w:left w:val="none" w:sz="0" w:space="0" w:color="auto"/>
               <w:bottom w:val="single" w:sz="18" w:space="0" w:color="FBF8F2"/>
-              <w:right w:val="none" w:sz="0" w:space="0" w:color="auto"/>
             </w:tcBorders>
             <w:shd w:val="clear" w:color="auto" w:fill="F3F0EA"/>
             <w:tcMar>
@@ -4958,12 +5180,12 @@
                 <w:sz w:val="19"/>
                 <w:szCs w:val="19"/>
               </w:rPr>
-              <w:t xml:space="preserve">New England REZ</w:t>
-            </w:r>
-          </w:p>
-          <w:p>
-            <w:pPr>
-              <w:spacing w:after="0" w:line="264" w:lineRule="auto"/>
+              <w:t>New England REZ</w:t>
+            </w:r>
+          </w:p>
+          <w:p>
+            <w:pPr>
+              <w:spacing w:line="264" w:lineRule="auto"/>
             </w:pPr>
             <w:r>
               <w:rPr>
@@ -4971,7 +5193,7 @@
                 <w:sz w:val="15"/>
                 <w:szCs w:val="15"/>
               </w:rPr>
-              <w:t xml:space="preserve">CPB Contractors and UGL</w:t>
+              <w:t>CPB Contractors and UGL</w:t>
             </w:r>
           </w:p>
         </w:tc>
@@ -4979,10 +5201,7 @@
           <w:tcPr>
             <w:tcW w:w="5854" w:type="dxa"/>
             <w:tcBorders>
-              <w:top w:val="none" w:sz="0" w:space="0" w:color="auto"/>
-              <w:left w:val="none" w:sz="0" w:space="0" w:color="auto"/>
               <w:bottom w:val="single" w:sz="18" w:space="0" w:color="FBF8F2"/>
-              <w:right w:val="none" w:sz="0" w:space="0" w:color="auto"/>
             </w:tcBorders>
             <w:shd w:val="clear" w:color="auto" w:fill="F3F0EA"/>
             <w:tcMar>
@@ -4995,14 +5214,14 @@
           </w:tcPr>
           <w:p>
             <w:pPr>
-              <w:spacing w:after="0" w:line="264" w:lineRule="auto"/>
+              <w:spacing w:line="264" w:lineRule="auto"/>
             </w:pPr>
             <w:r>
               <w:rPr>
                 <w:sz w:val="17"/>
                 <w:szCs w:val="17"/>
               </w:rPr>
-              <w:t xml:space="preserve">Focused preparation, rehearsal and debrief for a critical client interactive.</w:t>
+              <w:t>Focused preparation, rehearsal and debrief for a critical client interactive.</w:t>
             </w:r>
           </w:p>
         </w:tc>
@@ -5015,10 +5234,7 @@
           <w:tcPr>
             <w:tcW w:w="3500" w:type="dxa"/>
             <w:tcBorders>
-              <w:top w:val="none" w:sz="0" w:space="0" w:color="auto"/>
-              <w:left w:val="none" w:sz="0" w:space="0" w:color="auto"/>
               <w:bottom w:val="single" w:sz="18" w:space="0" w:color="FBF8F2"/>
-              <w:right w:val="none" w:sz="0" w:space="0" w:color="auto"/>
             </w:tcBorders>
             <w:shd w:val="clear" w:color="auto" w:fill="F3F0EA"/>
             <w:tcMar>
@@ -5040,12 +5256,12 @@
                 <w:sz w:val="19"/>
                 <w:szCs w:val="19"/>
               </w:rPr>
-              <w:t xml:space="preserve">Customer-centric skills program</w:t>
-            </w:r>
-          </w:p>
-          <w:p>
-            <w:pPr>
-              <w:spacing w:after="0" w:line="264" w:lineRule="auto"/>
+              <w:t>Customer-centric skills program</w:t>
+            </w:r>
+          </w:p>
+          <w:p>
+            <w:pPr>
+              <w:spacing w:line="264" w:lineRule="auto"/>
             </w:pPr>
             <w:r>
               <w:rPr>
@@ -5053,7 +5269,7 @@
                 <w:sz w:val="15"/>
                 <w:szCs w:val="15"/>
               </w:rPr>
-              <w:t xml:space="preserve">CPB Contractors and UGL JV</w:t>
+              <w:t>CPB Contractors and UGL JV</w:t>
             </w:r>
           </w:p>
         </w:tc>
@@ -5061,10 +5277,7 @@
           <w:tcPr>
             <w:tcW w:w="5854" w:type="dxa"/>
             <w:tcBorders>
-              <w:top w:val="none" w:sz="0" w:space="0" w:color="auto"/>
-              <w:left w:val="none" w:sz="0" w:space="0" w:color="auto"/>
               <w:bottom w:val="single" w:sz="18" w:space="0" w:color="FBF8F2"/>
-              <w:right w:val="none" w:sz="0" w:space="0" w:color="auto"/>
             </w:tcBorders>
             <w:shd w:val="clear" w:color="auto" w:fill="F3F0EA"/>
             <w:tcMar>
@@ -5077,14 +5290,14 @@
           </w:tcPr>
           <w:p>
             <w:pPr>
-              <w:spacing w:after="0" w:line="264" w:lineRule="auto"/>
+              <w:spacing w:line="264" w:lineRule="auto"/>
             </w:pPr>
             <w:r>
               <w:rPr>
                 <w:sz w:val="17"/>
                 <w:szCs w:val="17"/>
               </w:rPr>
-              <w:t xml:space="preserve">Four practical workshops building the skills, behaviours and confidence to engage clients and win competitive bids.</w:t>
+              <w:t>Four practical workshops building the skills, behaviours and confidence to engage clients and win competitive bids.</w:t>
             </w:r>
           </w:p>
         </w:tc>
@@ -5097,10 +5310,7 @@
           <w:tcPr>
             <w:tcW w:w="3500" w:type="dxa"/>
             <w:tcBorders>
-              <w:top w:val="none" w:sz="0" w:space="0" w:color="auto"/>
-              <w:left w:val="none" w:sz="0" w:space="0" w:color="auto"/>
               <w:bottom w:val="single" w:sz="18" w:space="0" w:color="FBF8F2"/>
-              <w:right w:val="none" w:sz="0" w:space="0" w:color="auto"/>
             </w:tcBorders>
             <w:shd w:val="clear" w:color="auto" w:fill="F3F0EA"/>
             <w:tcMar>
@@ -5122,12 +5332,12 @@
                 <w:sz w:val="19"/>
                 <w:szCs w:val="19"/>
               </w:rPr>
-              <w:t xml:space="preserve">Parramatta Light Rail Stage 2</w:t>
-            </w:r>
-          </w:p>
-          <w:p>
-            <w:pPr>
-              <w:spacing w:after="0" w:line="264" w:lineRule="auto"/>
+              <w:t>Parramatta Light Rail Stage 2</w:t>
+            </w:r>
+          </w:p>
+          <w:p>
+            <w:pPr>
+              <w:spacing w:line="264" w:lineRule="auto"/>
             </w:pPr>
             <w:r>
               <w:rPr>
@@ -5135,7 +5345,7 @@
                 <w:sz w:val="15"/>
                 <w:szCs w:val="15"/>
               </w:rPr>
-              <w:t xml:space="preserve">CPB Contractors</w:t>
+              <w:t>CPB Contractors</w:t>
             </w:r>
           </w:p>
         </w:tc>
@@ -5143,10 +5353,7 @@
           <w:tcPr>
             <w:tcW w:w="5854" w:type="dxa"/>
             <w:tcBorders>
-              <w:top w:val="none" w:sz="0" w:space="0" w:color="auto"/>
-              <w:left w:val="none" w:sz="0" w:space="0" w:color="auto"/>
               <w:bottom w:val="single" w:sz="18" w:space="0" w:color="FBF8F2"/>
-              <w:right w:val="none" w:sz="0" w:space="0" w:color="auto"/>
             </w:tcBorders>
             <w:shd w:val="clear" w:color="auto" w:fill="F3F0EA"/>
             <w:tcMar>
@@ -5159,14 +5366,14 @@
           </w:tcPr>
           <w:p>
             <w:pPr>
-              <w:spacing w:after="0" w:line="264" w:lineRule="auto"/>
+              <w:spacing w:line="264" w:lineRule="auto"/>
             </w:pPr>
             <w:r>
               <w:rPr>
                 <w:sz w:val="17"/>
                 <w:szCs w:val="17"/>
               </w:rPr>
-              <w:t xml:space="preserve">Selected as the bid strategy partner. CPB was not shortlisted.</w:t>
+              <w:t>Selected as the bid strategy partner. CPB was not shortlisted.</w:t>
             </w:r>
           </w:p>
         </w:tc>
@@ -5179,10 +5386,7 @@
           <w:tcPr>
             <w:tcW w:w="3500" w:type="dxa"/>
             <w:tcBorders>
-              <w:top w:val="none" w:sz="0" w:space="0" w:color="auto"/>
-              <w:left w:val="none" w:sz="0" w:space="0" w:color="auto"/>
               <w:bottom w:val="single" w:sz="18" w:space="0" w:color="FBF8F2"/>
-              <w:right w:val="none" w:sz="0" w:space="0" w:color="auto"/>
             </w:tcBorders>
             <w:shd w:val="clear" w:color="auto" w:fill="F3F0EA"/>
             <w:tcMar>
@@ -5204,12 +5408,12 @@
                 <w:sz w:val="19"/>
                 <w:szCs w:val="19"/>
               </w:rPr>
-              <w:t xml:space="preserve">Submarine infrastructure program</w:t>
-            </w:r>
-          </w:p>
-          <w:p>
-            <w:pPr>
-              <w:spacing w:after="0" w:line="264" w:lineRule="auto"/>
+              <w:t>Submarine infrastructure program</w:t>
+            </w:r>
+          </w:p>
+          <w:p>
+            <w:pPr>
+              <w:spacing w:line="264" w:lineRule="auto"/>
             </w:pPr>
             <w:r>
               <w:rPr>
@@ -5217,7 +5421,7 @@
                 <w:sz w:val="15"/>
                 <w:szCs w:val="15"/>
               </w:rPr>
-              <w:t xml:space="preserve">Australian Naval Infrastructure</w:t>
+              <w:t>Australian Naval Infrastructure</w:t>
             </w:r>
           </w:p>
         </w:tc>
@@ -5225,10 +5429,7 @@
           <w:tcPr>
             <w:tcW w:w="5854" w:type="dxa"/>
             <w:tcBorders>
-              <w:top w:val="none" w:sz="0" w:space="0" w:color="auto"/>
-              <w:left w:val="none" w:sz="0" w:space="0" w:color="auto"/>
               <w:bottom w:val="single" w:sz="18" w:space="0" w:color="FBF8F2"/>
-              <w:right w:val="none" w:sz="0" w:space="0" w:color="auto"/>
             </w:tcBorders>
             <w:shd w:val="clear" w:color="auto" w:fill="F3F0EA"/>
             <w:tcMar>
@@ -5241,14 +5442,14 @@
           </w:tcPr>
           <w:p>
             <w:pPr>
-              <w:spacing w:after="0" w:line="264" w:lineRule="auto"/>
+              <w:spacing w:line="264" w:lineRule="auto"/>
             </w:pPr>
             <w:r>
               <w:rPr>
                 <w:sz w:val="17"/>
                 <w:szCs w:val="17"/>
               </w:rPr>
-              <w:t xml:space="preserve">Selected as the engagement partner. Package 3 has since been deferred.</w:t>
+              <w:t>Selected as the engagement partner. Package 3 has since been deferred.</w:t>
             </w:r>
           </w:p>
         </w:tc>
@@ -5261,10 +5462,7 @@
           <w:tcPr>
             <w:tcW w:w="3500" w:type="dxa"/>
             <w:tcBorders>
-              <w:top w:val="none" w:sz="0" w:space="0" w:color="auto"/>
-              <w:left w:val="none" w:sz="0" w:space="0" w:color="auto"/>
               <w:bottom w:val="single" w:sz="18" w:space="0" w:color="FBF8F2"/>
-              <w:right w:val="none" w:sz="0" w:space="0" w:color="auto"/>
             </w:tcBorders>
             <w:shd w:val="clear" w:color="auto" w:fill="F3F0EA"/>
             <w:tcMar>
@@ -5279,6 +5477,7 @@
             <w:pPr>
               <w:spacing w:after="30" w:line="264" w:lineRule="auto"/>
             </w:pPr>
+            <w:proofErr w:type="spellStart"/>
             <w:r>
               <w:rPr>
                 <w:rFonts w:ascii="Poppins Medium" w:eastAsia="Poppins Medium" w:hAnsi="Poppins Medium" w:cs="Poppins Medium"/>
@@ -5286,12 +5485,13 @@
                 <w:sz w:val="19"/>
                 <w:szCs w:val="19"/>
               </w:rPr>
-              <w:t xml:space="preserve">GoFar</w:t>
-            </w:r>
-          </w:p>
-          <w:p>
-            <w:pPr>
-              <w:spacing w:after="0" w:line="264" w:lineRule="auto"/>
+              <w:t>GoFar</w:t>
+            </w:r>
+            <w:proofErr w:type="spellEnd"/>
+          </w:p>
+          <w:p>
+            <w:pPr>
+              <w:spacing w:line="264" w:lineRule="auto"/>
             </w:pPr>
             <w:r>
               <w:rPr>
@@ -5299,7 +5499,25 @@
                 <w:sz w:val="15"/>
                 <w:szCs w:val="15"/>
               </w:rPr>
-              <w:t xml:space="preserve">CPB Contractors and UGL</w:t>
+              <w:t xml:space="preserve">CPB Contractors, Vinci Grand </w:t>
+            </w:r>
+            <w:proofErr w:type="spellStart"/>
+            <w:r>
+              <w:rPr>
+                <w:color w:val="616173"/>
+                <w:sz w:val="15"/>
+                <w:szCs w:val="15"/>
+              </w:rPr>
+              <w:t>Projets</w:t>
+            </w:r>
+            <w:proofErr w:type="spellEnd"/>
+            <w:r>
+              <w:rPr>
+                <w:color w:val="616173"/>
+                <w:sz w:val="15"/>
+                <w:szCs w:val="15"/>
+              </w:rPr>
+              <w:t xml:space="preserve"> and Ferrovial</w:t>
             </w:r>
           </w:p>
         </w:tc>
@@ -5307,10 +5525,7 @@
           <w:tcPr>
             <w:tcW w:w="5854" w:type="dxa"/>
             <w:tcBorders>
-              <w:top w:val="none" w:sz="0" w:space="0" w:color="auto"/>
-              <w:left w:val="none" w:sz="0" w:space="0" w:color="auto"/>
               <w:bottom w:val="single" w:sz="18" w:space="0" w:color="FBF8F2"/>
-              <w:right w:val="none" w:sz="0" w:space="0" w:color="auto"/>
             </w:tcBorders>
             <w:shd w:val="clear" w:color="auto" w:fill="F3F0EA"/>
             <w:tcMar>
@@ -5323,14 +5538,14 @@
           </w:tcPr>
           <w:p>
             <w:pPr>
-              <w:spacing w:after="0" w:line="264" w:lineRule="auto"/>
+              <w:spacing w:line="264" w:lineRule="auto"/>
             </w:pPr>
             <w:r>
               <w:rPr>
                 <w:sz w:val="17"/>
                 <w:szCs w:val="17"/>
               </w:rPr>
-              <w:t xml:space="preserve">Current engagement.</w:t>
+              <w:t>Current engagement.</w:t>
             </w:r>
           </w:p>
         </w:tc>
@@ -5350,7 +5565,7 @@
           <w:sz w:val="22"/>
           <w:szCs w:val="22"/>
         </w:rPr>
-        <w:t xml:space="preserve">The profiles that follow show how each engagement unfolded: the client challenge, our role and what changed as a result.</w:t>
+        <w:t>The profiles that follow show how each engagement unfolded: the client challenge, our role and what changed as a result.</w:t>
       </w:r>
     </w:p>
     <w:p>
@@ -5364,7 +5579,7 @@
         </w:rPr>
         <w:lastRenderedPageBreak/>
         <w:drawing>
-          <wp:anchor distT="0" distB="0" distL="0" distR="0" simplePos="0" relativeHeight="251658248" behindDoc="0" locked="0" layoutInCell="1" allowOverlap="1" wp14:anchorId="49A174DB" wp14:editId="49A174DC">
+          <wp:anchor distT="0" distB="0" distL="0" distR="0" simplePos="0" relativeHeight="251656704" behindDoc="0" locked="0" layoutInCell="1" allowOverlap="1" wp14:anchorId="49A174DB" wp14:editId="49A174DC">
             <wp:simplePos x="0" y="0"/>
             <wp:positionH relativeFrom="page">
               <wp:posOffset>0</wp:posOffset>
@@ -5375,7 +5590,7 @@
             <wp:extent cx="323850" cy="1809750"/>
             <wp:effectExtent l="0" t="0" r="0" b="0"/>
             <wp:wrapNone/>
-            <wp:docPr id="197828429" name="Picture 1205758676"/>
+            <wp:docPr id="1205758676" name="Picture 1205758676"/>
             <wp:cNvGraphicFramePr>
               <a:graphicFrameLocks xmlns:a="http://schemas.openxmlformats.org/drawingml/2006/main" noChangeAspect="1"/>
             </wp:cNvGraphicFramePr>
@@ -5389,7 +5604,7 @@
                     </pic:cNvPicPr>
                   </pic:nvPicPr>
                   <pic:blipFill>
-                    <a:blip r:embed="rId40"/>
+                    <a:blip r:embed="rId43"/>
                     <a:srcRect/>
                     <a:stretch>
                       <a:fillRect/>
@@ -5445,7 +5660,55 @@
           <w:sz w:val="16"/>
           <w:szCs w:val="16"/>
         </w:rPr>
-        <w:t>ECI and bid development  |  Evaluation interactions</w:t>
+        <w:t xml:space="preserve">Bid </w:t>
+      </w:r>
+      <w:proofErr w:type="gramStart"/>
+      <w:r>
+        <w:rPr>
+          <w:rFonts w:ascii="Poppins Medium" w:eastAsia="Poppins Medium" w:hAnsi="Poppins Medium" w:cs="Poppins Medium"/>
+          <w:caps/>
+          <w:color w:val="616173"/>
+          <w:spacing w:val="20"/>
+          <w:sz w:val="16"/>
+          <w:szCs w:val="16"/>
+        </w:rPr>
+        <w:t>strategy  |</w:t>
+      </w:r>
+      <w:proofErr w:type="gramEnd"/>
+      <w:r>
+        <w:rPr>
+          <w:rFonts w:ascii="Poppins Medium" w:eastAsia="Poppins Medium" w:hAnsi="Poppins Medium" w:cs="Poppins Medium"/>
+          <w:caps/>
+          <w:color w:val="616173"/>
+          <w:spacing w:val="20"/>
+          <w:sz w:val="16"/>
+          <w:szCs w:val="16"/>
+        </w:rPr>
+        <w:t xml:space="preserve">  Team </w:t>
+      </w:r>
+      <w:proofErr w:type="gramStart"/>
+      <w:r>
+        <w:rPr>
+          <w:rFonts w:ascii="Poppins Medium" w:eastAsia="Poppins Medium" w:hAnsi="Poppins Medium" w:cs="Poppins Medium"/>
+          <w:caps/>
+          <w:color w:val="616173"/>
+          <w:spacing w:val="20"/>
+          <w:sz w:val="16"/>
+          <w:szCs w:val="16"/>
+        </w:rPr>
+        <w:t>alignment  |</w:t>
+      </w:r>
+      <w:proofErr w:type="gramEnd"/>
+      <w:r>
+        <w:rPr>
+          <w:rFonts w:ascii="Poppins Medium" w:eastAsia="Poppins Medium" w:hAnsi="Poppins Medium" w:cs="Poppins Medium"/>
+          <w:caps/>
+          <w:color w:val="616173"/>
+          <w:spacing w:val="20"/>
+          <w:sz w:val="16"/>
+          <w:szCs w:val="16"/>
+        </w:rPr>
+        <w:t xml:space="preserve">  Interactive preparation</w:t>
       </w:r>
     </w:p>
     <w:p>
@@ -5455,10 +5718,10 @@
       <w:r>
         <w:rPr>
           <w:rFonts w:ascii="Poppins Medium" w:eastAsia="Poppins Medium" w:hAnsi="Poppins Medium" w:cs="Poppins Medium"/>
-          <w:sz w:val="34"/>
-          <w:szCs w:val="34"/>
-        </w:rPr>
-        <w:t xml:space="preserve">Embedding customer centricity to win the Eastern Tunnelling Package</w:t>
+          <w:sz w:val="40"/>
+          <w:szCs w:val="40"/>
+        </w:rPr>
+        <w:t>Transforming how a JV engages with its client</w:t>
       </w:r>
     </w:p>
     <w:p>
@@ -5471,23 +5734,40 @@
           <w:sz w:val="18"/>
           <w:szCs w:val="18"/>
         </w:rPr>
-        <w:t xml:space="preserve">John Holland, CPB Contractors and Ghella JV   |   Sydney Metro West, Eastern Tunnelling Package</w:t>
+        <w:t xml:space="preserve">CPB Contractors and UGL JV   |   Sydney Metro West </w:t>
+      </w:r>
+      <w:proofErr w:type="spellStart"/>
+      <w:r>
+        <w:rPr>
+          <w:color w:val="616173"/>
+          <w:sz w:val="18"/>
+          <w:szCs w:val="18"/>
+        </w:rPr>
+        <w:t>Linewide</w:t>
+      </w:r>
+      <w:proofErr w:type="spellEnd"/>
+      <w:r>
+        <w:rPr>
+          <w:color w:val="616173"/>
+          <w:sz w:val="18"/>
+          <w:szCs w:val="18"/>
+        </w:rPr>
+        <w:t xml:space="preserve"> 2</w:t>
       </w:r>
     </w:p>
     <w:p>
       <w:pPr>
         <w:spacing w:after="220" w:line="288" w:lineRule="auto"/>
-        <w:jc w:val="center"/>
       </w:pPr>
       <w:r>
         <w:rPr>
           <w:noProof/>
         </w:rPr>
         <w:drawing>
-          <wp:inline distT="0" distB="0" distL="0" distR="0" wp14:anchorId="49A174D9" wp14:editId="197AA5AD">
-            <wp:extent cx="5943600" cy="2000250"/>
+          <wp:inline distT="0" distB="0" distL="0" distR="0" wp14:anchorId="49A174DD" wp14:editId="0770C018">
+            <wp:extent cx="5943600" cy="2571750"/>
             <wp:effectExtent l="0" t="0" r="0" b="0"/>
-            <wp:docPr id="1470926768" name="Picture 1470926768"/>
+            <wp:docPr id="482757958" name="Picture 482757958"/>
             <wp:cNvGraphicFramePr>
               <a:graphicFrameLocks xmlns:a="http://schemas.openxmlformats.org/drawingml/2006/main" noChangeAspect="1"/>
             </wp:cNvGraphicFramePr>
@@ -5495,13 +5775,13 @@
               <a:graphicData uri="http://schemas.openxmlformats.org/drawingml/2006/picture">
                 <pic:pic xmlns:pic="http://schemas.openxmlformats.org/drawingml/2006/picture">
                   <pic:nvPicPr>
-                    <pic:cNvPr id="1470926768" name="Picture 1470926768"/>
+                    <pic:cNvPr id="482757958" name="Picture 482757958"/>
                     <pic:cNvPicPr>
                       <a:picLocks noChangeAspect="1" noChangeArrowheads="1"/>
                     </pic:cNvPicPr>
                   </pic:nvPicPr>
                   <pic:blipFill>
-                    <a:blip r:embed="rId41" cstate="print">
+                    <a:blip r:embed="rId45" cstate="print">
                       <a:extLst>
                         <a:ext uri="{28A0092B-C50C-407E-A947-70E740481C1C}">
                           <a14:useLocalDpi xmlns:a14="http://schemas.microsoft.com/office/drawing/2010/main" val="0"/>
@@ -5515,7 +5795,7 @@
                   <pic:spPr bwMode="auto">
                     <a:xfrm>
                       <a:off x="0" y="0"/>
-                      <a:ext cx="5943600" cy="2000250"/>
+                      <a:ext cx="5943600" cy="2571750"/>
                     </a:xfrm>
                     <a:prstGeom prst="rect">
                       <a:avLst/>
@@ -5585,8 +5865,19 @@
                 <w:sz w:val="22"/>
                 <w:szCs w:val="22"/>
               </w:rPr>
-              <w:t xml:space="preserve">The client challenge</w:t>
-            </w:r>
+              <w:t xml:space="preserve">The client </w:t>
+            </w:r>
+            <w:proofErr w:type="gramStart"/>
+            <w:r>
+              <w:rPr>
+                <w:rFonts w:ascii="Poppins Medium" w:eastAsia="Poppins Medium" w:hAnsi="Poppins Medium" w:cs="Poppins Medium"/>
+                <w:color w:val="F48047"/>
+                <w:sz w:val="22"/>
+                <w:szCs w:val="22"/>
+              </w:rPr>
+              <w:t>challenge</w:t>
+            </w:r>
+            <w:proofErr w:type="gramEnd"/>
           </w:p>
           <w:p>
             <w:pPr>
@@ -5597,7 +5888,7 @@
                 <w:sz w:val="17"/>
                 <w:szCs w:val="17"/>
               </w:rPr>
-              <w:t xml:space="preserve">After missing out on a recent Sydney Metro tender, the three JV partners wanted to change how they bid. They needed a more client and user centric approach to compete for the Eastern Tunnelling Package.</w:t>
+              <w:t>Sydney Metro had raised its expectations of delivery contractors, asking for open collaboration within an increasingly rigid, risk-averse contractual environment. The JV knew a strong technical submission would not be enough. It needed a fundamentally different way of engaging its client.</w:t>
             </w:r>
           </w:p>
         </w:tc>
@@ -5651,7 +5942,7 @@
                 <w:sz w:val="22"/>
                 <w:szCs w:val="22"/>
               </w:rPr>
-              <w:t xml:space="preserve">Our role</w:t>
+              <w:t>Our role</w:t>
             </w:r>
           </w:p>
           <w:p>
@@ -5663,7 +5954,7 @@
                 <w:sz w:val="17"/>
                 <w:szCs w:val="17"/>
               </w:rPr>
-              <w:t xml:space="preserve">We embedded five customer-centric principles in the tender team through outside-in strategy workshops with 25 JV members, design thinking, knowledge transfer sessions with the client and collaborative problem solving. We trained the team for client meetings, coached them through document review and built an interactive Miro board for client engagement.</w:t>
+              <w:t>We ran a strategy workshop that united the JV around a shared purpose, a clear picture of what Sydney Metro needed and a co-created unique selling proposition. Bespoke training and coaching followed. We prepared the team for each technical interactive, debriefed every touchpoint and reviewed the written submission.</w:t>
             </w:r>
           </w:p>
         </w:tc>
@@ -5717,7 +6008,7 @@
                 <w:sz w:val="22"/>
                 <w:szCs w:val="22"/>
               </w:rPr>
-              <w:t xml:space="preserve">What changed</w:t>
+              <w:t>What changed</w:t>
             </w:r>
           </w:p>
           <w:p>
@@ -5729,7 +6020,7 @@
                 <w:sz w:val="17"/>
                 <w:szCs w:val="17"/>
               </w:rPr>
-              <w:t xml:space="preserve">The JV won the $1.6bn contract to dig the final tunnel section of Sydney Metro West. Sydney Metro said it was delighted by the JV through the tender, and cited the collaboration between the teams as a critical factor in the award. Our engagement continued for more than five years.</w:t>
+              <w:t>A team that had previously led with technical expertise emerged with a shared strategy, a clear purpose and the skills to engage Sydney Metro with empathy and intention. Debriefs sharpened its approach, coaching lifted its presence and the submission told the same coherent story.</w:t>
             </w:r>
           </w:p>
         </w:tc>
@@ -5740,35 +6031,16 @@
         <w:pBdr>
           <w:left w:val="single" w:sz="24" w:space="12" w:color="F48047"/>
         </w:pBdr>
-        <w:spacing w:before="280" w:after="60" w:line="300" w:lineRule="auto"/>
+        <w:spacing w:before="280" w:after="120" w:line="300" w:lineRule="auto"/>
         <w:ind w:left="240"/>
       </w:pPr>
       <w:r>
         <w:rPr>
-          <w:rFonts w:ascii="Poppins" w:eastAsia="Poppins" w:hAnsi="Poppins" w:cs="Poppins"/>
-          <w:i/>
-          <w:iCs/>
+          <w:rFonts w:ascii="Poppins Medium" w:eastAsia="Poppins Medium" w:hAnsi="Poppins Medium" w:cs="Poppins Medium"/>
           <w:sz w:val="22"/>
           <w:szCs w:val="22"/>
         </w:rPr>
-        <w:t>“Thank you again for the tremendous support along the tender … your guidance undoubtedly played a big part in helping us convey our real value.”</w:t>
-      </w:r>
-    </w:p>
-    <w:p>
-      <w:pPr>
-        <w:pBdr>
-          <w:left w:val="single" w:sz="24" w:space="12" w:color="F48047"/>
-        </w:pBdr>
-        <w:spacing w:line="288" w:lineRule="auto"/>
-        <w:ind w:left="240"/>
-      </w:pPr>
-      <w:r>
-        <w:rPr>
-          <w:color w:val="616173"/>
-          <w:sz w:val="17"/>
-          <w:szCs w:val="17"/>
-        </w:rPr>
-        <w:t>Scott Connor, Construction Director, CPB Contractors</w:t>
+        <w:t>The result was a bid team that presented as genuinely cohesive and client-focused, reflecting exactly what Sydney Metro had signalled it was looking for.</w:t>
       </w:r>
     </w:p>
     <w:p>
@@ -5782,7 +6054,7 @@
         </w:rPr>
         <w:lastRenderedPageBreak/>
         <w:drawing>
-          <wp:anchor distT="0" distB="0" distL="0" distR="0" simplePos="0" relativeHeight="251658248" behindDoc="0" locked="0" layoutInCell="1" allowOverlap="1" wp14:anchorId="49A174DB" wp14:editId="49A174DC">
+          <wp:anchor distT="0" distB="0" distL="0" distR="0" simplePos="0" relativeHeight="251649536" behindDoc="0" locked="0" layoutInCell="1" allowOverlap="1" wp14:anchorId="49A174DF" wp14:editId="49A174E0">
             <wp:simplePos x="0" y="0"/>
             <wp:positionH relativeFrom="page">
               <wp:posOffset>0</wp:posOffset>
@@ -5793,7 +6065,7 @@
             <wp:extent cx="323850" cy="1809750"/>
             <wp:effectExtent l="0" t="0" r="0" b="0"/>
             <wp:wrapNone/>
-            <wp:docPr id="1205758676" name="Picture 1205758676"/>
+            <wp:docPr id="532190394" name="Picture 532190394"/>
             <wp:cNvGraphicFramePr>
               <a:graphicFrameLocks xmlns:a="http://schemas.openxmlformats.org/drawingml/2006/main" noChangeAspect="1"/>
             </wp:cNvGraphicFramePr>
@@ -5807,7 +6079,7 @@
                     </pic:cNvPicPr>
                   </pic:nvPicPr>
                   <pic:blipFill>
-                    <a:blip r:embed="rId40"/>
+                    <a:blip r:embed="rId43"/>
                     <a:srcRect/>
                     <a:stretch>
                       <a:fillRect/>
@@ -5863,7 +6135,31 @@
           <w:sz w:val="16"/>
           <w:szCs w:val="16"/>
         </w:rPr>
-        <w:t xml:space="preserve">Bid strategy  |  Team alignment  |  Interactive preparation</w:t>
+        <w:t xml:space="preserve">Evaluation </w:t>
+      </w:r>
+      <w:proofErr w:type="gramStart"/>
+      <w:r>
+        <w:rPr>
+          <w:rFonts w:ascii="Poppins Medium" w:eastAsia="Poppins Medium" w:hAnsi="Poppins Medium" w:cs="Poppins Medium"/>
+          <w:caps/>
+          <w:color w:val="616173"/>
+          <w:spacing w:val="20"/>
+          <w:sz w:val="16"/>
+          <w:szCs w:val="16"/>
+        </w:rPr>
+        <w:t>interactions  |</w:t>
+      </w:r>
+      <w:proofErr w:type="gramEnd"/>
+      <w:r>
+        <w:rPr>
+          <w:rFonts w:ascii="Poppins Medium" w:eastAsia="Poppins Medium" w:hAnsi="Poppins Medium" w:cs="Poppins Medium"/>
+          <w:caps/>
+          <w:color w:val="616173"/>
+          <w:spacing w:val="20"/>
+          <w:sz w:val="16"/>
+          <w:szCs w:val="16"/>
+        </w:rPr>
+        <w:t xml:space="preserve">  Interactive preparation</w:t>
       </w:r>
     </w:p>
     <w:p>
@@ -5876,7 +6172,7 @@
           <w:sz w:val="40"/>
           <w:szCs w:val="40"/>
         </w:rPr>
-        <w:t xml:space="preserve">Transforming how a JV engages with its client</w:t>
+        <w:t>Building a team that performs when it matters most</w:t>
       </w:r>
     </w:p>
     <w:p>
@@ -5889,7 +6185,7 @@
           <w:sz w:val="18"/>
           <w:szCs w:val="18"/>
         </w:rPr>
-        <w:t xml:space="preserve">CPB Contractors and UGL JV   |   Sydney Metro West Linewide 2, Sydney Metro</w:t>
+        <w:t>CPB Contractors and UGL JV   |   Hunter Transmission Project</w:t>
       </w:r>
     </w:p>
     <w:p>
@@ -5901,10 +6197,10 @@
           <w:noProof/>
         </w:rPr>
         <w:drawing>
-          <wp:inline distT="0" distB="0" distL="0" distR="0" wp14:anchorId="49A174DD" wp14:editId="4D65C2D9">
+          <wp:inline distT="0" distB="0" distL="0" distR="0" wp14:anchorId="49A174E1" wp14:editId="37434169">
             <wp:extent cx="5943600" cy="2571750"/>
             <wp:effectExtent l="0" t="0" r="0" b="0"/>
-            <wp:docPr id="482757958" name="Picture 482757958"/>
+            <wp:docPr id="58018082" name="Picture 58018082"/>
             <wp:cNvGraphicFramePr>
               <a:graphicFrameLocks xmlns:a="http://schemas.openxmlformats.org/drawingml/2006/main" noChangeAspect="1"/>
             </wp:cNvGraphicFramePr>
@@ -5912,19 +6208,14 @@
               <a:graphicData uri="http://schemas.openxmlformats.org/drawingml/2006/picture">
                 <pic:pic xmlns:pic="http://schemas.openxmlformats.org/drawingml/2006/picture">
                   <pic:nvPicPr>
-                    <pic:cNvPr id="482757958" name="Picture 482757958"/>
+                    <pic:cNvPr id="0" name=""/>
                     <pic:cNvPicPr>
                       <a:picLocks noChangeAspect="1" noChangeArrowheads="1"/>
                     </pic:cNvPicPr>
                   </pic:nvPicPr>
                   <pic:blipFill>
-                    <a:blip r:embed="rId42" cstate="print">
-                      <a:extLst>
-                        <a:ext uri="{28A0092B-C50C-407E-A947-70E740481C1C}">
-                          <a14:useLocalDpi xmlns:a14="http://schemas.microsoft.com/office/drawing/2010/main" val="0"/>
-                        </a:ext>
-                      </a:extLst>
-                    </a:blip>
+                    <a:blip r:embed="rId46"/>
+                    <a:srcRect/>
                     <a:stretch>
                       <a:fillRect/>
                     </a:stretch>
@@ -6002,19 +6293,55 @@
                 <w:sz w:val="22"/>
                 <w:szCs w:val="22"/>
               </w:rPr>
-              <w:t xml:space="preserve">The client challenge</w:t>
-            </w:r>
+              <w:t xml:space="preserve">The client </w:t>
+            </w:r>
+            <w:proofErr w:type="gramStart"/>
+            <w:r>
+              <w:rPr>
+                <w:rFonts w:ascii="Poppins Medium" w:eastAsia="Poppins Medium" w:hAnsi="Poppins Medium" w:cs="Poppins Medium"/>
+                <w:color w:val="F48047"/>
+                <w:sz w:val="22"/>
+                <w:szCs w:val="22"/>
+              </w:rPr>
+              <w:t>challenge</w:t>
+            </w:r>
+            <w:proofErr w:type="gramEnd"/>
           </w:p>
           <w:p>
             <w:pPr>
               <w:spacing w:line="276" w:lineRule="auto"/>
             </w:pPr>
+            <w:proofErr w:type="spellStart"/>
             <w:r>
               <w:rPr>
                 <w:sz w:val="17"/>
                 <w:szCs w:val="17"/>
               </w:rPr>
-              <w:t xml:space="preserve">Sydney Metro had raised its expectations of delivery contractors, asking for open collaboration within an increasingly rigid, risk-averse contractual environment. The JV knew a strong technical submission would not be enough. It needed a fundamentally different way of engaging its client.</w:t>
+              <w:t>Transgrid</w:t>
+            </w:r>
+            <w:proofErr w:type="spellEnd"/>
+            <w:r>
+              <w:rPr>
+                <w:sz w:val="17"/>
+                <w:szCs w:val="17"/>
+              </w:rPr>
+              <w:t xml:space="preserve"> had heightened expectations of its delivery partners, and several capable tenderers were in the field. The JV recognised that technical credentials alone would not decide the outcome. It needed consistent, empathetic engagement aligned to what </w:t>
+            </w:r>
+            <w:proofErr w:type="spellStart"/>
+            <w:r>
+              <w:rPr>
+                <w:sz w:val="17"/>
+                <w:szCs w:val="17"/>
+              </w:rPr>
+              <w:t>Transgrid</w:t>
+            </w:r>
+            <w:proofErr w:type="spellEnd"/>
+            <w:r>
+              <w:rPr>
+                <w:sz w:val="17"/>
+                <w:szCs w:val="17"/>
+              </w:rPr>
+              <w:t xml:space="preserve"> needed to see and hear.</w:t>
             </w:r>
           </w:p>
         </w:tc>
@@ -6068,7 +6395,7 @@
                 <w:sz w:val="22"/>
                 <w:szCs w:val="22"/>
               </w:rPr>
-              <w:t xml:space="preserve">Our role</w:t>
+              <w:t>Our role</w:t>
             </w:r>
           </w:p>
           <w:p>
@@ -6080,7 +6407,23 @@
                 <w:sz w:val="17"/>
                 <w:szCs w:val="17"/>
               </w:rPr>
-              <w:t xml:space="preserve">We ran a strategy workshop that united the JV around a shared purpose, a clear picture of what Sydney Metro needed and a co-created unique selling proposition. Bespoke training and coaching followed. We prepared the team for each technical interactive, debriefed every touchpoint and reviewed the written submission.</w:t>
+              <w:t xml:space="preserve">We worked with the bid team from the outset to set a clear engagement strategy aligned to </w:t>
+            </w:r>
+            <w:proofErr w:type="spellStart"/>
+            <w:r>
+              <w:rPr>
+                <w:sz w:val="17"/>
+                <w:szCs w:val="17"/>
+              </w:rPr>
+              <w:t>Transgrid’s</w:t>
+            </w:r>
+            <w:proofErr w:type="spellEnd"/>
+            <w:r>
+              <w:rPr>
+                <w:sz w:val="17"/>
+                <w:szCs w:val="17"/>
+              </w:rPr>
+              <w:t xml:space="preserve"> priorities. Before each interactive, we ran structured preparation and rehearsal sessions to sharpen the narrative and presentation skills. After each one, we debriefed what worked and what needed to shift.</w:t>
             </w:r>
           </w:p>
         </w:tc>
@@ -6134,7 +6477,7 @@
                 <w:sz w:val="22"/>
                 <w:szCs w:val="22"/>
               </w:rPr>
-              <w:t xml:space="preserve">What changed</w:t>
+              <w:t>What changed</w:t>
             </w:r>
           </w:p>
           <w:p>
@@ -6146,7 +6489,7 @@
                 <w:sz w:val="17"/>
                 <w:szCs w:val="17"/>
               </w:rPr>
-              <w:t xml:space="preserve">A team that had previously led with technical expertise emerged with a shared strategy, a clear purpose and the skills to engage Sydney Metro with empathy and intention. Debriefs sharpened its approach, coaching lifted its presence and the submission told the same coherent story.</w:t>
+              <w:t>Across five client interactives, the team’s messaging became sharper, its presence stronger and its approach more consistent, reflecting genuine cultural change within the bid team. Of the four original tenderers, the JV progressed to the final two.</w:t>
             </w:r>
           </w:p>
         </w:tc>
@@ -6166,7 +6509,7 @@
           <w:sz w:val="22"/>
           <w:szCs w:val="22"/>
         </w:rPr>
-        <w:t xml:space="preserve">The result was a bid team that presented as genuinely cohesive and client-focused, reflecting exactly what Sydney Metro had signalled it was looking for.</w:t>
+        <w:t>A repeatable cycle of develop, finalise, rehearse and present gave the team the best possible chance of delighting the client at every interactive.</w:t>
       </w:r>
     </w:p>
     <w:p>
@@ -6180,7 +6523,7 @@
         </w:rPr>
         <w:lastRenderedPageBreak/>
         <w:drawing>
-          <wp:anchor distT="0" distB="0" distL="0" distR="0" simplePos="0" relativeHeight="251658242" behindDoc="0" locked="0" layoutInCell="1" allowOverlap="1" wp14:anchorId="49A174DF" wp14:editId="49A174E0">
+          <wp:anchor distT="0" distB="0" distL="0" distR="0" simplePos="0" relativeHeight="251655680" behindDoc="0" locked="0" layoutInCell="1" allowOverlap="1" wp14:anchorId="49A174DB" wp14:editId="49A174DC">
             <wp:simplePos x="0" y="0"/>
             <wp:positionH relativeFrom="page">
               <wp:posOffset>0</wp:posOffset>
@@ -6191,118 +6534,7 @@
             <wp:extent cx="323850" cy="1809750"/>
             <wp:effectExtent l="0" t="0" r="0" b="0"/>
             <wp:wrapNone/>
-            <wp:docPr id="532190394" name="Picture 532190394"/>
-            <wp:cNvGraphicFramePr>
-              <a:graphicFrameLocks xmlns:a="http://schemas.openxmlformats.org/drawingml/2006/main" noChangeAspect="1"/>
-            </wp:cNvGraphicFramePr>
-            <a:graphic xmlns:a="http://schemas.openxmlformats.org/drawingml/2006/main">
-              <a:graphicData uri="http://schemas.openxmlformats.org/drawingml/2006/picture">
-                <pic:pic xmlns:pic="http://schemas.openxmlformats.org/drawingml/2006/picture">
-                  <pic:nvPicPr>
-                    <pic:cNvPr id="0" name=""/>
-                    <pic:cNvPicPr>
-                      <a:picLocks noChangeAspect="1" noChangeArrowheads="1"/>
-                    </pic:cNvPicPr>
-                  </pic:nvPicPr>
-                  <pic:blipFill>
-                    <a:blip r:embed="rId40"/>
-                    <a:srcRect/>
-                    <a:stretch>
-                      <a:fillRect/>
-                    </a:stretch>
-                  </pic:blipFill>
-                  <pic:spPr bwMode="auto">
-                    <a:xfrm>
-                      <a:off x="0" y="0"/>
-                      <a:ext cx="323850" cy="1809750"/>
-                    </a:xfrm>
-                    <a:prstGeom prst="rect">
-                      <a:avLst/>
-                    </a:prstGeom>
-                  </pic:spPr>
-                </pic:pic>
-              </a:graphicData>
-            </a:graphic>
-          </wp:anchor>
-        </w:drawing>
-      </w:r>
-    </w:p>
-    <w:p>
-      <w:pPr>
-        <w:spacing w:line="400" w:lineRule="exact"/>
-      </w:pPr>
-    </w:p>
-    <w:p>
-      <w:pPr>
-        <w:spacing w:after="80" w:line="288" w:lineRule="auto"/>
-      </w:pPr>
-      <w:r>
-        <w:rPr>
-          <w:rFonts w:ascii="Poppins Medium" w:eastAsia="Poppins Medium" w:hAnsi="Poppins Medium" w:cs="Poppins Medium"/>
-          <w:caps/>
-          <w:color w:val="F48047"/>
-          <w:spacing w:val="30"/>
-          <w:sz w:val="17"/>
-          <w:szCs w:val="17"/>
-        </w:rPr>
-        <w:t>Our project experience</w:t>
-      </w:r>
-    </w:p>
-    <w:p>
-      <w:pPr>
-        <w:spacing w:after="60" w:line="288" w:lineRule="auto"/>
-      </w:pPr>
-      <w:r>
-        <w:rPr>
-          <w:rFonts w:ascii="Poppins Medium" w:eastAsia="Poppins Medium" w:hAnsi="Poppins Medium" w:cs="Poppins Medium"/>
-          <w:caps/>
-          <w:color w:val="616173"/>
-          <w:spacing w:val="20"/>
-          <w:sz w:val="16"/>
-          <w:szCs w:val="16"/>
-        </w:rPr>
-        <w:t xml:space="preserve">Evaluation interactions  |  Interactive preparation</w:t>
-      </w:r>
-    </w:p>
-    <w:p>
-      <w:pPr>
-        <w:spacing w:after="60" w:line="252" w:lineRule="auto"/>
-      </w:pPr>
-      <w:r>
-        <w:rPr>
-          <w:rFonts w:ascii="Poppins Medium" w:eastAsia="Poppins Medium" w:hAnsi="Poppins Medium" w:cs="Poppins Medium"/>
-          <w:sz w:val="40"/>
-          <w:szCs w:val="40"/>
-        </w:rPr>
-        <w:t xml:space="preserve">Building a team that performs when it matters most</w:t>
-      </w:r>
-    </w:p>
-    <w:p>
-      <w:pPr>
-        <w:spacing w:after="200" w:line="288" w:lineRule="auto"/>
-      </w:pPr>
-      <w:r>
-        <w:rPr>
-          <w:color w:val="616173"/>
-          <w:sz w:val="18"/>
-          <w:szCs w:val="18"/>
-        </w:rPr>
-        <w:t xml:space="preserve">CPB Contractors and UGL JV   |   Hunter Transmission Project, Transgrid</w:t>
-      </w:r>
-    </w:p>
-    <w:p>
-      <w:pPr>
-        <w:spacing w:after="220" w:line="288" w:lineRule="auto"/>
-      </w:pPr>
-      <w:r>
-        <w:rPr>
-          <w:noProof/>
-        </w:rPr>
-        <w:drawing>
-          <wp:inline distT="0" distB="0" distL="0" distR="0" wp14:anchorId="49A174E1" wp14:editId="49A174E2">
-            <wp:extent cx="5943600" cy="2571750"/>
-            <wp:effectExtent l="0" t="0" r="0" b="0"/>
-            <wp:docPr id="58018082" name="Picture 58018082"/>
+            <wp:docPr id="197828429" name="Picture 1205758676"/>
             <wp:cNvGraphicFramePr>
               <a:graphicFrameLocks xmlns:a="http://schemas.openxmlformats.org/drawingml/2006/main" noChangeAspect="1"/>
             </wp:cNvGraphicFramePr>
@@ -6325,7 +6557,166 @@
                   <pic:spPr bwMode="auto">
                     <a:xfrm>
                       <a:off x="0" y="0"/>
-                      <a:ext cx="5943600" cy="2571750"/>
+                      <a:ext cx="323850" cy="1809750"/>
+                    </a:xfrm>
+                    <a:prstGeom prst="rect">
+                      <a:avLst/>
+                    </a:prstGeom>
+                  </pic:spPr>
+                </pic:pic>
+              </a:graphicData>
+            </a:graphic>
+          </wp:anchor>
+        </w:drawing>
+      </w:r>
+    </w:p>
+    <w:p>
+      <w:pPr>
+        <w:spacing w:line="400" w:lineRule="exact"/>
+      </w:pPr>
+    </w:p>
+    <w:p>
+      <w:pPr>
+        <w:spacing w:after="80" w:line="288" w:lineRule="auto"/>
+      </w:pPr>
+      <w:r>
+        <w:rPr>
+          <w:rFonts w:ascii="Poppins Medium" w:eastAsia="Poppins Medium" w:hAnsi="Poppins Medium" w:cs="Poppins Medium"/>
+          <w:caps/>
+          <w:color w:val="F48047"/>
+          <w:spacing w:val="30"/>
+          <w:sz w:val="17"/>
+          <w:szCs w:val="17"/>
+        </w:rPr>
+        <w:t>Our project experience</w:t>
+      </w:r>
+    </w:p>
+    <w:p>
+      <w:pPr>
+        <w:spacing w:after="60" w:line="288" w:lineRule="auto"/>
+      </w:pPr>
+      <w:r>
+        <w:rPr>
+          <w:rFonts w:ascii="Poppins Medium" w:eastAsia="Poppins Medium" w:hAnsi="Poppins Medium" w:cs="Poppins Medium"/>
+          <w:caps/>
+          <w:color w:val="616173"/>
+          <w:spacing w:val="20"/>
+          <w:sz w:val="16"/>
+          <w:szCs w:val="16"/>
+        </w:rPr>
+        <w:t xml:space="preserve">ECI and bid </w:t>
+      </w:r>
+      <w:proofErr w:type="gramStart"/>
+      <w:r>
+        <w:rPr>
+          <w:rFonts w:ascii="Poppins Medium" w:eastAsia="Poppins Medium" w:hAnsi="Poppins Medium" w:cs="Poppins Medium"/>
+          <w:caps/>
+          <w:color w:val="616173"/>
+          <w:spacing w:val="20"/>
+          <w:sz w:val="16"/>
+          <w:szCs w:val="16"/>
+        </w:rPr>
+        <w:t>development  |</w:t>
+      </w:r>
+      <w:proofErr w:type="gramEnd"/>
+      <w:r>
+        <w:rPr>
+          <w:rFonts w:ascii="Poppins Medium" w:eastAsia="Poppins Medium" w:hAnsi="Poppins Medium" w:cs="Poppins Medium"/>
+          <w:caps/>
+          <w:color w:val="616173"/>
+          <w:spacing w:val="20"/>
+          <w:sz w:val="16"/>
+          <w:szCs w:val="16"/>
+        </w:rPr>
+        <w:t xml:space="preserve">  Evaluation interactions</w:t>
+      </w:r>
+    </w:p>
+    <w:p>
+      <w:pPr>
+        <w:spacing w:after="60" w:line="252" w:lineRule="auto"/>
+      </w:pPr>
+      <w:r>
+        <w:rPr>
+          <w:rFonts w:ascii="Poppins Medium" w:eastAsia="Poppins Medium" w:hAnsi="Poppins Medium" w:cs="Poppins Medium"/>
+          <w:sz w:val="34"/>
+          <w:szCs w:val="34"/>
+        </w:rPr>
+        <w:t>Embedding customer centricity to win the Eastern Tunnelling Package</w:t>
+      </w:r>
+    </w:p>
+    <w:p>
+      <w:pPr>
+        <w:spacing w:after="200" w:line="288" w:lineRule="auto"/>
+      </w:pPr>
+      <w:r>
+        <w:rPr>
+          <w:color w:val="616173"/>
+          <w:sz w:val="18"/>
+          <w:szCs w:val="18"/>
+        </w:rPr>
+        <w:t xml:space="preserve">John Holland, CPB Contractors and </w:t>
+      </w:r>
+      <w:proofErr w:type="spellStart"/>
+      <w:r>
+        <w:rPr>
+          <w:color w:val="616173"/>
+          <w:sz w:val="18"/>
+          <w:szCs w:val="18"/>
+        </w:rPr>
+        <w:t>Ghella</w:t>
+      </w:r>
+      <w:proofErr w:type="spellEnd"/>
+      <w:r>
+        <w:rPr>
+          <w:color w:val="616173"/>
+          <w:sz w:val="18"/>
+          <w:szCs w:val="18"/>
+        </w:rPr>
+        <w:t xml:space="preserve"> JV   |   Sydney Metro West, Eastern Tunnelling Package</w:t>
+      </w:r>
+    </w:p>
+    <w:p>
+      <w:pPr>
+        <w:spacing w:after="220" w:line="288" w:lineRule="auto"/>
+        <w:jc w:val="center"/>
+      </w:pPr>
+      <w:r>
+        <w:rPr>
+          <w:noProof/>
+        </w:rPr>
+        <w:drawing>
+          <wp:inline distT="0" distB="0" distL="0" distR="0" wp14:anchorId="49A174D9" wp14:editId="197AA5AD">
+            <wp:extent cx="5943600" cy="2000250"/>
+            <wp:effectExtent l="0" t="0" r="0" b="0"/>
+            <wp:docPr id="1470926768" name="Picture 1470926768"/>
+            <wp:cNvGraphicFramePr>
+              <a:graphicFrameLocks xmlns:a="http://schemas.openxmlformats.org/drawingml/2006/main" noChangeAspect="1"/>
+            </wp:cNvGraphicFramePr>
+            <a:graphic xmlns:a="http://schemas.openxmlformats.org/drawingml/2006/main">
+              <a:graphicData uri="http://schemas.openxmlformats.org/drawingml/2006/picture">
+                <pic:pic xmlns:pic="http://schemas.openxmlformats.org/drawingml/2006/picture">
+                  <pic:nvPicPr>
+                    <pic:cNvPr id="1470926768" name="Picture 1470926768"/>
+                    <pic:cNvPicPr>
+                      <a:picLocks noChangeAspect="1" noChangeArrowheads="1"/>
+                    </pic:cNvPicPr>
+                  </pic:nvPicPr>
+                  <pic:blipFill>
+                    <a:blip r:embed="rId44" cstate="print">
+                      <a:extLst>
+                        <a:ext uri="{28A0092B-C50C-407E-A947-70E740481C1C}">
+                          <a14:useLocalDpi xmlns:a14="http://schemas.microsoft.com/office/drawing/2010/main" val="0"/>
+                        </a:ext>
+                      </a:extLst>
+                    </a:blip>
+                    <a:stretch>
+                      <a:fillRect/>
+                    </a:stretch>
+                  </pic:blipFill>
+                  <pic:spPr bwMode="auto">
+                    <a:xfrm>
+                      <a:off x="0" y="0"/>
+                      <a:ext cx="5943600" cy="2000250"/>
                     </a:xfrm>
                     <a:prstGeom prst="rect">
                       <a:avLst/>
@@ -6395,8 +6786,19 @@
                 <w:sz w:val="22"/>
                 <w:szCs w:val="22"/>
               </w:rPr>
-              <w:t xml:space="preserve">The client challenge</w:t>
-            </w:r>
+              <w:t xml:space="preserve">The client </w:t>
+            </w:r>
+            <w:proofErr w:type="gramStart"/>
+            <w:r>
+              <w:rPr>
+                <w:rFonts w:ascii="Poppins Medium" w:eastAsia="Poppins Medium" w:hAnsi="Poppins Medium" w:cs="Poppins Medium"/>
+                <w:color w:val="F48047"/>
+                <w:sz w:val="22"/>
+                <w:szCs w:val="22"/>
+              </w:rPr>
+              <w:t>challenge</w:t>
+            </w:r>
+            <w:proofErr w:type="gramEnd"/>
           </w:p>
           <w:p>
             <w:pPr>
@@ -6407,7 +6809,7 @@
                 <w:sz w:val="17"/>
                 <w:szCs w:val="17"/>
               </w:rPr>
-              <w:t xml:space="preserve">Transgrid had heightened expectations of its delivery partners, and several capable tenderers were in the field. The JV recognised that technical credentials alone would not decide the outcome. It needed consistent, empathetic engagement aligned to what Transgrid needed to see and hear.</w:t>
+              <w:t>After missing out on a recent Sydney Metro tender, the three JV partners wanted to change how they bid. They needed a more client and user centric approach to compete for the Eastern Tunnelling Package.</w:t>
             </w:r>
           </w:p>
         </w:tc>
@@ -6461,7 +6863,7 @@
                 <w:sz w:val="22"/>
                 <w:szCs w:val="22"/>
               </w:rPr>
-              <w:t xml:space="preserve">Our role</w:t>
+              <w:t>Our role</w:t>
             </w:r>
           </w:p>
           <w:p>
@@ -6473,7 +6875,7 @@
                 <w:sz w:val="17"/>
                 <w:szCs w:val="17"/>
               </w:rPr>
-              <w:t xml:space="preserve">We worked with the bid team from the outset to set a clear engagement strategy aligned to Transgrid’s priorities. Before each interactive, we ran structured preparation and rehearsal sessions to sharpen the narrative and presentation skills. After each one, we debriefed what worked and what needed to shift.</w:t>
+              <w:t>We embedded five customer-centric principles in the tender team through outside-in strategy workshops with 25 JV members, design thinking, knowledge transfer sessions with the client and collaborative problem solving. We trained the team for client meetings, coached them through document review and built an interactive Miro board for client engagement.</w:t>
             </w:r>
           </w:p>
         </w:tc>
@@ -6527,7 +6929,7 @@
                 <w:sz w:val="22"/>
                 <w:szCs w:val="22"/>
               </w:rPr>
-              <w:t xml:space="preserve">What changed</w:t>
+              <w:t>What changed</w:t>
             </w:r>
           </w:p>
           <w:p>
@@ -6539,7 +6941,23 @@
                 <w:sz w:val="17"/>
                 <w:szCs w:val="17"/>
               </w:rPr>
-              <w:t xml:space="preserve">Across five client interactives, the team’s messaging became sharper, its presence stronger and its approach more consistent, reflecting genuine cultural change within the bid team. Of the four original tenderers, the JV progressed to the final two.</w:t>
+              <w:t xml:space="preserve">The JV won the $1.6bn contract to dig the final tunnel section of Sydney Metro West. Sydney Metro said it was delighted by the JV through the </w:t>
+            </w:r>
+            <w:proofErr w:type="gramStart"/>
+            <w:r>
+              <w:rPr>
+                <w:sz w:val="17"/>
+                <w:szCs w:val="17"/>
+              </w:rPr>
+              <w:t>tender, and</w:t>
+            </w:r>
+            <w:proofErr w:type="gramEnd"/>
+            <w:r>
+              <w:rPr>
+                <w:sz w:val="17"/>
+                <w:szCs w:val="17"/>
+              </w:rPr>
+              <w:t xml:space="preserve"> cited the collaboration between the teams as a critical factor in the award. Our engagement continued for more than five years.</w:t>
             </w:r>
           </w:p>
         </w:tc>
@@ -6550,16 +6968,35 @@
         <w:pBdr>
           <w:left w:val="single" w:sz="24" w:space="12" w:color="F48047"/>
         </w:pBdr>
-        <w:spacing w:before="280" w:after="120" w:line="300" w:lineRule="auto"/>
+        <w:spacing w:before="280" w:after="60" w:line="300" w:lineRule="auto"/>
         <w:ind w:left="240"/>
       </w:pPr>
       <w:r>
         <w:rPr>
-          <w:rFonts w:ascii="Poppins Medium" w:eastAsia="Poppins Medium" w:hAnsi="Poppins Medium" w:cs="Poppins Medium"/>
+          <w:rFonts w:ascii="Poppins" w:eastAsia="Poppins" w:hAnsi="Poppins" w:cs="Poppins"/>
+          <w:i/>
+          <w:iCs/>
           <w:sz w:val="22"/>
           <w:szCs w:val="22"/>
         </w:rPr>
-        <w:t xml:space="preserve">A repeatable cycle of develop, finalise, rehearse and present gave the team the best possible chance of delighting the client at every interactive.</w:t>
+        <w:t>“Thank you again for the tremendous support along the tender … your guidance undoubtedly played a big part in helping us convey our real value.”</w:t>
+      </w:r>
+    </w:p>
+    <w:p>
+      <w:pPr>
+        <w:pBdr>
+          <w:left w:val="single" w:sz="24" w:space="12" w:color="F48047"/>
+        </w:pBdr>
+        <w:spacing w:line="288" w:lineRule="auto"/>
+        <w:ind w:left="240"/>
+      </w:pPr>
+      <w:r>
+        <w:rPr>
+          <w:color w:val="616173"/>
+          <w:sz w:val="17"/>
+          <w:szCs w:val="17"/>
+        </w:rPr>
+        <w:t>Scott Connor, Construction Director, CPB Contractors</w:t>
       </w:r>
     </w:p>
     <w:p>
@@ -6573,7 +7010,7 @@
         </w:rPr>
         <w:lastRenderedPageBreak/>
         <w:drawing>
-          <wp:anchor distT="0" distB="0" distL="0" distR="0" simplePos="0" relativeHeight="251658245" behindDoc="0" locked="0" layoutInCell="1" allowOverlap="1" wp14:anchorId="49A174E3" wp14:editId="49A174E4">
+          <wp:anchor distT="0" distB="0" distL="0" distR="0" simplePos="0" relativeHeight="251652608" behindDoc="0" locked="0" layoutInCell="1" allowOverlap="1" wp14:anchorId="49A174E3" wp14:editId="6F70A36C">
             <wp:simplePos x="0" y="0"/>
             <wp:positionH relativeFrom="page">
               <wp:posOffset>0</wp:posOffset>
@@ -6598,7 +7035,7 @@
                     </pic:cNvPicPr>
                   </pic:nvPicPr>
                   <pic:blipFill>
-                    <a:blip r:embed="rId40"/>
+                    <a:blip r:embed="rId43"/>
                     <a:srcRect/>
                     <a:stretch>
                       <a:fillRect/>
@@ -6651,7 +7088,7 @@
           <w:sz w:val="44"/>
           <w:szCs w:val="44"/>
         </w:rPr>
-        <w:t xml:space="preserve">More of our work with CPB and UGL</w:t>
+        <w:t>More of our work with CPB and UGL</w:t>
       </w:r>
     </w:p>
     <w:p>
@@ -6659,7 +7096,13 @@
         <w:spacing w:after="300" w:line="300" w:lineRule="auto"/>
       </w:pPr>
       <w:r>
-        <w:t xml:space="preserve">Alongside full bid engagements, we provide focused support for single, high-stakes interactions and build lasting capability within the team.</w:t>
+        <w:t xml:space="preserve">Alongside full bid engagements, we provide focused support for </w:t>
+      </w:r>
+      <w:r>
+        <w:t xml:space="preserve">shorter, </w:t>
+      </w:r>
+      <w:r>
+        <w:t>high-stakes interactions and build lasting capability within the team.</w:t>
       </w:r>
     </w:p>
     <w:p>
@@ -6676,7 +7119,31 @@
           <w:sz w:val="16"/>
           <w:szCs w:val="16"/>
         </w:rPr>
-        <w:t xml:space="preserve">Evaluation interactions  |  Focused advisory</w:t>
+        <w:t xml:space="preserve">Evaluation </w:t>
+      </w:r>
+      <w:proofErr w:type="gramStart"/>
+      <w:r>
+        <w:rPr>
+          <w:rFonts w:ascii="Poppins Medium" w:eastAsia="Poppins Medium" w:hAnsi="Poppins Medium" w:cs="Poppins Medium"/>
+          <w:caps/>
+          <w:color w:val="616173"/>
+          <w:spacing w:val="20"/>
+          <w:sz w:val="16"/>
+          <w:szCs w:val="16"/>
+        </w:rPr>
+        <w:t>interactions  |</w:t>
+      </w:r>
+      <w:proofErr w:type="gramEnd"/>
+      <w:r>
+        <w:rPr>
+          <w:rFonts w:ascii="Poppins Medium" w:eastAsia="Poppins Medium" w:hAnsi="Poppins Medium" w:cs="Poppins Medium"/>
+          <w:caps/>
+          <w:color w:val="616173"/>
+          <w:spacing w:val="20"/>
+          <w:sz w:val="16"/>
+          <w:szCs w:val="16"/>
+        </w:rPr>
+        <w:t xml:space="preserve">  Focused advisory</w:t>
       </w:r>
     </w:p>
     <w:p>
@@ -6690,7 +7157,7 @@
           <w:sz w:val="30"/>
           <w:szCs w:val="30"/>
         </w:rPr>
-        <w:t xml:space="preserve">Preparing for a critical client interactive</w:t>
+        <w:t>Preparing for a critical client interactive</w:t>
       </w:r>
     </w:p>
     <w:p>
@@ -6704,7 +7171,7 @@
           <w:sz w:val="18"/>
           <w:szCs w:val="18"/>
         </w:rPr>
-        <w:t xml:space="preserve">CPB Contractors and UGL   |   New England Renewable Energy Zone</w:t>
+        <w:t>CPB Contractors and UGL   |   New England Renewable Energy Zone</w:t>
       </w:r>
     </w:p>
     <w:tbl>
@@ -6760,7 +7227,28 @@
                 <w:sz w:val="18"/>
                 <w:szCs w:val="18"/>
               </w:rPr>
-              <w:t xml:space="preserve">Building on our work together on the Hunter Transmission Project, the CPB and UGL team engaged us to support a high-stakes client interactive for New England REZ. We applied the same proven cycle: aligning the team on what the client needed to hear, shaping a clear and consistent narrative, running structured rehearsals to sharpen delivery and presence, and debriefing afterwards so the learnings carried into the rest of the pursuit. The team presented with focus and confidence, showing its understanding of the client rather than simply describing it.</w:t>
+              <w:t xml:space="preserve">Building on our work together on the Hunter Transmission Project, the CPB and UGL team engaged us to support a high-stakes client interactive for New England REZ. We applied the same proven cycle: aligning the team on what the client needed to hear, shaping a clear and consistent narrative, </w:t>
+            </w:r>
+            <w:r>
+              <w:rPr>
+                <w:sz w:val="18"/>
+                <w:szCs w:val="18"/>
+              </w:rPr>
+              <w:t>and developing the right messaging for the interactive.</w:t>
+            </w:r>
+            <w:r>
+              <w:rPr>
+                <w:sz w:val="18"/>
+                <w:szCs w:val="18"/>
+              </w:rPr>
+              <w:t xml:space="preserve"> The team presented with focus and confidence, showing its understanding of the client</w:t>
+            </w:r>
+            <w:r>
+              <w:rPr>
+                <w:sz w:val="18"/>
+                <w:szCs w:val="18"/>
+              </w:rPr>
+              <w:t>.</w:t>
             </w:r>
           </w:p>
         </w:tc>
@@ -6811,7 +7299,7 @@
                 <w:sz w:val="44"/>
                 <w:szCs w:val="44"/>
               </w:rPr>
-              <w:t xml:space="preserve">1</w:t>
+              <w:t>1</w:t>
             </w:r>
           </w:p>
           <w:p>
@@ -6824,7 +7312,7 @@
                 <w:sz w:val="16"/>
                 <w:szCs w:val="16"/>
               </w:rPr>
-              <w:t xml:space="preserve">Critical client interactive, supported from preparation to debrief</w:t>
+              <w:t>Critical client interactive, supported from preparation to debrief</w:t>
             </w:r>
           </w:p>
           <w:p>
@@ -6835,7 +7323,7 @@
                 <w:sz w:val="44"/>
                 <w:szCs w:val="44"/>
               </w:rPr>
-              <w:t xml:space="preserve">4 steps</w:t>
+              <w:t>4 steps</w:t>
             </w:r>
           </w:p>
           <w:p>
@@ -6848,7 +7336,7 @@
                 <w:sz w:val="16"/>
                 <w:szCs w:val="16"/>
               </w:rPr>
-              <w:t xml:space="preserve">Develop, finalise, rehearse and present</w:t>
+              <w:t>Develop, finalise, rehearse and present</w:t>
             </w:r>
           </w:p>
         </w:tc>
@@ -6873,7 +7361,31 @@
           <w:sz w:val="16"/>
           <w:szCs w:val="16"/>
         </w:rPr>
-        <w:t xml:space="preserve">Team alignment and culture  |  Capability building</w:t>
+        <w:t xml:space="preserve">Team alignment and </w:t>
+      </w:r>
+      <w:proofErr w:type="gramStart"/>
+      <w:r>
+        <w:rPr>
+          <w:rFonts w:ascii="Poppins Medium" w:eastAsia="Poppins Medium" w:hAnsi="Poppins Medium" w:cs="Poppins Medium"/>
+          <w:caps/>
+          <w:color w:val="616173"/>
+          <w:spacing w:val="20"/>
+          <w:sz w:val="16"/>
+          <w:szCs w:val="16"/>
+        </w:rPr>
+        <w:t>culture  |</w:t>
+      </w:r>
+      <w:proofErr w:type="gramEnd"/>
+      <w:r>
+        <w:rPr>
+          <w:rFonts w:ascii="Poppins Medium" w:eastAsia="Poppins Medium" w:hAnsi="Poppins Medium" w:cs="Poppins Medium"/>
+          <w:caps/>
+          <w:color w:val="616173"/>
+          <w:spacing w:val="20"/>
+          <w:sz w:val="16"/>
+          <w:szCs w:val="16"/>
+        </w:rPr>
+        <w:t xml:space="preserve">  Capability building</w:t>
       </w:r>
     </w:p>
     <w:p>
@@ -6887,7 +7399,7 @@
           <w:sz w:val="30"/>
           <w:szCs w:val="30"/>
         </w:rPr>
-        <w:t xml:space="preserve">Developing customer-centric skills to win competitive bids</w:t>
+        <w:t>Developing customer-centric skills to win competitive bids</w:t>
       </w:r>
     </w:p>
     <w:p>
@@ -6901,7 +7413,7 @@
           <w:sz w:val="18"/>
           <w:szCs w:val="18"/>
         </w:rPr>
-        <w:t xml:space="preserve">CPB Contractors and UGL JV   |   Bespoke training program</w:t>
+        <w:t>CPB Contractors and UGL JV   |   Bespoke training program</w:t>
       </w:r>
     </w:p>
     <w:tbl>
@@ -6957,7 +7469,7 @@
                 <w:sz w:val="18"/>
                 <w:szCs w:val="18"/>
               </w:rPr>
-              <w:t xml:space="preserve">The JV’s technical expertise was well regarded, but its teams wanted the skills, behaviours and tools to connect more deeply with client needs. We designed and delivered a bespoke program covering active listening, an entrepreneurial mindset, executive presence, managing pressure, persuasion, storytelling, presentation design and key messaging, reinforced through role plays, team challenges and follow-up resources. The team came away more confident, better able to tailor its communication to each client, and with customer centricity embedded in its bid process.</w:t>
+              <w:t>The JV’s technical expertise was well regarded, but its teams wanted the skills, behaviours and tools to connect more deeply with client needs. We designed and delivered a bespoke program covering active listening, an entrepreneurial mindset, executive presence, managing pressure, persuasion, storytelling, presentation design and key messaging, reinforced through role plays, team challenges and follow-up resources. The team came away more confident, better able to tailor its communication to each client, and with customer centricity embedded in its bid process.</w:t>
             </w:r>
           </w:p>
         </w:tc>
@@ -7008,7 +7520,7 @@
                 <w:sz w:val="44"/>
                 <w:szCs w:val="44"/>
               </w:rPr>
-              <w:t xml:space="preserve">4</w:t>
+              <w:t>4</w:t>
             </w:r>
           </w:p>
           <w:p>
@@ -7021,7 +7533,7 @@
                 <w:sz w:val="16"/>
                 <w:szCs w:val="16"/>
               </w:rPr>
-              <w:t xml:space="preserve">In-person practical workshops</w:t>
+              <w:t>In-person practical workshops</w:t>
             </w:r>
           </w:p>
           <w:p>
@@ -7032,7 +7544,7 @@
                 <w:sz w:val="44"/>
                 <w:szCs w:val="44"/>
               </w:rPr>
-              <w:t xml:space="preserve">9</w:t>
+              <w:t>9</w:t>
             </w:r>
           </w:p>
           <w:p>
@@ -7045,7 +7557,7 @@
                 <w:sz w:val="16"/>
                 <w:szCs w:val="16"/>
               </w:rPr>
-              <w:t xml:space="preserve">Customer-centric skill areas, from active listening to storytelling</w:t>
+              <w:t>Customer-centric skill areas, from active listening to storytelling</w:t>
             </w:r>
           </w:p>
         </w:tc>
@@ -7062,7 +7574,7 @@
         </w:rPr>
         <w:lastRenderedPageBreak/>
         <w:drawing>
-          <wp:anchor distT="0" distB="0" distL="0" distR="0" simplePos="0" relativeHeight="251658241" behindDoc="0" locked="0" layoutInCell="1" allowOverlap="1" wp14:anchorId="49A174E5" wp14:editId="49A174E6">
+          <wp:anchor distT="0" distB="0" distL="0" distR="0" simplePos="0" relativeHeight="251648512" behindDoc="0" locked="0" layoutInCell="1" allowOverlap="1" wp14:anchorId="49A174E5" wp14:editId="49A174E6">
             <wp:simplePos x="0" y="0"/>
             <wp:positionH relativeFrom="page">
               <wp:posOffset>0</wp:posOffset>
@@ -7087,7 +7599,7 @@
                     </pic:cNvPicPr>
                   </pic:nvPicPr>
                   <pic:blipFill>
-                    <a:blip r:embed="rId44"/>
+                    <a:blip r:embed="rId47"/>
                     <a:srcRect/>
                     <a:stretch>
                       <a:fillRect/>
@@ -7158,7 +7670,7 @@
         <w:spacing w:after="240" w:line="300" w:lineRule="auto"/>
       </w:pPr>
       <w:r>
-        <w:t xml:space="preserve">Founded in 2003, The Strategy Group is a Sydney based strategy and experience consultancy. We combine research, human centred design, facilitation and practical implementation support. We work across construction, government and other sectors, bringing an outside-in perspective to the people and organisational challenges that shape outcomes.</w:t>
+        <w:t>Founded in 2003, The Strategy Group is a Sydney based strategy and experience consultancy. We combine research, human centred design, facilitation and practical implementation support. We work across construction, government and other sectors, bringing an outside-in perspective to the people and organisational challenges that shape outcomes.</w:t>
       </w:r>
     </w:p>
     <w:p>
@@ -7226,9 +7738,9 @@
                 <w:noProof/>
               </w:rPr>
               <w:drawing>
-                <wp:inline distT="0" distB="0" distL="0" distR="0" wp14:anchorId="49A174E7" wp14:editId="053C306C">
-                  <wp:extent cx="984250" cy="1181100"/>
-                  <wp:effectExtent l="0" t="0" r="6350" b="0"/>
+                <wp:inline distT="0" distB="0" distL="0" distR="0" wp14:anchorId="49A174E7" wp14:editId="5BBFDA08">
+                  <wp:extent cx="1126541" cy="1126541"/>
+                  <wp:effectExtent l="0" t="0" r="0" b="0"/>
                   <wp:docPr id="618884352" name="Picture 618884352"/>
                   <wp:cNvGraphicFramePr>
                     <a:graphicFrameLocks xmlns:a="http://schemas.openxmlformats.org/drawingml/2006/main" noChangeAspect="1"/>
@@ -7242,14 +7754,15 @@
                             <a:picLocks noChangeAspect="1" noChangeArrowheads="1"/>
                           </pic:cNvPicPr>
                         </pic:nvPicPr>
-                        <pic:blipFill>
-                          <a:blip r:embed="rId45" cstate="print">
+                        <pic:blipFill rotWithShape="1">
+                          <a:blip r:embed="rId48" cstate="print">
                             <a:extLst>
                               <a:ext uri="{28A0092B-C50C-407E-A947-70E740481C1C}">
                                 <a14:useLocalDpi xmlns:a14="http://schemas.microsoft.com/office/drawing/2010/main" val="0"/>
                               </a:ext>
                             </a:extLst>
                           </a:blip>
+                          <a:srcRect t="2031" b="14635"/>
                           <a:stretch>
                             <a:fillRect/>
                           </a:stretch>
@@ -7257,16 +7770,20 @@
                         <pic:spPr bwMode="auto">
                           <a:xfrm>
                             <a:off x="0" y="0"/>
-                            <a:ext cx="984250" cy="1181100"/>
+                            <a:ext cx="1131360" cy="1131360"/>
                           </a:xfrm>
                           <a:prstGeom prst="ellipse">
                             <a:avLst/>
                           </a:prstGeom>
-                          <a:ln w="190500" cap="rnd">
+                          <a:ln>
                             <a:noFill/>
-                            <a:prstDash val="solid"/>
                           </a:ln>
                           <a:effectLst/>
+                          <a:extLst>
+                            <a:ext uri="{53640926-AAD7-44D8-BBD7-CCE9431645EC}">
+                              <a14:shadowObscured xmlns:a14="http://schemas.microsoft.com/office/drawing/2010/main"/>
+                            </a:ext>
+                          </a:extLst>
                         </pic:spPr>
                       </pic:pic>
                     </a:graphicData>
@@ -7352,9 +7869,9 @@
                 <w:noProof/>
               </w:rPr>
               <w:drawing>
-                <wp:inline distT="0" distB="0" distL="0" distR="0" wp14:anchorId="49A174E9" wp14:editId="72CAB91B">
-                  <wp:extent cx="981542" cy="1181100"/>
-                  <wp:effectExtent l="0" t="0" r="0" b="0"/>
+                <wp:inline distT="0" distB="0" distL="0" distR="0" wp14:anchorId="49A174E9" wp14:editId="7FD849B3">
+                  <wp:extent cx="1097280" cy="1097280"/>
+                  <wp:effectExtent l="0" t="0" r="7620" b="7620"/>
                   <wp:docPr id="803749373" name="Picture 803749373"/>
                   <wp:cNvGraphicFramePr>
                     <a:graphicFrameLocks xmlns:a="http://schemas.openxmlformats.org/drawingml/2006/main" noChangeAspect="1"/>
@@ -7368,14 +7885,15 @@
                             <a:picLocks noChangeAspect="1" noChangeArrowheads="1"/>
                           </pic:cNvPicPr>
                         </pic:nvPicPr>
-                        <pic:blipFill>
-                          <a:blip r:embed="rId46" cstate="print">
+                        <pic:blipFill rotWithShape="1">
+                          <a:blip r:embed="rId49" cstate="print">
                             <a:extLst>
                               <a:ext uri="{28A0092B-C50C-407E-A947-70E740481C1C}">
                                 <a14:useLocalDpi xmlns:a14="http://schemas.microsoft.com/office/drawing/2010/main" val="0"/>
                               </a:ext>
                             </a:extLst>
                           </a:blip>
+                          <a:srcRect l="1251" t="5101" r="4887" b="16895"/>
                           <a:stretch>
                             <a:fillRect/>
                           </a:stretch>
@@ -7383,16 +7901,20 @@
                         <pic:spPr bwMode="auto">
                           <a:xfrm>
                             <a:off x="0" y="0"/>
-                            <a:ext cx="981542" cy="1181100"/>
+                            <a:ext cx="1103953" cy="1103953"/>
                           </a:xfrm>
                           <a:prstGeom prst="ellipse">
                             <a:avLst/>
                           </a:prstGeom>
-                          <a:ln w="190500" cap="rnd">
+                          <a:ln>
                             <a:noFill/>
-                            <a:prstDash val="solid"/>
                           </a:ln>
                           <a:effectLst/>
+                          <a:extLst>
+                            <a:ext uri="{53640926-AAD7-44D8-BBD7-CCE9431645EC}">
+                              <a14:shadowObscured xmlns:a14="http://schemas.microsoft.com/office/drawing/2010/main"/>
+                            </a:ext>
+                          </a:extLst>
                         </pic:spPr>
                       </pic:pic>
                     </a:graphicData>
@@ -7426,7 +7948,7 @@
                 <w:sz w:val="16"/>
                 <w:szCs w:val="16"/>
               </w:rPr>
-              <w:t xml:space="preserve">Manager, Major Projects &amp; Construction</w:t>
+              <w:t>Manager, Major Projects &amp; Construction</w:t>
             </w:r>
           </w:p>
         </w:tc>
@@ -7478,10 +8000,38 @@
                 <w:noProof/>
               </w:rPr>
               <w:drawing>
-                <wp:inline distT="0" distB="0" distL="0" distR="0" wp14:anchorId="49A174EB" wp14:editId="35D34649">
-                  <wp:extent cx="825604" cy="1181100"/>
-                  <wp:effectExtent l="0" t="0" r="0" b="0"/>
-                  <wp:docPr id="707018864" name="Picture 707018864"/>
+                <wp:anchor distT="0" distB="0" distL="114300" distR="114300" simplePos="0" relativeHeight="251668992" behindDoc="1" locked="0" layoutInCell="1" allowOverlap="1" wp14:anchorId="2FDD584F" wp14:editId="44478972">
+                  <wp:simplePos x="0" y="0"/>
+                  <wp:positionH relativeFrom="margin">
+                    <wp:posOffset>305435</wp:posOffset>
+                  </wp:positionH>
+                  <wp:positionV relativeFrom="paragraph">
+                    <wp:posOffset>0</wp:posOffset>
+                  </wp:positionV>
+                  <wp:extent cx="1190625" cy="1190625"/>
+                  <wp:effectExtent l="0" t="0" r="9525" b="9525"/>
+                  <wp:wrapTight wrapText="bothSides">
+                    <wp:wrapPolygon edited="0">
+                      <wp:start x="7603" y="0"/>
+                      <wp:lineTo x="5530" y="691"/>
+                      <wp:lineTo x="346" y="4493"/>
+                      <wp:lineTo x="0" y="8294"/>
+                      <wp:lineTo x="0" y="13478"/>
+                      <wp:lineTo x="691" y="17626"/>
+                      <wp:lineTo x="6221" y="21427"/>
+                      <wp:lineTo x="7603" y="21427"/>
+                      <wp:lineTo x="14170" y="21427"/>
+                      <wp:lineTo x="15206" y="21427"/>
+                      <wp:lineTo x="20736" y="17280"/>
+                      <wp:lineTo x="21427" y="13824"/>
+                      <wp:lineTo x="21427" y="8294"/>
+                      <wp:lineTo x="21082" y="4493"/>
+                      <wp:lineTo x="16243" y="1037"/>
+                      <wp:lineTo x="13824" y="0"/>
+                      <wp:lineTo x="7603" y="0"/>
+                    </wp:wrapPolygon>
+                  </wp:wrapTight>
+                  <wp:docPr id="142853435" name="Picture 1"/>
                   <wp:cNvGraphicFramePr>
                     <a:graphicFrameLocks xmlns:a="http://schemas.openxmlformats.org/drawingml/2006/main" noChangeAspect="1"/>
                   </wp:cNvGraphicFramePr>
@@ -7489,19 +8039,20 @@
                     <a:graphicData uri="http://schemas.openxmlformats.org/drawingml/2006/picture">
                       <pic:pic xmlns:pic="http://schemas.openxmlformats.org/drawingml/2006/picture">
                         <pic:nvPicPr>
-                          <pic:cNvPr id="707018864" name="Picture 707018864"/>
+                          <pic:cNvPr id="0" name="Picture 1"/>
                           <pic:cNvPicPr>
                             <a:picLocks noChangeAspect="1" noChangeArrowheads="1"/>
                           </pic:cNvPicPr>
                         </pic:nvPicPr>
-                        <pic:blipFill>
-                          <a:blip r:embed="rId47" cstate="print">
+                        <pic:blipFill rotWithShape="1">
+                          <a:blip r:embed="rId50" cstate="print">
                             <a:extLst>
                               <a:ext uri="{28A0092B-C50C-407E-A947-70E740481C1C}">
                                 <a14:useLocalDpi xmlns:a14="http://schemas.microsoft.com/office/drawing/2010/main" val="0"/>
                               </a:ext>
                             </a:extLst>
                           </a:blip>
+                          <a:srcRect l="5511" t="2924" r="6823" b="9410"/>
                           <a:stretch>
                             <a:fillRect/>
                           </a:stretch>
@@ -7509,21 +8060,31 @@
                         <pic:spPr bwMode="auto">
                           <a:xfrm>
                             <a:off x="0" y="0"/>
-                            <a:ext cx="825604" cy="1181100"/>
+                            <a:ext cx="1190625" cy="1190625"/>
                           </a:xfrm>
                           <a:prstGeom prst="ellipse">
                             <a:avLst/>
                           </a:prstGeom>
-                          <a:ln w="190500" cap="rnd">
+                          <a:noFill/>
+                          <a:ln>
                             <a:noFill/>
-                            <a:prstDash val="solid"/>
                           </a:ln>
-                          <a:effectLst/>
+                          <a:extLst>
+                            <a:ext uri="{53640926-AAD7-44D8-BBD7-CCE9431645EC}">
+                              <a14:shadowObscured xmlns:a14="http://schemas.microsoft.com/office/drawing/2010/main"/>
+                            </a:ext>
+                          </a:extLst>
                         </pic:spPr>
                       </pic:pic>
                     </a:graphicData>
                   </a:graphic>
-                </wp:inline>
+                  <wp14:sizeRelH relativeFrom="margin">
+                    <wp14:pctWidth>0</wp14:pctWidth>
+                  </wp14:sizeRelH>
+                  <wp14:sizeRelV relativeFrom="margin">
+                    <wp14:pctHeight>0</wp14:pctHeight>
+                  </wp14:sizeRelV>
+                </wp:anchor>
               </w:drawing>
             </w:r>
           </w:p>
@@ -7531,14 +8092,43 @@
             <w:pPr>
               <w:spacing w:after="20"/>
               <w:jc w:val="center"/>
-            </w:pPr>
-            <w:r>
               <w:rPr>
                 <w:rFonts w:ascii="Poppins Medium" w:eastAsia="Poppins Medium" w:hAnsi="Poppins Medium" w:cs="Poppins Medium"/>
                 <w:sz w:val="22"/>
                 <w:szCs w:val="22"/>
               </w:rPr>
-              <w:t>Alycia Wolf</w:t>
+            </w:pPr>
+          </w:p>
+          <w:p>
+            <w:pPr>
+              <w:spacing w:after="20"/>
+              <w:rPr>
+                <w:rFonts w:ascii="Poppins Medium" w:eastAsia="Poppins Medium" w:hAnsi="Poppins Medium" w:cs="Poppins Medium"/>
+                <w:sz w:val="14"/>
+                <w:szCs w:val="14"/>
+              </w:rPr>
+            </w:pPr>
+          </w:p>
+          <w:p>
+            <w:pPr>
+              <w:spacing w:after="20"/>
+              <w:jc w:val="center"/>
+            </w:pPr>
+            <w:r>
+              <w:rPr>
+                <w:rFonts w:ascii="Poppins Medium" w:eastAsia="Poppins Medium" w:hAnsi="Poppins Medium" w:cs="Poppins Medium"/>
+                <w:sz w:val="22"/>
+                <w:szCs w:val="22"/>
+              </w:rPr>
+              <w:t>A</w:t>
+            </w:r>
+            <w:r>
+              <w:rPr>
+                <w:rFonts w:ascii="Poppins Medium" w:eastAsia="Poppins Medium" w:hAnsi="Poppins Medium" w:cs="Poppins Medium"/>
+                <w:sz w:val="22"/>
+                <w:szCs w:val="22"/>
+              </w:rPr>
+              <w:t>lycia Wolf</w:t>
             </w:r>
           </w:p>
           <w:p>
@@ -7846,8 +8436,8 @@
     <w:p>
       <w:pPr>
         <w:sectPr>
-          <w:headerReference w:type="default" r:id="rId48"/>
-          <w:footerReference w:type="default" r:id="rId49"/>
+          <w:headerReference w:type="default" r:id="rId51"/>
+          <w:footerReference w:type="default" r:id="rId52"/>
           <w:pgSz w:w="11906" w:h="16838"/>
           <w:pgMar w:top="1000" w:right="1134" w:bottom="1000" w:left="1418" w:header="500" w:footer="500" w:gutter="0"/>
           <w:cols w:space="720"/>
@@ -7865,7 +8455,80 @@
         </w:rPr>
         <w:lastRenderedPageBreak/>
         <w:drawing>
-          <wp:anchor distT="0" distB="0" distL="0" distR="0" simplePos="0" relativeHeight="251658254" behindDoc="1" locked="0" layoutInCell="1" allowOverlap="1" wp14:anchorId="49A174ED" wp14:editId="49A174EE">
+          <wp:anchor distT="0" distB="0" distL="114300" distR="114300" simplePos="0" relativeHeight="251670016" behindDoc="1" locked="0" layoutInCell="1" allowOverlap="1" wp14:anchorId="49A174EF" wp14:editId="63BC2796">
+            <wp:simplePos x="0" y="0"/>
+            <wp:positionH relativeFrom="margin">
+              <wp:align>left</wp:align>
+            </wp:positionH>
+            <wp:positionV relativeFrom="paragraph">
+              <wp:posOffset>706755</wp:posOffset>
+            </wp:positionV>
+            <wp:extent cx="2190750" cy="447675"/>
+            <wp:effectExtent l="0" t="0" r="0" b="9525"/>
+            <wp:wrapTight wrapText="bothSides">
+              <wp:wrapPolygon edited="0">
+                <wp:start x="10706" y="0"/>
+                <wp:lineTo x="0" y="0"/>
+                <wp:lineTo x="0" y="12868"/>
+                <wp:lineTo x="563" y="20221"/>
+                <wp:lineTo x="1878" y="21140"/>
+                <wp:lineTo x="10143" y="21140"/>
+                <wp:lineTo x="18407" y="21140"/>
+                <wp:lineTo x="18595" y="21140"/>
+                <wp:lineTo x="21037" y="14706"/>
+                <wp:lineTo x="21412" y="10111"/>
+                <wp:lineTo x="21412" y="5515"/>
+                <wp:lineTo x="19910" y="0"/>
+                <wp:lineTo x="10706" y="0"/>
+              </wp:wrapPolygon>
+            </wp:wrapTight>
+            <wp:docPr id="1999967799" name="Picture 1999967799"/>
+            <wp:cNvGraphicFramePr>
+              <a:graphicFrameLocks xmlns:a="http://schemas.openxmlformats.org/drawingml/2006/main" noChangeAspect="1"/>
+            </wp:cNvGraphicFramePr>
+            <a:graphic xmlns:a="http://schemas.openxmlformats.org/drawingml/2006/main">
+              <a:graphicData uri="http://schemas.openxmlformats.org/drawingml/2006/picture">
+                <pic:pic xmlns:pic="http://schemas.openxmlformats.org/drawingml/2006/picture">
+                  <pic:nvPicPr>
+                    <pic:cNvPr id="0" name=""/>
+                    <pic:cNvPicPr>
+                      <a:picLocks noChangeAspect="1" noChangeArrowheads="1"/>
+                    </pic:cNvPicPr>
+                  </pic:nvPicPr>
+                  <pic:blipFill>
+                    <a:blip r:embed="rId53" cstate="print">
+                      <a:extLst>
+                        <a:ext uri="{28A0092B-C50C-407E-A947-70E740481C1C}">
+                          <a14:useLocalDpi xmlns:a14="http://schemas.microsoft.com/office/drawing/2010/main" val="0"/>
+                        </a:ext>
+                      </a:extLst>
+                    </a:blip>
+                    <a:srcRect/>
+                    <a:stretch>
+                      <a:fillRect/>
+                    </a:stretch>
+                  </pic:blipFill>
+                  <pic:spPr bwMode="auto">
+                    <a:xfrm>
+                      <a:off x="0" y="0"/>
+                      <a:ext cx="2190750" cy="447675"/>
+                    </a:xfrm>
+                    <a:prstGeom prst="rect">
+                      <a:avLst/>
+                    </a:prstGeom>
+                  </pic:spPr>
+                </pic:pic>
+              </a:graphicData>
+            </a:graphic>
+          </wp:anchor>
+        </w:drawing>
+      </w:r>
+      <w:r>
+        <w:rPr>
+          <w:noProof/>
+        </w:rPr>
+        <w:drawing>
+          <wp:anchor distT="0" distB="0" distL="0" distR="0" simplePos="0" relativeHeight="251663872" behindDoc="1" locked="0" layoutInCell="1" allowOverlap="1" wp14:anchorId="49A174ED" wp14:editId="0C30DAC2">
             <wp:simplePos x="0" y="0"/>
             <wp:positionH relativeFrom="page">
               <wp:posOffset>0</wp:posOffset>
@@ -7890,7 +8553,7 @@
                     </pic:cNvPicPr>
                   </pic:nvPicPr>
                   <pic:blipFill>
-                    <a:blip r:embed="rId50"/>
+                    <a:blip r:embed="rId54"/>
                     <a:srcRect/>
                     <a:stretch>
                       <a:fillRect/>
@@ -7910,44 +8573,6 @@
             </a:graphic>
           </wp:anchor>
         </w:drawing>
-        <w:drawing>
-          <wp:inline distT="0" distB="0" distL="0" distR="0" wp14:anchorId="49A174EF" wp14:editId="49A174F0">
-            <wp:extent cx="2190750" cy="447675"/>
-            <wp:effectExtent l="0" t="0" r="0" b="0"/>
-            <wp:docPr id="1999967799" name="Picture 1999967799"/>
-            <wp:cNvGraphicFramePr>
-              <a:graphicFrameLocks xmlns:a="http://schemas.openxmlformats.org/drawingml/2006/main" noChangeAspect="1"/>
-            </wp:cNvGraphicFramePr>
-            <a:graphic xmlns:a="http://schemas.openxmlformats.org/drawingml/2006/main">
-              <a:graphicData uri="http://schemas.openxmlformats.org/drawingml/2006/picture">
-                <pic:pic xmlns:pic="http://schemas.openxmlformats.org/drawingml/2006/picture">
-                  <pic:nvPicPr>
-                    <pic:cNvPr id="0" name=""/>
-                    <pic:cNvPicPr>
-                      <a:picLocks noChangeAspect="1" noChangeArrowheads="1"/>
-                    </pic:cNvPicPr>
-                  </pic:nvPicPr>
-                  <pic:blipFill>
-                    <a:blip r:embed="rId11"/>
-                    <a:srcRect/>
-                    <a:stretch>
-                      <a:fillRect/>
-                    </a:stretch>
-                  </pic:blipFill>
-                  <pic:spPr bwMode="auto">
-                    <a:xfrm>
-                      <a:off x="0" y="0"/>
-                      <a:ext cx="2190750" cy="447675"/>
-                    </a:xfrm>
-                    <a:prstGeom prst="rect">
-                      <a:avLst/>
-                    </a:prstGeom>
-                  </pic:spPr>
-                </pic:pic>
-              </a:graphicData>
-            </a:graphic>
-          </wp:inline>
-        </w:drawing>
       </w:r>
     </w:p>
     <w:p>
@@ -7988,7 +8613,7 @@
           <w:sz w:val="80"/>
           <w:szCs w:val="80"/>
         </w:rPr>
-        <w:t xml:space="preserve">your next pursuit</w:t>
+        <w:t>your next pursuit</w:t>
       </w:r>
     </w:p>
     <w:p>
@@ -8002,7 +8627,7 @@
           <w:sz w:val="22"/>
           <w:szCs w:val="22"/>
         </w:rPr>
-        <w:t xml:space="preserve">We would welcome the chance to meet with you, introduce you to our team and explore how we can support UGL’s upcoming pursuits, from early positioning through to the interactives that matter most.</w:t>
+        <w:t>We would welcome the chance to meet with you, introduce you to our team and explore how we can support UGL’s upcoming pursuits, from early positioning through to the interactives that matter most.</w:t>
       </w:r>
     </w:p>
     <w:p>
@@ -8034,8 +8659,8 @@
       </w:r>
     </w:p>
     <w:sectPr>
-      <w:headerReference w:type="default" r:id="rId51"/>
-      <w:footerReference w:type="default" r:id="rId52"/>
+      <w:headerReference w:type="default" r:id="rId55"/>
+      <w:footerReference w:type="default" r:id="rId56"/>
       <w:pgSz w:w="11906" w:h="16838"/>
       <w:pgMar w:top="900" w:right="1134" w:bottom="1000" w:left="1418" w:header="500" w:footer="500" w:gutter="0"/>
       <w:cols w:space="720"/>
@@ -8046,7 +8671,7 @@
 </file>
 
 <file path=word/endnotes.xml><?xml version="1.0" encoding="utf-8"?>
-<w:endnotes xmlns:wpc="http://schemas.microsoft.com/office/word/2010/wordprocessingCanvas" xmlns:cx="http://schemas.microsoft.com/office/drawing/2014/chartex" xmlns:cx1="http://schemas.microsoft.com/office/drawing/2015/9/8/chartex" xmlns:cx2="http://schemas.microsoft.com/office/drawing/2015/10/21/chartex" xmlns:cx3="http://schemas.microsoft.com/office/drawing/2016/5/9/chartex" xmlns:cx4="http://schemas.microsoft.com/office/drawing/2016/5/10/chartex" xmlns:cx5="http://schemas.microsoft.com/office/drawing/2016/5/11/chartex" xmlns:cx6="http://schemas.microsoft.com/office/drawing/2016/5/12/chartex" xmlns:cx7="http://schemas.microsoft.com/office/drawing/2016/5/13/chartex" xmlns:cx8="http://schemas.microsoft.com/office/drawing/2016/5/14/chartex" xmlns:mc="http://schemas.openxmlformats.org/markup-compatibility/2006" xmlns:m="http://schemas.openxmlformats.org/officeDocument/2006/math" xmlns:aink="http://schemas.microsoft.com/office/drawing/2016/ink" xmlns:am3d="http://schemas.microsoft.com/office/drawing/2017/model3d" xmlns:oel="http://schemas.microsoft.com/office/2019/extlst" xmlns:r="http://schemas.openxmlformats.org/officeDocument/2006/relationships" xmlns:wp14="http://schemas.microsoft.com/office/word/2010/wordprocessingDrawing" xmlns:wp="http://schemas.openxmlformats.org/drawingml/2006/wordprocessingDrawing" xmlns:wpg="http://schemas.microsoft.com/office/word/2010/wordprocessingGroup" xmlns:wpi="http://schemas.microsoft.com/office/word/2010/wordprocessingInk" xmlns:wps="http://schemas.microsoft.com/office/word/2010/wordprocessingShape" xmlns:o="urn:schemas-microsoft-com:office:office" xmlns:v="urn:schemas-microsoft-com:vml" xmlns:w10="urn:schemas-microsoft-com:office:word" xmlns:w="http://schemas.openxmlformats.org/wordprocessingml/2006/main" xmlns:w14="http://schemas.microsoft.com/office/word/2010/wordml" xmlns:w15="http://schemas.microsoft.com/office/word/2012/wordml" xmlns:w16cex="http://schemas.microsoft.com/office/word/2018/wordml/cex" xmlns:w16cid="http://schemas.microsoft.com/office/word/2016/wordml/cid" xmlns:w16="http://schemas.microsoft.com/office/word/2018/wordml" xmlns:w16sdtdh="http://schemas.microsoft.com/office/word/2020/wordml/sdtdatahash" xmlns:w16sdtfl="http://schemas.microsoft.com/office/word/2024/wordml/sdtformatlock" xmlns:w16se="http://schemas.microsoft.com/office/word/2015/wordml/symex" xmlns:w16du="http://schemas.microsoft.com/office/word/2023/wordml/word16du" xmlns:wne="http://schemas.microsoft.com/office/word/2006/wordml" mc:Ignorable="w14 w15 w16se w16cid w16 w16cex w16sdtdh w16sdtfl w16du wp14">
+<w:endnotes xmlns:wpc="http://schemas.microsoft.com/office/word/2010/wordprocessingCanvas" xmlns:cx="http://schemas.microsoft.com/office/drawing/2014/chartex" xmlns:cx1="http://schemas.microsoft.com/office/drawing/2015/9/8/chartex" xmlns:cx2="http://schemas.microsoft.com/office/drawing/2015/10/21/chartex" xmlns:cx3="http://schemas.microsoft.com/office/drawing/2016/5/9/chartex" xmlns:cx4="http://schemas.microsoft.com/office/drawing/2016/5/10/chartex" xmlns:cx5="http://schemas.microsoft.com/office/drawing/2016/5/11/chartex" xmlns:cx6="http://schemas.microsoft.com/office/drawing/2016/5/12/chartex" xmlns:cx7="http://schemas.microsoft.com/office/drawing/2016/5/13/chartex" xmlns:cx8="http://schemas.microsoft.com/office/drawing/2016/5/14/chartex" xmlns:mc="http://schemas.openxmlformats.org/markup-compatibility/2006" xmlns:aink="http://schemas.microsoft.com/office/drawing/2016/ink" xmlns:am3d="http://schemas.microsoft.com/office/drawing/2017/model3d" xmlns:o="urn:schemas-microsoft-com:office:office" xmlns:oel="http://schemas.microsoft.com/office/2019/extlst" xmlns:r="http://schemas.openxmlformats.org/officeDocument/2006/relationships" xmlns:m="http://schemas.openxmlformats.org/officeDocument/2006/math" xmlns:v="urn:schemas-microsoft-com:vml" xmlns:wp14="http://schemas.microsoft.com/office/word/2010/wordprocessingDrawing" xmlns:wp="http://schemas.openxmlformats.org/drawingml/2006/wordprocessingDrawing" xmlns:w10="urn:schemas-microsoft-com:office:word" xmlns:w="http://schemas.openxmlformats.org/wordprocessingml/2006/main" xmlns:w14="http://schemas.microsoft.com/office/word/2010/wordml" xmlns:w15="http://schemas.microsoft.com/office/word/2012/wordml" xmlns:w16cex="http://schemas.microsoft.com/office/word/2018/wordml/cex" xmlns:w16cid="http://schemas.microsoft.com/office/word/2016/wordml/cid" xmlns:w16="http://schemas.microsoft.com/office/word/2018/wordml" xmlns:w16du="http://schemas.microsoft.com/office/word/2023/wordml/word16du" xmlns:w16sdtdh="http://schemas.microsoft.com/office/word/2020/wordml/sdtdatahash" xmlns:w16sdtfl="http://schemas.microsoft.com/office/word/2024/wordml/sdtformatlock" xmlns:w16se="http://schemas.microsoft.com/office/word/2015/wordml/symex" xmlns:wpg="http://schemas.microsoft.com/office/word/2010/wordprocessingGroup" xmlns:wpi="http://schemas.microsoft.com/office/word/2010/wordprocessingInk" xmlns:wne="http://schemas.microsoft.com/office/word/2006/wordml" xmlns:wps="http://schemas.microsoft.com/office/word/2010/wordprocessingShape" mc:Ignorable="w14 w15 w16se w16cid w16 w16cex w16sdtdh w16sdtfl w16du wp14">
   <w:endnote w:type="separator" w:id="-1">
     <w:p>
       <w:r>
@@ -8065,7 +8690,7 @@
 </file>
 
 <file path=word/footer1.xml><?xml version="1.0" encoding="utf-8"?>
-<w:ftr xmlns:wpc="http://schemas.microsoft.com/office/word/2010/wordprocessingCanvas" xmlns:cx="http://schemas.microsoft.com/office/drawing/2014/chartex" xmlns:cx1="http://schemas.microsoft.com/office/drawing/2015/9/8/chartex" xmlns:cx2="http://schemas.microsoft.com/office/drawing/2015/10/21/chartex" xmlns:cx3="http://schemas.microsoft.com/office/drawing/2016/5/9/chartex" xmlns:cx4="http://schemas.microsoft.com/office/drawing/2016/5/10/chartex" xmlns:cx5="http://schemas.microsoft.com/office/drawing/2016/5/11/chartex" xmlns:cx6="http://schemas.microsoft.com/office/drawing/2016/5/12/chartex" xmlns:cx7="http://schemas.microsoft.com/office/drawing/2016/5/13/chartex" xmlns:cx8="http://schemas.microsoft.com/office/drawing/2016/5/14/chartex" xmlns:mc="http://schemas.openxmlformats.org/markup-compatibility/2006" xmlns:m="http://schemas.openxmlformats.org/officeDocument/2006/math" xmlns:aink="http://schemas.microsoft.com/office/drawing/2016/ink" xmlns:am3d="http://schemas.microsoft.com/office/drawing/2017/model3d" xmlns:oel="http://schemas.microsoft.com/office/2019/extlst" xmlns:r="http://schemas.openxmlformats.org/officeDocument/2006/relationships" xmlns:wp14="http://schemas.microsoft.com/office/word/2010/wordprocessingDrawing" xmlns:wp="http://schemas.openxmlformats.org/drawingml/2006/wordprocessingDrawing" xmlns:wpg="http://schemas.microsoft.com/office/word/2010/wordprocessingGroup" xmlns:wpi="http://schemas.microsoft.com/office/word/2010/wordprocessingInk" xmlns:wps="http://schemas.microsoft.com/office/word/2010/wordprocessingShape" xmlns:o="urn:schemas-microsoft-com:office:office" xmlns:v="urn:schemas-microsoft-com:vml" xmlns:w10="urn:schemas-microsoft-com:office:word" xmlns:w="http://schemas.openxmlformats.org/wordprocessingml/2006/main" xmlns:w14="http://schemas.microsoft.com/office/word/2010/wordml" xmlns:w15="http://schemas.microsoft.com/office/word/2012/wordml" xmlns:w16cex="http://schemas.microsoft.com/office/word/2018/wordml/cex" xmlns:w16cid="http://schemas.microsoft.com/office/word/2016/wordml/cid" xmlns:w16="http://schemas.microsoft.com/office/word/2018/wordml" xmlns:w16sdtdh="http://schemas.microsoft.com/office/word/2020/wordml/sdtdatahash" xmlns:w16sdtfl="http://schemas.microsoft.com/office/word/2024/wordml/sdtformatlock" xmlns:w16se="http://schemas.microsoft.com/office/word/2015/wordml/symex" xmlns:w16du="http://schemas.microsoft.com/office/word/2023/wordml/word16du" xmlns:wne="http://schemas.microsoft.com/office/word/2006/wordml" mc:Ignorable="w14 w15 w16se w16cid w16 w16cex w16sdtdh w16sdtfl w16du wp14">
+<w:ftr xmlns:wpc="http://schemas.microsoft.com/office/word/2010/wordprocessingCanvas" xmlns:cx="http://schemas.microsoft.com/office/drawing/2014/chartex" xmlns:cx1="http://schemas.microsoft.com/office/drawing/2015/9/8/chartex" xmlns:cx2="http://schemas.microsoft.com/office/drawing/2015/10/21/chartex" xmlns:cx3="http://schemas.microsoft.com/office/drawing/2016/5/9/chartex" xmlns:cx4="http://schemas.microsoft.com/office/drawing/2016/5/10/chartex" xmlns:cx5="http://schemas.microsoft.com/office/drawing/2016/5/11/chartex" xmlns:cx6="http://schemas.microsoft.com/office/drawing/2016/5/12/chartex" xmlns:cx7="http://schemas.microsoft.com/office/drawing/2016/5/13/chartex" xmlns:cx8="http://schemas.microsoft.com/office/drawing/2016/5/14/chartex" xmlns:mc="http://schemas.openxmlformats.org/markup-compatibility/2006" xmlns:aink="http://schemas.microsoft.com/office/drawing/2016/ink" xmlns:am3d="http://schemas.microsoft.com/office/drawing/2017/model3d" xmlns:o="urn:schemas-microsoft-com:office:office" xmlns:oel="http://schemas.microsoft.com/office/2019/extlst" xmlns:r="http://schemas.openxmlformats.org/officeDocument/2006/relationships" xmlns:m="http://schemas.openxmlformats.org/officeDocument/2006/math" xmlns:v="urn:schemas-microsoft-com:vml" xmlns:wp14="http://schemas.microsoft.com/office/word/2010/wordprocessingDrawing" xmlns:wp="http://schemas.openxmlformats.org/drawingml/2006/wordprocessingDrawing" xmlns:w10="urn:schemas-microsoft-com:office:word" xmlns:w="http://schemas.openxmlformats.org/wordprocessingml/2006/main" xmlns:w14="http://schemas.microsoft.com/office/word/2010/wordml" xmlns:w15="http://schemas.microsoft.com/office/word/2012/wordml" xmlns:w16cex="http://schemas.microsoft.com/office/word/2018/wordml/cex" xmlns:w16cid="http://schemas.microsoft.com/office/word/2016/wordml/cid" xmlns:w16="http://schemas.microsoft.com/office/word/2018/wordml" xmlns:w16du="http://schemas.microsoft.com/office/word/2023/wordml/word16du" xmlns:w16sdtdh="http://schemas.microsoft.com/office/word/2020/wordml/sdtdatahash" xmlns:w16sdtfl="http://schemas.microsoft.com/office/word/2024/wordml/sdtformatlock" xmlns:w16se="http://schemas.microsoft.com/office/word/2015/wordml/symex" xmlns:wpg="http://schemas.microsoft.com/office/word/2010/wordprocessingGroup" xmlns:wpi="http://schemas.microsoft.com/office/word/2010/wordprocessingInk" xmlns:wne="http://schemas.microsoft.com/office/word/2006/wordml" xmlns:wps="http://schemas.microsoft.com/office/word/2010/wordprocessingShape" mc:Ignorable="w14 w15 w16se w16cid w16 w16cex w16sdtdh w16sdtfl w16du wp14">
   <w:p>
     <w:pPr>
       <w:pStyle w:val="Footer"/>
@@ -8075,13 +8700,13 @@
 </file>
 
 <file path=word/footer2.xml><?xml version="1.0" encoding="utf-8"?>
-<w:ftr xmlns:wpc="http://schemas.microsoft.com/office/word/2010/wordprocessingCanvas" xmlns:cx="http://schemas.microsoft.com/office/drawing/2014/chartex" xmlns:cx1="http://schemas.microsoft.com/office/drawing/2015/9/8/chartex" xmlns:cx2="http://schemas.microsoft.com/office/drawing/2015/10/21/chartex" xmlns:cx3="http://schemas.microsoft.com/office/drawing/2016/5/9/chartex" xmlns:cx4="http://schemas.microsoft.com/office/drawing/2016/5/10/chartex" xmlns:cx5="http://schemas.microsoft.com/office/drawing/2016/5/11/chartex" xmlns:cx6="http://schemas.microsoft.com/office/drawing/2016/5/12/chartex" xmlns:cx7="http://schemas.microsoft.com/office/drawing/2016/5/13/chartex" xmlns:cx8="http://schemas.microsoft.com/office/drawing/2016/5/14/chartex" xmlns:mc="http://schemas.openxmlformats.org/markup-compatibility/2006" xmlns:m="http://schemas.openxmlformats.org/officeDocument/2006/math" xmlns:aink="http://schemas.microsoft.com/office/drawing/2016/ink" xmlns:am3d="http://schemas.microsoft.com/office/drawing/2017/model3d" xmlns:oel="http://schemas.microsoft.com/office/2019/extlst" xmlns:r="http://schemas.openxmlformats.org/officeDocument/2006/relationships" xmlns:wp14="http://schemas.microsoft.com/office/word/2010/wordprocessingDrawing" xmlns:wp="http://schemas.openxmlformats.org/drawingml/2006/wordprocessingDrawing" xmlns:wpg="http://schemas.microsoft.com/office/word/2010/wordprocessingGroup" xmlns:wpi="http://schemas.microsoft.com/office/word/2010/wordprocessingInk" xmlns:wps="http://schemas.microsoft.com/office/word/2010/wordprocessingShape" xmlns:o="urn:schemas-microsoft-com:office:office" xmlns:v="urn:schemas-microsoft-com:vml" xmlns:w10="urn:schemas-microsoft-com:office:word" xmlns:w="http://schemas.openxmlformats.org/wordprocessingml/2006/main" xmlns:w14="http://schemas.microsoft.com/office/word/2010/wordml" xmlns:w15="http://schemas.microsoft.com/office/word/2012/wordml" xmlns:w16cex="http://schemas.microsoft.com/office/word/2018/wordml/cex" xmlns:w16cid="http://schemas.microsoft.com/office/word/2016/wordml/cid" xmlns:w16="http://schemas.microsoft.com/office/word/2018/wordml" xmlns:w16sdtdh="http://schemas.microsoft.com/office/word/2020/wordml/sdtdatahash" xmlns:w16sdtfl="http://schemas.microsoft.com/office/word/2024/wordml/sdtformatlock" xmlns:w16se="http://schemas.microsoft.com/office/word/2015/wordml/symex" xmlns:w16du="http://schemas.microsoft.com/office/word/2023/wordml/word16du" xmlns:wne="http://schemas.microsoft.com/office/word/2006/wordml" mc:Ignorable="w14 w15 w16se w16cid w16 w16cex w16sdtdh w16sdtfl w16du wp14">
+<w:ftr xmlns:wpc="http://schemas.microsoft.com/office/word/2010/wordprocessingCanvas" xmlns:cx="http://schemas.microsoft.com/office/drawing/2014/chartex" xmlns:cx1="http://schemas.microsoft.com/office/drawing/2015/9/8/chartex" xmlns:cx2="http://schemas.microsoft.com/office/drawing/2015/10/21/chartex" xmlns:cx3="http://schemas.microsoft.com/office/drawing/2016/5/9/chartex" xmlns:cx4="http://schemas.microsoft.com/office/drawing/2016/5/10/chartex" xmlns:cx5="http://schemas.microsoft.com/office/drawing/2016/5/11/chartex" xmlns:cx6="http://schemas.microsoft.com/office/drawing/2016/5/12/chartex" xmlns:cx7="http://schemas.microsoft.com/office/drawing/2016/5/13/chartex" xmlns:cx8="http://schemas.microsoft.com/office/drawing/2016/5/14/chartex" xmlns:mc="http://schemas.openxmlformats.org/markup-compatibility/2006" xmlns:aink="http://schemas.microsoft.com/office/drawing/2016/ink" xmlns:am3d="http://schemas.microsoft.com/office/drawing/2017/model3d" xmlns:o="urn:schemas-microsoft-com:office:office" xmlns:oel="http://schemas.microsoft.com/office/2019/extlst" xmlns:r="http://schemas.openxmlformats.org/officeDocument/2006/relationships" xmlns:m="http://schemas.openxmlformats.org/officeDocument/2006/math" xmlns:v="urn:schemas-microsoft-com:vml" xmlns:wp14="http://schemas.microsoft.com/office/word/2010/wordprocessingDrawing" xmlns:wp="http://schemas.openxmlformats.org/drawingml/2006/wordprocessingDrawing" xmlns:w10="urn:schemas-microsoft-com:office:word" xmlns:w="http://schemas.openxmlformats.org/wordprocessingml/2006/main" xmlns:w14="http://schemas.microsoft.com/office/word/2010/wordml" xmlns:w15="http://schemas.microsoft.com/office/word/2012/wordml" xmlns:w16cex="http://schemas.microsoft.com/office/word/2018/wordml/cex" xmlns:w16cid="http://schemas.microsoft.com/office/word/2016/wordml/cid" xmlns:w16="http://schemas.microsoft.com/office/word/2018/wordml" xmlns:w16du="http://schemas.microsoft.com/office/word/2023/wordml/word16du" xmlns:w16sdtdh="http://schemas.microsoft.com/office/word/2020/wordml/sdtdatahash" xmlns:w16sdtfl="http://schemas.microsoft.com/office/word/2024/wordml/sdtformatlock" xmlns:w16se="http://schemas.microsoft.com/office/word/2015/wordml/symex" xmlns:wpg="http://schemas.microsoft.com/office/word/2010/wordprocessingGroup" xmlns:wpi="http://schemas.microsoft.com/office/word/2010/wordprocessingInk" xmlns:wne="http://schemas.microsoft.com/office/word/2006/wordml" xmlns:wps="http://schemas.microsoft.com/office/word/2010/wordprocessingShape" mc:Ignorable="w14 w15 w16se w16cid w16 w16cex w16sdtdh w16sdtfl w16du wp14">
   <w:p/>
 </w:ftr>
 </file>
 
 <file path=word/footer3.xml><?xml version="1.0" encoding="utf-8"?>
-<w:ftr xmlns:wpc="http://schemas.microsoft.com/office/word/2010/wordprocessingCanvas" xmlns:cx="http://schemas.microsoft.com/office/drawing/2014/chartex" xmlns:cx1="http://schemas.microsoft.com/office/drawing/2015/9/8/chartex" xmlns:cx2="http://schemas.microsoft.com/office/drawing/2015/10/21/chartex" xmlns:cx3="http://schemas.microsoft.com/office/drawing/2016/5/9/chartex" xmlns:cx4="http://schemas.microsoft.com/office/drawing/2016/5/10/chartex" xmlns:cx5="http://schemas.microsoft.com/office/drawing/2016/5/11/chartex" xmlns:cx6="http://schemas.microsoft.com/office/drawing/2016/5/12/chartex" xmlns:cx7="http://schemas.microsoft.com/office/drawing/2016/5/13/chartex" xmlns:cx8="http://schemas.microsoft.com/office/drawing/2016/5/14/chartex" xmlns:mc="http://schemas.openxmlformats.org/markup-compatibility/2006" xmlns:m="http://schemas.openxmlformats.org/officeDocument/2006/math" xmlns:aink="http://schemas.microsoft.com/office/drawing/2016/ink" xmlns:am3d="http://schemas.microsoft.com/office/drawing/2017/model3d" xmlns:oel="http://schemas.microsoft.com/office/2019/extlst" xmlns:r="http://schemas.openxmlformats.org/officeDocument/2006/relationships" xmlns:wp14="http://schemas.microsoft.com/office/word/2010/wordprocessingDrawing" xmlns:wp="http://schemas.openxmlformats.org/drawingml/2006/wordprocessingDrawing" xmlns:wpg="http://schemas.microsoft.com/office/word/2010/wordprocessingGroup" xmlns:wpi="http://schemas.microsoft.com/office/word/2010/wordprocessingInk" xmlns:wps="http://schemas.microsoft.com/office/word/2010/wordprocessingShape" xmlns:o="urn:schemas-microsoft-com:office:office" xmlns:v="urn:schemas-microsoft-com:vml" xmlns:w10="urn:schemas-microsoft-com:office:word" xmlns:w="http://schemas.openxmlformats.org/wordprocessingml/2006/main" xmlns:w14="http://schemas.microsoft.com/office/word/2010/wordml" xmlns:w15="http://schemas.microsoft.com/office/word/2012/wordml" xmlns:w16cex="http://schemas.microsoft.com/office/word/2018/wordml/cex" xmlns:w16cid="http://schemas.microsoft.com/office/word/2016/wordml/cid" xmlns:w16="http://schemas.microsoft.com/office/word/2018/wordml" xmlns:w16sdtdh="http://schemas.microsoft.com/office/word/2020/wordml/sdtdatahash" xmlns:w16sdtfl="http://schemas.microsoft.com/office/word/2024/wordml/sdtformatlock" xmlns:w16se="http://schemas.microsoft.com/office/word/2015/wordml/symex" xmlns:w16du="http://schemas.microsoft.com/office/word/2023/wordml/word16du" xmlns:wne="http://schemas.microsoft.com/office/word/2006/wordml" mc:Ignorable="w14 w15 w16se w16cid w16 w16cex w16sdtdh w16sdtfl w16du wp14">
+<w:ftr xmlns:wpc="http://schemas.microsoft.com/office/word/2010/wordprocessingCanvas" xmlns:cx="http://schemas.microsoft.com/office/drawing/2014/chartex" xmlns:cx1="http://schemas.microsoft.com/office/drawing/2015/9/8/chartex" xmlns:cx2="http://schemas.microsoft.com/office/drawing/2015/10/21/chartex" xmlns:cx3="http://schemas.microsoft.com/office/drawing/2016/5/9/chartex" xmlns:cx4="http://schemas.microsoft.com/office/drawing/2016/5/10/chartex" xmlns:cx5="http://schemas.microsoft.com/office/drawing/2016/5/11/chartex" xmlns:cx6="http://schemas.microsoft.com/office/drawing/2016/5/12/chartex" xmlns:cx7="http://schemas.microsoft.com/office/drawing/2016/5/13/chartex" xmlns:cx8="http://schemas.microsoft.com/office/drawing/2016/5/14/chartex" xmlns:mc="http://schemas.openxmlformats.org/markup-compatibility/2006" xmlns:aink="http://schemas.microsoft.com/office/drawing/2016/ink" xmlns:am3d="http://schemas.microsoft.com/office/drawing/2017/model3d" xmlns:o="urn:schemas-microsoft-com:office:office" xmlns:oel="http://schemas.microsoft.com/office/2019/extlst" xmlns:r="http://schemas.openxmlformats.org/officeDocument/2006/relationships" xmlns:m="http://schemas.openxmlformats.org/officeDocument/2006/math" xmlns:v="urn:schemas-microsoft-com:vml" xmlns:wp14="http://schemas.microsoft.com/office/word/2010/wordprocessingDrawing" xmlns:wp="http://schemas.openxmlformats.org/drawingml/2006/wordprocessingDrawing" xmlns:w10="urn:schemas-microsoft-com:office:word" xmlns:w="http://schemas.openxmlformats.org/wordprocessingml/2006/main" xmlns:w14="http://schemas.microsoft.com/office/word/2010/wordml" xmlns:w15="http://schemas.microsoft.com/office/word/2012/wordml" xmlns:w16cex="http://schemas.microsoft.com/office/word/2018/wordml/cex" xmlns:w16cid="http://schemas.microsoft.com/office/word/2016/wordml/cid" xmlns:w16="http://schemas.microsoft.com/office/word/2018/wordml" xmlns:w16du="http://schemas.microsoft.com/office/word/2023/wordml/word16du" xmlns:w16sdtdh="http://schemas.microsoft.com/office/word/2020/wordml/sdtdatahash" xmlns:w16sdtfl="http://schemas.microsoft.com/office/word/2024/wordml/sdtformatlock" xmlns:w16se="http://schemas.microsoft.com/office/word/2015/wordml/symex" xmlns:wpg="http://schemas.microsoft.com/office/word/2010/wordprocessingGroup" xmlns:wpi="http://schemas.microsoft.com/office/word/2010/wordprocessingInk" xmlns:wne="http://schemas.microsoft.com/office/word/2006/wordml" xmlns:wps="http://schemas.microsoft.com/office/word/2010/wordprocessingShape" mc:Ignorable="w14 w15 w16se w16cid w16 w16cex w16sdtdh w16sdtfl w16du wp14">
   <w:p>
     <w:pPr>
       <w:pStyle w:val="Footer"/>
@@ -8091,13 +8716,19 @@
 </file>
 
 <file path=word/footer4.xml><?xml version="1.0" encoding="utf-8"?>
-<w:ftr xmlns:wpc="http://schemas.microsoft.com/office/word/2010/wordprocessingCanvas" xmlns:cx="http://schemas.microsoft.com/office/drawing/2014/chartex" xmlns:cx1="http://schemas.microsoft.com/office/drawing/2015/9/8/chartex" xmlns:cx2="http://schemas.microsoft.com/office/drawing/2015/10/21/chartex" xmlns:cx3="http://schemas.microsoft.com/office/drawing/2016/5/9/chartex" xmlns:cx4="http://schemas.microsoft.com/office/drawing/2016/5/10/chartex" xmlns:cx5="http://schemas.microsoft.com/office/drawing/2016/5/11/chartex" xmlns:cx6="http://schemas.microsoft.com/office/drawing/2016/5/12/chartex" xmlns:cx7="http://schemas.microsoft.com/office/drawing/2016/5/13/chartex" xmlns:cx8="http://schemas.microsoft.com/office/drawing/2016/5/14/chartex" xmlns:mc="http://schemas.openxmlformats.org/markup-compatibility/2006" xmlns:m="http://schemas.openxmlformats.org/officeDocument/2006/math" xmlns:aink="http://schemas.microsoft.com/office/drawing/2016/ink" xmlns:am3d="http://schemas.microsoft.com/office/drawing/2017/model3d" xmlns:oel="http://schemas.microsoft.com/office/2019/extlst" xmlns:r="http://schemas.openxmlformats.org/officeDocument/2006/relationships" xmlns:wp14="http://schemas.microsoft.com/office/word/2010/wordprocessingDrawing" xmlns:wp="http://schemas.openxmlformats.org/drawingml/2006/wordprocessingDrawing" xmlns:wpg="http://schemas.microsoft.com/office/word/2010/wordprocessingGroup" xmlns:wpi="http://schemas.microsoft.com/office/word/2010/wordprocessingInk" xmlns:wps="http://schemas.microsoft.com/office/word/2010/wordprocessingShape" xmlns:o="urn:schemas-microsoft-com:office:office" xmlns:v="urn:schemas-microsoft-com:vml" xmlns:w10="urn:schemas-microsoft-com:office:word" xmlns:w="http://schemas.openxmlformats.org/wordprocessingml/2006/main" xmlns:w14="http://schemas.microsoft.com/office/word/2010/wordml" xmlns:w15="http://schemas.microsoft.com/office/word/2012/wordml" xmlns:w16cex="http://schemas.microsoft.com/office/word/2018/wordml/cex" xmlns:w16cid="http://schemas.microsoft.com/office/word/2016/wordml/cid" xmlns:w16="http://schemas.microsoft.com/office/word/2018/wordml" xmlns:w16sdtdh="http://schemas.microsoft.com/office/word/2020/wordml/sdtdatahash" xmlns:w16sdtfl="http://schemas.microsoft.com/office/word/2024/wordml/sdtformatlock" xmlns:w16se="http://schemas.microsoft.com/office/word/2015/wordml/symex" xmlns:w16du="http://schemas.microsoft.com/office/word/2023/wordml/word16du" xmlns:wne="http://schemas.microsoft.com/office/word/2006/wordml" mc:Ignorable="w14 w15 w16se w16cid w16 w16cex w16sdtdh w16sdtfl w16du wp14">
+<w:ftr xmlns:wpc="http://schemas.microsoft.com/office/word/2010/wordprocessingCanvas" xmlns:cx="http://schemas.microsoft.com/office/drawing/2014/chartex" xmlns:cx1="http://schemas.microsoft.com/office/drawing/2015/9/8/chartex" xmlns:cx2="http://schemas.microsoft.com/office/drawing/2015/10/21/chartex" xmlns:cx3="http://schemas.microsoft.com/office/drawing/2016/5/9/chartex" xmlns:cx4="http://schemas.microsoft.com/office/drawing/2016/5/10/chartex" xmlns:cx5="http://schemas.microsoft.com/office/drawing/2016/5/11/chartex" xmlns:cx6="http://schemas.microsoft.com/office/drawing/2016/5/12/chartex" xmlns:cx7="http://schemas.microsoft.com/office/drawing/2016/5/13/chartex" xmlns:cx8="http://schemas.microsoft.com/office/drawing/2016/5/14/chartex" xmlns:mc="http://schemas.openxmlformats.org/markup-compatibility/2006" xmlns:aink="http://schemas.microsoft.com/office/drawing/2016/ink" xmlns:am3d="http://schemas.microsoft.com/office/drawing/2017/model3d" xmlns:o="urn:schemas-microsoft-com:office:office" xmlns:oel="http://schemas.microsoft.com/office/2019/extlst" xmlns:r="http://schemas.openxmlformats.org/officeDocument/2006/relationships" xmlns:m="http://schemas.openxmlformats.org/officeDocument/2006/math" xmlns:v="urn:schemas-microsoft-com:vml" xmlns:wp14="http://schemas.microsoft.com/office/word/2010/wordprocessingDrawing" xmlns:wp="http://schemas.openxmlformats.org/drawingml/2006/wordprocessingDrawing" xmlns:w10="urn:schemas-microsoft-com:office:word" xmlns:w="http://schemas.openxmlformats.org/wordprocessingml/2006/main" xmlns:w14="http://schemas.microsoft.com/office/word/2010/wordml" xmlns:w15="http://schemas.microsoft.com/office/word/2012/wordml" xmlns:w16cex="http://schemas.microsoft.com/office/word/2018/wordml/cex" xmlns:w16cid="http://schemas.microsoft.com/office/word/2016/wordml/cid" xmlns:w16="http://schemas.microsoft.com/office/word/2018/wordml" xmlns:w16du="http://schemas.microsoft.com/office/word/2023/wordml/word16du" xmlns:w16sdtdh="http://schemas.microsoft.com/office/word/2020/wordml/sdtdatahash" xmlns:w16sdtfl="http://schemas.microsoft.com/office/word/2024/wordml/sdtformatlock" xmlns:w16se="http://schemas.microsoft.com/office/word/2015/wordml/symex" xmlns:wpg="http://schemas.microsoft.com/office/word/2010/wordprocessingGroup" xmlns:wpi="http://schemas.microsoft.com/office/word/2010/wordprocessingInk" xmlns:wne="http://schemas.microsoft.com/office/word/2006/wordml" xmlns:wps="http://schemas.microsoft.com/office/word/2010/wordprocessingShape" mc:Ignorable="w14 w15 w16se w16cid w16 w16cex w16sdtdh w16sdtfl w16du wp14">
   <w:p/>
 </w:ftr>
 </file>
 
 <file path=word/footer5.xml><?xml version="1.0" encoding="utf-8"?>
-<w:ftr xmlns:wpc="http://schemas.microsoft.com/office/word/2010/wordprocessingCanvas" xmlns:cx="http://schemas.microsoft.com/office/drawing/2014/chartex" xmlns:cx1="http://schemas.microsoft.com/office/drawing/2015/9/8/chartex" xmlns:cx2="http://schemas.microsoft.com/office/drawing/2015/10/21/chartex" xmlns:cx3="http://schemas.microsoft.com/office/drawing/2016/5/9/chartex" xmlns:cx4="http://schemas.microsoft.com/office/drawing/2016/5/10/chartex" xmlns:cx5="http://schemas.microsoft.com/office/drawing/2016/5/11/chartex" xmlns:cx6="http://schemas.microsoft.com/office/drawing/2016/5/12/chartex" xmlns:cx7="http://schemas.microsoft.com/office/drawing/2016/5/13/chartex" xmlns:cx8="http://schemas.microsoft.com/office/drawing/2016/5/14/chartex" xmlns:mc="http://schemas.openxmlformats.org/markup-compatibility/2006" xmlns:m="http://schemas.openxmlformats.org/officeDocument/2006/math" xmlns:aink="http://schemas.microsoft.com/office/drawing/2016/ink" xmlns:am3d="http://schemas.microsoft.com/office/drawing/2017/model3d" xmlns:oel="http://schemas.microsoft.com/office/2019/extlst" xmlns:r="http://schemas.openxmlformats.org/officeDocument/2006/relationships" xmlns:wp14="http://schemas.microsoft.com/office/word/2010/wordprocessingDrawing" xmlns:wp="http://schemas.openxmlformats.org/drawingml/2006/wordprocessingDrawing" xmlns:wpg="http://schemas.microsoft.com/office/word/2010/wordprocessingGroup" xmlns:wpi="http://schemas.microsoft.com/office/word/2010/wordprocessingInk" xmlns:wps="http://schemas.microsoft.com/office/word/2010/wordprocessingShape" xmlns:o="urn:schemas-microsoft-com:office:office" xmlns:v="urn:schemas-microsoft-com:vml" xmlns:w10="urn:schemas-microsoft-com:office:word" xmlns:w="http://schemas.openxmlformats.org/wordprocessingml/2006/main" xmlns:w14="http://schemas.microsoft.com/office/word/2010/wordml" xmlns:w15="http://schemas.microsoft.com/office/word/2012/wordml" xmlns:w16cex="http://schemas.microsoft.com/office/word/2018/wordml/cex" xmlns:w16cid="http://schemas.microsoft.com/office/word/2016/wordml/cid" xmlns:w16="http://schemas.microsoft.com/office/word/2018/wordml" xmlns:w16sdtdh="http://schemas.microsoft.com/office/word/2020/wordml/sdtdatahash" xmlns:w16sdtfl="http://schemas.microsoft.com/office/word/2024/wordml/sdtformatlock" xmlns:w16se="http://schemas.microsoft.com/office/word/2015/wordml/symex" xmlns:w16du="http://schemas.microsoft.com/office/word/2023/wordml/word16du" xmlns:wne="http://schemas.microsoft.com/office/word/2006/wordml" mc:Ignorable="w14 w15 w16se w16cid w16 w16cex w16sdtdh w16sdtfl w16du wp14">
+<w:ftr xmlns:wpc="http://schemas.microsoft.com/office/word/2010/wordprocessingCanvas" xmlns:cx="http://schemas.microsoft.com/office/drawing/2014/chartex" xmlns:cx1="http://schemas.microsoft.com/office/drawing/2015/9/8/chartex" xmlns:cx2="http://schemas.microsoft.com/office/drawing/2015/10/21/chartex" xmlns:cx3="http://schemas.microsoft.com/office/drawing/2016/5/9/chartex" xmlns:cx4="http://schemas.microsoft.com/office/drawing/2016/5/10/chartex" xmlns:cx5="http://schemas.microsoft.com/office/drawing/2016/5/11/chartex" xmlns:cx6="http://schemas.microsoft.com/office/drawing/2016/5/12/chartex" xmlns:cx7="http://schemas.microsoft.com/office/drawing/2016/5/13/chartex" xmlns:cx8="http://schemas.microsoft.com/office/drawing/2016/5/14/chartex" xmlns:mc="http://schemas.openxmlformats.org/markup-compatibility/2006" xmlns:aink="http://schemas.microsoft.com/office/drawing/2016/ink" xmlns:am3d="http://schemas.microsoft.com/office/drawing/2017/model3d" xmlns:o="urn:schemas-microsoft-com:office:office" xmlns:oel="http://schemas.microsoft.com/office/2019/extlst" xmlns:r="http://schemas.openxmlformats.org/officeDocument/2006/relationships" xmlns:m="http://schemas.openxmlformats.org/officeDocument/2006/math" xmlns:v="urn:schemas-microsoft-com:vml" xmlns:wp14="http://schemas.microsoft.com/office/word/2010/wordprocessingDrawing" xmlns:wp="http://schemas.openxmlformats.org/drawingml/2006/wordprocessingDrawing" xmlns:w10="urn:schemas-microsoft-com:office:word" xmlns:w="http://schemas.openxmlformats.org/wordprocessingml/2006/main" xmlns:w14="http://schemas.microsoft.com/office/word/2010/wordml" xmlns:w15="http://schemas.microsoft.com/office/word/2012/wordml" xmlns:w16cex="http://schemas.microsoft.com/office/word/2018/wordml/cex" xmlns:w16cid="http://schemas.microsoft.com/office/word/2016/wordml/cid" xmlns:w16="http://schemas.microsoft.com/office/word/2018/wordml" xmlns:w16du="http://schemas.microsoft.com/office/word/2023/wordml/word16du" xmlns:w16sdtdh="http://schemas.microsoft.com/office/word/2020/wordml/sdtdatahash" xmlns:w16sdtfl="http://schemas.microsoft.com/office/word/2024/wordml/sdtformatlock" xmlns:w16se="http://schemas.microsoft.com/office/word/2015/wordml/symex" xmlns:wpg="http://schemas.microsoft.com/office/word/2010/wordprocessingGroup" xmlns:wpi="http://schemas.microsoft.com/office/word/2010/wordprocessingInk" xmlns:wne="http://schemas.microsoft.com/office/word/2006/wordml" xmlns:wps="http://schemas.microsoft.com/office/word/2010/wordprocessingShape" mc:Ignorable="w14 w15 w16se w16cid w16 w16cex w16sdtdh w16sdtfl w16du wp14">
+  <w:p/>
+</w:ftr>
+</file>
+
+<file path=word/footer6.xml><?xml version="1.0" encoding="utf-8"?>
+<w:ftr xmlns:wpc="http://schemas.microsoft.com/office/word/2010/wordprocessingCanvas" xmlns:cx="http://schemas.microsoft.com/office/drawing/2014/chartex" xmlns:cx1="http://schemas.microsoft.com/office/drawing/2015/9/8/chartex" xmlns:cx2="http://schemas.microsoft.com/office/drawing/2015/10/21/chartex" xmlns:cx3="http://schemas.microsoft.com/office/drawing/2016/5/9/chartex" xmlns:cx4="http://schemas.microsoft.com/office/drawing/2016/5/10/chartex" xmlns:cx5="http://schemas.microsoft.com/office/drawing/2016/5/11/chartex" xmlns:cx6="http://schemas.microsoft.com/office/drawing/2016/5/12/chartex" xmlns:cx7="http://schemas.microsoft.com/office/drawing/2016/5/13/chartex" xmlns:cx8="http://schemas.microsoft.com/office/drawing/2016/5/14/chartex" xmlns:mc="http://schemas.openxmlformats.org/markup-compatibility/2006" xmlns:aink="http://schemas.microsoft.com/office/drawing/2016/ink" xmlns:am3d="http://schemas.microsoft.com/office/drawing/2017/model3d" xmlns:o="urn:schemas-microsoft-com:office:office" xmlns:oel="http://schemas.microsoft.com/office/2019/extlst" xmlns:r="http://schemas.openxmlformats.org/officeDocument/2006/relationships" xmlns:m="http://schemas.openxmlformats.org/officeDocument/2006/math" xmlns:v="urn:schemas-microsoft-com:vml" xmlns:wp14="http://schemas.microsoft.com/office/word/2010/wordprocessingDrawing" xmlns:wp="http://schemas.openxmlformats.org/drawingml/2006/wordprocessingDrawing" xmlns:w10="urn:schemas-microsoft-com:office:word" xmlns:w="http://schemas.openxmlformats.org/wordprocessingml/2006/main" xmlns:w14="http://schemas.microsoft.com/office/word/2010/wordml" xmlns:w15="http://schemas.microsoft.com/office/word/2012/wordml" xmlns:w16cex="http://schemas.microsoft.com/office/word/2018/wordml/cex" xmlns:w16cid="http://schemas.microsoft.com/office/word/2016/wordml/cid" xmlns:w16="http://schemas.microsoft.com/office/word/2018/wordml" xmlns:w16du="http://schemas.microsoft.com/office/word/2023/wordml/word16du" xmlns:w16sdtdh="http://schemas.microsoft.com/office/word/2020/wordml/sdtdatahash" xmlns:w16sdtfl="http://schemas.microsoft.com/office/word/2024/wordml/sdtformatlock" xmlns:w16se="http://schemas.microsoft.com/office/word/2015/wordml/symex" xmlns:wpg="http://schemas.microsoft.com/office/word/2010/wordprocessingGroup" xmlns:wpi="http://schemas.microsoft.com/office/word/2010/wordprocessingInk" xmlns:wne="http://schemas.microsoft.com/office/word/2006/wordml" xmlns:wps="http://schemas.microsoft.com/office/word/2010/wordprocessingShape" mc:Ignorable="w14 w15 w16se w16cid w16 w16cex w16sdtdh w16sdtfl w16du wp14">
   <w:p>
     <w:pPr>
       <w:tabs>
@@ -8232,14 +8863,14 @@
 </w:ftr>
 </file>
 
-<file path=word/footer6.xml><?xml version="1.0" encoding="utf-8"?>
-<w:ftr xmlns:wpc="http://schemas.microsoft.com/office/word/2010/wordprocessingCanvas" xmlns:cx="http://schemas.microsoft.com/office/drawing/2014/chartex" xmlns:cx1="http://schemas.microsoft.com/office/drawing/2015/9/8/chartex" xmlns:cx2="http://schemas.microsoft.com/office/drawing/2015/10/21/chartex" xmlns:cx3="http://schemas.microsoft.com/office/drawing/2016/5/9/chartex" xmlns:cx4="http://schemas.microsoft.com/office/drawing/2016/5/10/chartex" xmlns:cx5="http://schemas.microsoft.com/office/drawing/2016/5/11/chartex" xmlns:cx6="http://schemas.microsoft.com/office/drawing/2016/5/12/chartex" xmlns:cx7="http://schemas.microsoft.com/office/drawing/2016/5/13/chartex" xmlns:cx8="http://schemas.microsoft.com/office/drawing/2016/5/14/chartex" xmlns:mc="http://schemas.openxmlformats.org/markup-compatibility/2006" xmlns:m="http://schemas.openxmlformats.org/officeDocument/2006/math" xmlns:aink="http://schemas.microsoft.com/office/drawing/2016/ink" xmlns:am3d="http://schemas.microsoft.com/office/drawing/2017/model3d" xmlns:oel="http://schemas.microsoft.com/office/2019/extlst" xmlns:r="http://schemas.openxmlformats.org/officeDocument/2006/relationships" xmlns:wp14="http://schemas.microsoft.com/office/word/2010/wordprocessingDrawing" xmlns:wp="http://schemas.openxmlformats.org/drawingml/2006/wordprocessingDrawing" xmlns:wpg="http://schemas.microsoft.com/office/word/2010/wordprocessingGroup" xmlns:wpi="http://schemas.microsoft.com/office/word/2010/wordprocessingInk" xmlns:wps="http://schemas.microsoft.com/office/word/2010/wordprocessingShape" xmlns:o="urn:schemas-microsoft-com:office:office" xmlns:v="urn:schemas-microsoft-com:vml" xmlns:w10="urn:schemas-microsoft-com:office:word" xmlns:w="http://schemas.openxmlformats.org/wordprocessingml/2006/main" xmlns:w14="http://schemas.microsoft.com/office/word/2010/wordml" xmlns:w15="http://schemas.microsoft.com/office/word/2012/wordml" xmlns:w16cex="http://schemas.microsoft.com/office/word/2018/wordml/cex" xmlns:w16cid="http://schemas.microsoft.com/office/word/2016/wordml/cid" xmlns:w16="http://schemas.microsoft.com/office/word/2018/wordml" xmlns:w16sdtdh="http://schemas.microsoft.com/office/word/2020/wordml/sdtdatahash" xmlns:w16sdtfl="http://schemas.microsoft.com/office/word/2024/wordml/sdtformatlock" xmlns:w16se="http://schemas.microsoft.com/office/word/2015/wordml/symex" xmlns:w16du="http://schemas.microsoft.com/office/word/2023/wordml/word16du" xmlns:wne="http://schemas.microsoft.com/office/word/2006/wordml" mc:Ignorable="w14 w15 w16se w16cid w16 w16cex w16sdtdh w16sdtfl w16du wp14">
+<file path=word/footer7.xml><?xml version="1.0" encoding="utf-8"?>
+<w:ftr xmlns:wpc="http://schemas.microsoft.com/office/word/2010/wordprocessingCanvas" xmlns:cx="http://schemas.microsoft.com/office/drawing/2014/chartex" xmlns:cx1="http://schemas.microsoft.com/office/drawing/2015/9/8/chartex" xmlns:cx2="http://schemas.microsoft.com/office/drawing/2015/10/21/chartex" xmlns:cx3="http://schemas.microsoft.com/office/drawing/2016/5/9/chartex" xmlns:cx4="http://schemas.microsoft.com/office/drawing/2016/5/10/chartex" xmlns:cx5="http://schemas.microsoft.com/office/drawing/2016/5/11/chartex" xmlns:cx6="http://schemas.microsoft.com/office/drawing/2016/5/12/chartex" xmlns:cx7="http://schemas.microsoft.com/office/drawing/2016/5/13/chartex" xmlns:cx8="http://schemas.microsoft.com/office/drawing/2016/5/14/chartex" xmlns:mc="http://schemas.openxmlformats.org/markup-compatibility/2006" xmlns:aink="http://schemas.microsoft.com/office/drawing/2016/ink" xmlns:am3d="http://schemas.microsoft.com/office/drawing/2017/model3d" xmlns:o="urn:schemas-microsoft-com:office:office" xmlns:oel="http://schemas.microsoft.com/office/2019/extlst" xmlns:r="http://schemas.openxmlformats.org/officeDocument/2006/relationships" xmlns:m="http://schemas.openxmlformats.org/officeDocument/2006/math" xmlns:v="urn:schemas-microsoft-com:vml" xmlns:wp14="http://schemas.microsoft.com/office/word/2010/wordprocessingDrawing" xmlns:wp="http://schemas.openxmlformats.org/drawingml/2006/wordprocessingDrawing" xmlns:w10="urn:schemas-microsoft-com:office:word" xmlns:w="http://schemas.openxmlformats.org/wordprocessingml/2006/main" xmlns:w14="http://schemas.microsoft.com/office/word/2010/wordml" xmlns:w15="http://schemas.microsoft.com/office/word/2012/wordml" xmlns:w16cex="http://schemas.microsoft.com/office/word/2018/wordml/cex" xmlns:w16cid="http://schemas.microsoft.com/office/word/2016/wordml/cid" xmlns:w16="http://schemas.microsoft.com/office/word/2018/wordml" xmlns:w16du="http://schemas.microsoft.com/office/word/2023/wordml/word16du" xmlns:w16sdtdh="http://schemas.microsoft.com/office/word/2020/wordml/sdtdatahash" xmlns:w16sdtfl="http://schemas.microsoft.com/office/word/2024/wordml/sdtformatlock" xmlns:w16se="http://schemas.microsoft.com/office/word/2015/wordml/symex" xmlns:wpg="http://schemas.microsoft.com/office/word/2010/wordprocessingGroup" xmlns:wpi="http://schemas.microsoft.com/office/word/2010/wordprocessingInk" xmlns:wne="http://schemas.microsoft.com/office/word/2006/wordml" xmlns:wps="http://schemas.microsoft.com/office/word/2010/wordprocessingShape" mc:Ignorable="w14 w15 w16se w16cid w16 w16cex w16sdtdh w16sdtfl w16du wp14">
   <w:p/>
 </w:ftr>
 </file>
 
-<file path=word/footer7.xml><?xml version="1.0" encoding="utf-8"?>
-<w:ftr xmlns:wpc="http://schemas.microsoft.com/office/word/2010/wordprocessingCanvas" xmlns:cx="http://schemas.microsoft.com/office/drawing/2014/chartex" xmlns:cx1="http://schemas.microsoft.com/office/drawing/2015/9/8/chartex" xmlns:cx2="http://schemas.microsoft.com/office/drawing/2015/10/21/chartex" xmlns:cx3="http://schemas.microsoft.com/office/drawing/2016/5/9/chartex" xmlns:cx4="http://schemas.microsoft.com/office/drawing/2016/5/10/chartex" xmlns:cx5="http://schemas.microsoft.com/office/drawing/2016/5/11/chartex" xmlns:cx6="http://schemas.microsoft.com/office/drawing/2016/5/12/chartex" xmlns:cx7="http://schemas.microsoft.com/office/drawing/2016/5/13/chartex" xmlns:cx8="http://schemas.microsoft.com/office/drawing/2016/5/14/chartex" xmlns:mc="http://schemas.openxmlformats.org/markup-compatibility/2006" xmlns:m="http://schemas.openxmlformats.org/officeDocument/2006/math" xmlns:aink="http://schemas.microsoft.com/office/drawing/2016/ink" xmlns:am3d="http://schemas.microsoft.com/office/drawing/2017/model3d" xmlns:oel="http://schemas.microsoft.com/office/2019/extlst" xmlns:r="http://schemas.openxmlformats.org/officeDocument/2006/relationships" xmlns:wp14="http://schemas.microsoft.com/office/word/2010/wordprocessingDrawing" xmlns:wp="http://schemas.openxmlformats.org/drawingml/2006/wordprocessingDrawing" xmlns:wpg="http://schemas.microsoft.com/office/word/2010/wordprocessingGroup" xmlns:wpi="http://schemas.microsoft.com/office/word/2010/wordprocessingInk" xmlns:wps="http://schemas.microsoft.com/office/word/2010/wordprocessingShape" xmlns:o="urn:schemas-microsoft-com:office:office" xmlns:v="urn:schemas-microsoft-com:vml" xmlns:w10="urn:schemas-microsoft-com:office:word" xmlns:w="http://schemas.openxmlformats.org/wordprocessingml/2006/main" xmlns:w14="http://schemas.microsoft.com/office/word/2010/wordml" xmlns:w15="http://schemas.microsoft.com/office/word/2012/wordml" xmlns:w16cex="http://schemas.microsoft.com/office/word/2018/wordml/cex" xmlns:w16cid="http://schemas.microsoft.com/office/word/2016/wordml/cid" xmlns:w16="http://schemas.microsoft.com/office/word/2018/wordml" xmlns:w16sdtdh="http://schemas.microsoft.com/office/word/2020/wordml/sdtdatahash" xmlns:w16sdtfl="http://schemas.microsoft.com/office/word/2024/wordml/sdtformatlock" xmlns:w16se="http://schemas.microsoft.com/office/word/2015/wordml/symex" xmlns:w16du="http://schemas.microsoft.com/office/word/2023/wordml/word16du" xmlns:wne="http://schemas.microsoft.com/office/word/2006/wordml" mc:Ignorable="w14 w15 w16se w16cid w16 w16cex w16sdtdh w16sdtfl w16du wp14">
+<file path=word/footer8.xml><?xml version="1.0" encoding="utf-8"?>
+<w:ftr xmlns:wpc="http://schemas.microsoft.com/office/word/2010/wordprocessingCanvas" xmlns:cx="http://schemas.microsoft.com/office/drawing/2014/chartex" xmlns:cx1="http://schemas.microsoft.com/office/drawing/2015/9/8/chartex" xmlns:cx2="http://schemas.microsoft.com/office/drawing/2015/10/21/chartex" xmlns:cx3="http://schemas.microsoft.com/office/drawing/2016/5/9/chartex" xmlns:cx4="http://schemas.microsoft.com/office/drawing/2016/5/10/chartex" xmlns:cx5="http://schemas.microsoft.com/office/drawing/2016/5/11/chartex" xmlns:cx6="http://schemas.microsoft.com/office/drawing/2016/5/12/chartex" xmlns:cx7="http://schemas.microsoft.com/office/drawing/2016/5/13/chartex" xmlns:cx8="http://schemas.microsoft.com/office/drawing/2016/5/14/chartex" xmlns:mc="http://schemas.openxmlformats.org/markup-compatibility/2006" xmlns:aink="http://schemas.microsoft.com/office/drawing/2016/ink" xmlns:am3d="http://schemas.microsoft.com/office/drawing/2017/model3d" xmlns:o="urn:schemas-microsoft-com:office:office" xmlns:oel="http://schemas.microsoft.com/office/2019/extlst" xmlns:r="http://schemas.openxmlformats.org/officeDocument/2006/relationships" xmlns:m="http://schemas.openxmlformats.org/officeDocument/2006/math" xmlns:v="urn:schemas-microsoft-com:vml" xmlns:wp14="http://schemas.microsoft.com/office/word/2010/wordprocessingDrawing" xmlns:wp="http://schemas.openxmlformats.org/drawingml/2006/wordprocessingDrawing" xmlns:w10="urn:schemas-microsoft-com:office:word" xmlns:w="http://schemas.openxmlformats.org/wordprocessingml/2006/main" xmlns:w14="http://schemas.microsoft.com/office/word/2010/wordml" xmlns:w15="http://schemas.microsoft.com/office/word/2012/wordml" xmlns:w16cex="http://schemas.microsoft.com/office/word/2018/wordml/cex" xmlns:w16cid="http://schemas.microsoft.com/office/word/2016/wordml/cid" xmlns:w16="http://schemas.microsoft.com/office/word/2018/wordml" xmlns:w16du="http://schemas.microsoft.com/office/word/2023/wordml/word16du" xmlns:w16sdtdh="http://schemas.microsoft.com/office/word/2020/wordml/sdtdatahash" xmlns:w16sdtfl="http://schemas.microsoft.com/office/word/2024/wordml/sdtformatlock" xmlns:w16se="http://schemas.microsoft.com/office/word/2015/wordml/symex" xmlns:wpg="http://schemas.microsoft.com/office/word/2010/wordprocessingGroup" xmlns:wpi="http://schemas.microsoft.com/office/word/2010/wordprocessingInk" xmlns:wne="http://schemas.microsoft.com/office/word/2006/wordml" xmlns:wps="http://schemas.microsoft.com/office/word/2010/wordprocessingShape" mc:Ignorable="w14 w15 w16se w16cid w16 w16cex w16sdtdh w16sdtfl w16du wp14">
   <w:p>
     <w:pPr>
       <w:tabs>
@@ -8374,14 +9005,14 @@
 </w:ftr>
 </file>
 
-<file path=word/footer8.xml><?xml version="1.0" encoding="utf-8"?>
-<w:ftr xmlns:wpc="http://schemas.microsoft.com/office/word/2010/wordprocessingCanvas" xmlns:cx="http://schemas.microsoft.com/office/drawing/2014/chartex" xmlns:cx1="http://schemas.microsoft.com/office/drawing/2015/9/8/chartex" xmlns:cx2="http://schemas.microsoft.com/office/drawing/2015/10/21/chartex" xmlns:cx3="http://schemas.microsoft.com/office/drawing/2016/5/9/chartex" xmlns:cx4="http://schemas.microsoft.com/office/drawing/2016/5/10/chartex" xmlns:cx5="http://schemas.microsoft.com/office/drawing/2016/5/11/chartex" xmlns:cx6="http://schemas.microsoft.com/office/drawing/2016/5/12/chartex" xmlns:cx7="http://schemas.microsoft.com/office/drawing/2016/5/13/chartex" xmlns:cx8="http://schemas.microsoft.com/office/drawing/2016/5/14/chartex" xmlns:mc="http://schemas.openxmlformats.org/markup-compatibility/2006" xmlns:m="http://schemas.openxmlformats.org/officeDocument/2006/math" xmlns:aink="http://schemas.microsoft.com/office/drawing/2016/ink" xmlns:am3d="http://schemas.microsoft.com/office/drawing/2017/model3d" xmlns:oel="http://schemas.microsoft.com/office/2019/extlst" xmlns:r="http://schemas.openxmlformats.org/officeDocument/2006/relationships" xmlns:wp14="http://schemas.microsoft.com/office/word/2010/wordprocessingDrawing" xmlns:wp="http://schemas.openxmlformats.org/drawingml/2006/wordprocessingDrawing" xmlns:wpg="http://schemas.microsoft.com/office/word/2010/wordprocessingGroup" xmlns:wpi="http://schemas.microsoft.com/office/word/2010/wordprocessingInk" xmlns:wps="http://schemas.microsoft.com/office/word/2010/wordprocessingShape" xmlns:o="urn:schemas-microsoft-com:office:office" xmlns:v="urn:schemas-microsoft-com:vml" xmlns:w10="urn:schemas-microsoft-com:office:word" xmlns:w="http://schemas.openxmlformats.org/wordprocessingml/2006/main" xmlns:w14="http://schemas.microsoft.com/office/word/2010/wordml" xmlns:w15="http://schemas.microsoft.com/office/word/2012/wordml" xmlns:w16cex="http://schemas.microsoft.com/office/word/2018/wordml/cex" xmlns:w16cid="http://schemas.microsoft.com/office/word/2016/wordml/cid" xmlns:w16="http://schemas.microsoft.com/office/word/2018/wordml" xmlns:w16sdtdh="http://schemas.microsoft.com/office/word/2020/wordml/sdtdatahash" xmlns:w16sdtfl="http://schemas.microsoft.com/office/word/2024/wordml/sdtformatlock" xmlns:w16se="http://schemas.microsoft.com/office/word/2015/wordml/symex" xmlns:w16du="http://schemas.microsoft.com/office/word/2023/wordml/word16du" xmlns:wne="http://schemas.microsoft.com/office/word/2006/wordml" mc:Ignorable="w14 w15 w16se w16cid w16 w16cex w16sdtdh w16sdtfl w16du wp14">
+<file path=word/footer9.xml><?xml version="1.0" encoding="utf-8"?>
+<w:ftr xmlns:wpc="http://schemas.microsoft.com/office/word/2010/wordprocessingCanvas" xmlns:cx="http://schemas.microsoft.com/office/drawing/2014/chartex" xmlns:cx1="http://schemas.microsoft.com/office/drawing/2015/9/8/chartex" xmlns:cx2="http://schemas.microsoft.com/office/drawing/2015/10/21/chartex" xmlns:cx3="http://schemas.microsoft.com/office/drawing/2016/5/9/chartex" xmlns:cx4="http://schemas.microsoft.com/office/drawing/2016/5/10/chartex" xmlns:cx5="http://schemas.microsoft.com/office/drawing/2016/5/11/chartex" xmlns:cx6="http://schemas.microsoft.com/office/drawing/2016/5/12/chartex" xmlns:cx7="http://schemas.microsoft.com/office/drawing/2016/5/13/chartex" xmlns:cx8="http://schemas.microsoft.com/office/drawing/2016/5/14/chartex" xmlns:mc="http://schemas.openxmlformats.org/markup-compatibility/2006" xmlns:aink="http://schemas.microsoft.com/office/drawing/2016/ink" xmlns:am3d="http://schemas.microsoft.com/office/drawing/2017/model3d" xmlns:o="urn:schemas-microsoft-com:office:office" xmlns:oel="http://schemas.microsoft.com/office/2019/extlst" xmlns:r="http://schemas.openxmlformats.org/officeDocument/2006/relationships" xmlns:m="http://schemas.openxmlformats.org/officeDocument/2006/math" xmlns:v="urn:schemas-microsoft-com:vml" xmlns:wp14="http://schemas.microsoft.com/office/word/2010/wordprocessingDrawing" xmlns:wp="http://schemas.openxmlformats.org/drawingml/2006/wordprocessingDrawing" xmlns:w10="urn:schemas-microsoft-com:office:word" xmlns:w="http://schemas.openxmlformats.org/wordprocessingml/2006/main" xmlns:w14="http://schemas.microsoft.com/office/word/2010/wordml" xmlns:w15="http://schemas.microsoft.com/office/word/2012/wordml" xmlns:w16cex="http://schemas.microsoft.com/office/word/2018/wordml/cex" xmlns:w16cid="http://schemas.microsoft.com/office/word/2016/wordml/cid" xmlns:w16="http://schemas.microsoft.com/office/word/2018/wordml" xmlns:w16du="http://schemas.microsoft.com/office/word/2023/wordml/word16du" xmlns:w16sdtdh="http://schemas.microsoft.com/office/word/2020/wordml/sdtdatahash" xmlns:w16sdtfl="http://schemas.microsoft.com/office/word/2024/wordml/sdtformatlock" xmlns:w16se="http://schemas.microsoft.com/office/word/2015/wordml/symex" xmlns:wpg="http://schemas.microsoft.com/office/word/2010/wordprocessingGroup" xmlns:wpi="http://schemas.microsoft.com/office/word/2010/wordprocessingInk" xmlns:wne="http://schemas.microsoft.com/office/word/2006/wordml" xmlns:wps="http://schemas.microsoft.com/office/word/2010/wordprocessingShape" mc:Ignorable="w14 w15 w16se w16cid w16 w16cex w16sdtdh w16sdtfl w16du wp14">
   <w:p/>
 </w:ftr>
 </file>
 
 <file path=word/footnotes.xml><?xml version="1.0" encoding="utf-8"?>
-<w:footnotes xmlns:wpc="http://schemas.microsoft.com/office/word/2010/wordprocessingCanvas" xmlns:cx="http://schemas.microsoft.com/office/drawing/2014/chartex" xmlns:cx1="http://schemas.microsoft.com/office/drawing/2015/9/8/chartex" xmlns:cx2="http://schemas.microsoft.com/office/drawing/2015/10/21/chartex" xmlns:cx3="http://schemas.microsoft.com/office/drawing/2016/5/9/chartex" xmlns:cx4="http://schemas.microsoft.com/office/drawing/2016/5/10/chartex" xmlns:cx5="http://schemas.microsoft.com/office/drawing/2016/5/11/chartex" xmlns:cx6="http://schemas.microsoft.com/office/drawing/2016/5/12/chartex" xmlns:cx7="http://schemas.microsoft.com/office/drawing/2016/5/13/chartex" xmlns:cx8="http://schemas.microsoft.com/office/drawing/2016/5/14/chartex" xmlns:mc="http://schemas.openxmlformats.org/markup-compatibility/2006" xmlns:m="http://schemas.openxmlformats.org/officeDocument/2006/math" xmlns:aink="http://schemas.microsoft.com/office/drawing/2016/ink" xmlns:am3d="http://schemas.microsoft.com/office/drawing/2017/model3d" xmlns:oel="http://schemas.microsoft.com/office/2019/extlst" xmlns:r="http://schemas.openxmlformats.org/officeDocument/2006/relationships" xmlns:wp14="http://schemas.microsoft.com/office/word/2010/wordprocessingDrawing" xmlns:wp="http://schemas.openxmlformats.org/drawingml/2006/wordprocessingDrawing" xmlns:wpg="http://schemas.microsoft.com/office/word/2010/wordprocessingGroup" xmlns:wpi="http://schemas.microsoft.com/office/word/2010/wordprocessingInk" xmlns:wps="http://schemas.microsoft.com/office/word/2010/wordprocessingShape" xmlns:o="urn:schemas-microsoft-com:office:office" xmlns:v="urn:schemas-microsoft-com:vml" xmlns:w10="urn:schemas-microsoft-com:office:word" xmlns:w="http://schemas.openxmlformats.org/wordprocessingml/2006/main" xmlns:w14="http://schemas.microsoft.com/office/word/2010/wordml" xmlns:w15="http://schemas.microsoft.com/office/word/2012/wordml" xmlns:w16cex="http://schemas.microsoft.com/office/word/2018/wordml/cex" xmlns:w16cid="http://schemas.microsoft.com/office/word/2016/wordml/cid" xmlns:w16="http://schemas.microsoft.com/office/word/2018/wordml" xmlns:w16sdtdh="http://schemas.microsoft.com/office/word/2020/wordml/sdtdatahash" xmlns:w16sdtfl="http://schemas.microsoft.com/office/word/2024/wordml/sdtformatlock" xmlns:w16se="http://schemas.microsoft.com/office/word/2015/wordml/symex" xmlns:w16du="http://schemas.microsoft.com/office/word/2023/wordml/word16du" xmlns:wne="http://schemas.microsoft.com/office/word/2006/wordml" mc:Ignorable="w14 w15 w16se w16cid w16 w16cex w16sdtdh w16sdtfl w16du wp14">
+<w:footnotes xmlns:wpc="http://schemas.microsoft.com/office/word/2010/wordprocessingCanvas" xmlns:cx="http://schemas.microsoft.com/office/drawing/2014/chartex" xmlns:cx1="http://schemas.microsoft.com/office/drawing/2015/9/8/chartex" xmlns:cx2="http://schemas.microsoft.com/office/drawing/2015/10/21/chartex" xmlns:cx3="http://schemas.microsoft.com/office/drawing/2016/5/9/chartex" xmlns:cx4="http://schemas.microsoft.com/office/drawing/2016/5/10/chartex" xmlns:cx5="http://schemas.microsoft.com/office/drawing/2016/5/11/chartex" xmlns:cx6="http://schemas.microsoft.com/office/drawing/2016/5/12/chartex" xmlns:cx7="http://schemas.microsoft.com/office/drawing/2016/5/13/chartex" xmlns:cx8="http://schemas.microsoft.com/office/drawing/2016/5/14/chartex" xmlns:mc="http://schemas.openxmlformats.org/markup-compatibility/2006" xmlns:aink="http://schemas.microsoft.com/office/drawing/2016/ink" xmlns:am3d="http://schemas.microsoft.com/office/drawing/2017/model3d" xmlns:o="urn:schemas-microsoft-com:office:office" xmlns:oel="http://schemas.microsoft.com/office/2019/extlst" xmlns:r="http://schemas.openxmlformats.org/officeDocument/2006/relationships" xmlns:m="http://schemas.openxmlformats.org/officeDocument/2006/math" xmlns:v="urn:schemas-microsoft-com:vml" xmlns:wp14="http://schemas.microsoft.com/office/word/2010/wordprocessingDrawing" xmlns:wp="http://schemas.openxmlformats.org/drawingml/2006/wordprocessingDrawing" xmlns:w10="urn:schemas-microsoft-com:office:word" xmlns:w="http://schemas.openxmlformats.org/wordprocessingml/2006/main" xmlns:w14="http://schemas.microsoft.com/office/word/2010/wordml" xmlns:w15="http://schemas.microsoft.com/office/word/2012/wordml" xmlns:w16cex="http://schemas.microsoft.com/office/word/2018/wordml/cex" xmlns:w16cid="http://schemas.microsoft.com/office/word/2016/wordml/cid" xmlns:w16="http://schemas.microsoft.com/office/word/2018/wordml" xmlns:w16du="http://schemas.microsoft.com/office/word/2023/wordml/word16du" xmlns:w16sdtdh="http://schemas.microsoft.com/office/word/2020/wordml/sdtdatahash" xmlns:w16sdtfl="http://schemas.microsoft.com/office/word/2024/wordml/sdtformatlock" xmlns:w16se="http://schemas.microsoft.com/office/word/2015/wordml/symex" xmlns:wpg="http://schemas.microsoft.com/office/word/2010/wordprocessingGroup" xmlns:wpi="http://schemas.microsoft.com/office/word/2010/wordprocessingInk" xmlns:wne="http://schemas.microsoft.com/office/word/2006/wordml" xmlns:wps="http://schemas.microsoft.com/office/word/2010/wordprocessingShape" mc:Ignorable="w14 w15 w16se w16cid w16 w16cex w16sdtdh w16sdtfl w16du wp14">
   <w:footnote w:type="separator" w:id="-1">
     <w:p>
       <w:r>
@@ -8400,7 +9031,7 @@
 </file>
 
 <file path=word/header1.xml><?xml version="1.0" encoding="utf-8"?>
-<w:hdr xmlns:wpc="http://schemas.microsoft.com/office/word/2010/wordprocessingCanvas" xmlns:cx="http://schemas.microsoft.com/office/drawing/2014/chartex" xmlns:cx1="http://schemas.microsoft.com/office/drawing/2015/9/8/chartex" xmlns:cx2="http://schemas.microsoft.com/office/drawing/2015/10/21/chartex" xmlns:cx3="http://schemas.microsoft.com/office/drawing/2016/5/9/chartex" xmlns:cx4="http://schemas.microsoft.com/office/drawing/2016/5/10/chartex" xmlns:cx5="http://schemas.microsoft.com/office/drawing/2016/5/11/chartex" xmlns:cx6="http://schemas.microsoft.com/office/drawing/2016/5/12/chartex" xmlns:cx7="http://schemas.microsoft.com/office/drawing/2016/5/13/chartex" xmlns:cx8="http://schemas.microsoft.com/office/drawing/2016/5/14/chartex" xmlns:mc="http://schemas.openxmlformats.org/markup-compatibility/2006" xmlns:m="http://schemas.openxmlformats.org/officeDocument/2006/math" xmlns:aink="http://schemas.microsoft.com/office/drawing/2016/ink" xmlns:am3d="http://schemas.microsoft.com/office/drawing/2017/model3d" xmlns:oel="http://schemas.microsoft.com/office/2019/extlst" xmlns:r="http://schemas.openxmlformats.org/officeDocument/2006/relationships" xmlns:wp14="http://schemas.microsoft.com/office/word/2010/wordprocessingDrawing" xmlns:wp="http://schemas.openxmlformats.org/drawingml/2006/wordprocessingDrawing" xmlns:wpg="http://schemas.microsoft.com/office/word/2010/wordprocessingGroup" xmlns:wpi="http://schemas.microsoft.com/office/word/2010/wordprocessingInk" xmlns:wps="http://schemas.microsoft.com/office/word/2010/wordprocessingShape" xmlns:o="urn:schemas-microsoft-com:office:office" xmlns:v="urn:schemas-microsoft-com:vml" xmlns:w10="urn:schemas-microsoft-com:office:word" xmlns:w="http://schemas.openxmlformats.org/wordprocessingml/2006/main" xmlns:w14="http://schemas.microsoft.com/office/word/2010/wordml" xmlns:w15="http://schemas.microsoft.com/office/word/2012/wordml" xmlns:w16cex="http://schemas.microsoft.com/office/word/2018/wordml/cex" xmlns:w16cid="http://schemas.microsoft.com/office/word/2016/wordml/cid" xmlns:w16="http://schemas.microsoft.com/office/word/2018/wordml" xmlns:w16sdtdh="http://schemas.microsoft.com/office/word/2020/wordml/sdtdatahash" xmlns:w16sdtfl="http://schemas.microsoft.com/office/word/2024/wordml/sdtformatlock" xmlns:w16se="http://schemas.microsoft.com/office/word/2015/wordml/symex" xmlns:w16du="http://schemas.microsoft.com/office/word/2023/wordml/word16du" xmlns:wne="http://schemas.microsoft.com/office/word/2006/wordml" mc:Ignorable="w14 w15 w16se w16cid w16 w16cex w16sdtdh w16sdtfl w16du wp14">
+<w:hdr xmlns:wpc="http://schemas.microsoft.com/office/word/2010/wordprocessingCanvas" xmlns:cx="http://schemas.microsoft.com/office/drawing/2014/chartex" xmlns:cx1="http://schemas.microsoft.com/office/drawing/2015/9/8/chartex" xmlns:cx2="http://schemas.microsoft.com/office/drawing/2015/10/21/chartex" xmlns:cx3="http://schemas.microsoft.com/office/drawing/2016/5/9/chartex" xmlns:cx4="http://schemas.microsoft.com/office/drawing/2016/5/10/chartex" xmlns:cx5="http://schemas.microsoft.com/office/drawing/2016/5/11/chartex" xmlns:cx6="http://schemas.microsoft.com/office/drawing/2016/5/12/chartex" xmlns:cx7="http://schemas.microsoft.com/office/drawing/2016/5/13/chartex" xmlns:cx8="http://schemas.microsoft.com/office/drawing/2016/5/14/chartex" xmlns:mc="http://schemas.openxmlformats.org/markup-compatibility/2006" xmlns:aink="http://schemas.microsoft.com/office/drawing/2016/ink" xmlns:am3d="http://schemas.microsoft.com/office/drawing/2017/model3d" xmlns:o="urn:schemas-microsoft-com:office:office" xmlns:oel="http://schemas.microsoft.com/office/2019/extlst" xmlns:r="http://schemas.openxmlformats.org/officeDocument/2006/relationships" xmlns:m="http://schemas.openxmlformats.org/officeDocument/2006/math" xmlns:v="urn:schemas-microsoft-com:vml" xmlns:wp14="http://schemas.microsoft.com/office/word/2010/wordprocessingDrawing" xmlns:wp="http://schemas.openxmlformats.org/drawingml/2006/wordprocessingDrawing" xmlns:w10="urn:schemas-microsoft-com:office:word" xmlns:w="http://schemas.openxmlformats.org/wordprocessingml/2006/main" xmlns:w14="http://schemas.microsoft.com/office/word/2010/wordml" xmlns:w15="http://schemas.microsoft.com/office/word/2012/wordml" xmlns:w16cex="http://schemas.microsoft.com/office/word/2018/wordml/cex" xmlns:w16cid="http://schemas.microsoft.com/office/word/2016/wordml/cid" xmlns:w16="http://schemas.microsoft.com/office/word/2018/wordml" xmlns:w16du="http://schemas.microsoft.com/office/word/2023/wordml/word16du" xmlns:w16sdtdh="http://schemas.microsoft.com/office/word/2020/wordml/sdtdatahash" xmlns:w16sdtfl="http://schemas.microsoft.com/office/word/2024/wordml/sdtformatlock" xmlns:w16se="http://schemas.microsoft.com/office/word/2015/wordml/symex" xmlns:wpg="http://schemas.microsoft.com/office/word/2010/wordprocessingGroup" xmlns:wpi="http://schemas.microsoft.com/office/word/2010/wordprocessingInk" xmlns:wne="http://schemas.microsoft.com/office/word/2006/wordml" xmlns:wps="http://schemas.microsoft.com/office/word/2010/wordprocessingShape" mc:Ignorable="w14 w15 w16se w16cid w16 w16cex w16sdtdh w16sdtfl w16du wp14">
   <w:p>
     <w:pPr>
       <w:pStyle w:val="Header"/>
@@ -8410,13 +9041,13 @@
 </file>
 
 <file path=word/header2.xml><?xml version="1.0" encoding="utf-8"?>
-<w:hdr xmlns:wpc="http://schemas.microsoft.com/office/word/2010/wordprocessingCanvas" xmlns:cx="http://schemas.microsoft.com/office/drawing/2014/chartex" xmlns:cx1="http://schemas.microsoft.com/office/drawing/2015/9/8/chartex" xmlns:cx2="http://schemas.microsoft.com/office/drawing/2015/10/21/chartex" xmlns:cx3="http://schemas.microsoft.com/office/drawing/2016/5/9/chartex" xmlns:cx4="http://schemas.microsoft.com/office/drawing/2016/5/10/chartex" xmlns:cx5="http://schemas.microsoft.com/office/drawing/2016/5/11/chartex" xmlns:cx6="http://schemas.microsoft.com/office/drawing/2016/5/12/chartex" xmlns:cx7="http://schemas.microsoft.com/office/drawing/2016/5/13/chartex" xmlns:cx8="http://schemas.microsoft.com/office/drawing/2016/5/14/chartex" xmlns:mc="http://schemas.openxmlformats.org/markup-compatibility/2006" xmlns:m="http://schemas.openxmlformats.org/officeDocument/2006/math" xmlns:aink="http://schemas.microsoft.com/office/drawing/2016/ink" xmlns:am3d="http://schemas.microsoft.com/office/drawing/2017/model3d" xmlns:oel="http://schemas.microsoft.com/office/2019/extlst" xmlns:r="http://schemas.openxmlformats.org/officeDocument/2006/relationships" xmlns:wp14="http://schemas.microsoft.com/office/word/2010/wordprocessingDrawing" xmlns:wp="http://schemas.openxmlformats.org/drawingml/2006/wordprocessingDrawing" xmlns:wpg="http://schemas.microsoft.com/office/word/2010/wordprocessingGroup" xmlns:wpi="http://schemas.microsoft.com/office/word/2010/wordprocessingInk" xmlns:wps="http://schemas.microsoft.com/office/word/2010/wordprocessingShape" xmlns:o="urn:schemas-microsoft-com:office:office" xmlns:v="urn:schemas-microsoft-com:vml" xmlns:w10="urn:schemas-microsoft-com:office:word" xmlns:w="http://schemas.openxmlformats.org/wordprocessingml/2006/main" xmlns:w14="http://schemas.microsoft.com/office/word/2010/wordml" xmlns:w15="http://schemas.microsoft.com/office/word/2012/wordml" xmlns:w16cex="http://schemas.microsoft.com/office/word/2018/wordml/cex" xmlns:w16cid="http://schemas.microsoft.com/office/word/2016/wordml/cid" xmlns:w16="http://schemas.microsoft.com/office/word/2018/wordml" xmlns:w16sdtdh="http://schemas.microsoft.com/office/word/2020/wordml/sdtdatahash" xmlns:w16sdtfl="http://schemas.microsoft.com/office/word/2024/wordml/sdtformatlock" xmlns:w16se="http://schemas.microsoft.com/office/word/2015/wordml/symex" xmlns:w16du="http://schemas.microsoft.com/office/word/2023/wordml/word16du" xmlns:wne="http://schemas.microsoft.com/office/word/2006/wordml" mc:Ignorable="w14 w15 w16se w16cid w16 w16cex w16sdtdh w16sdtfl w16du wp14">
+<w:hdr xmlns:wpc="http://schemas.microsoft.com/office/word/2010/wordprocessingCanvas" xmlns:cx="http://schemas.microsoft.com/office/drawing/2014/chartex" xmlns:cx1="http://schemas.microsoft.com/office/drawing/2015/9/8/chartex" xmlns:cx2="http://schemas.microsoft.com/office/drawing/2015/10/21/chartex" xmlns:cx3="http://schemas.microsoft.com/office/drawing/2016/5/9/chartex" xmlns:cx4="http://schemas.microsoft.com/office/drawing/2016/5/10/chartex" xmlns:cx5="http://schemas.microsoft.com/office/drawing/2016/5/11/chartex" xmlns:cx6="http://schemas.microsoft.com/office/drawing/2016/5/12/chartex" xmlns:cx7="http://schemas.microsoft.com/office/drawing/2016/5/13/chartex" xmlns:cx8="http://schemas.microsoft.com/office/drawing/2016/5/14/chartex" xmlns:mc="http://schemas.openxmlformats.org/markup-compatibility/2006" xmlns:aink="http://schemas.microsoft.com/office/drawing/2016/ink" xmlns:am3d="http://schemas.microsoft.com/office/drawing/2017/model3d" xmlns:o="urn:schemas-microsoft-com:office:office" xmlns:oel="http://schemas.microsoft.com/office/2019/extlst" xmlns:r="http://schemas.openxmlformats.org/officeDocument/2006/relationships" xmlns:m="http://schemas.openxmlformats.org/officeDocument/2006/math" xmlns:v="urn:schemas-microsoft-com:vml" xmlns:wp14="http://schemas.microsoft.com/office/word/2010/wordprocessingDrawing" xmlns:wp="http://schemas.openxmlformats.org/drawingml/2006/wordprocessingDrawing" xmlns:w10="urn:schemas-microsoft-com:office:word" xmlns:w="http://schemas.openxmlformats.org/wordprocessingml/2006/main" xmlns:w14="http://schemas.microsoft.com/office/word/2010/wordml" xmlns:w15="http://schemas.microsoft.com/office/word/2012/wordml" xmlns:w16cex="http://schemas.microsoft.com/office/word/2018/wordml/cex" xmlns:w16cid="http://schemas.microsoft.com/office/word/2016/wordml/cid" xmlns:w16="http://schemas.microsoft.com/office/word/2018/wordml" xmlns:w16du="http://schemas.microsoft.com/office/word/2023/wordml/word16du" xmlns:w16sdtdh="http://schemas.microsoft.com/office/word/2020/wordml/sdtdatahash" xmlns:w16sdtfl="http://schemas.microsoft.com/office/word/2024/wordml/sdtformatlock" xmlns:w16se="http://schemas.microsoft.com/office/word/2015/wordml/symex" xmlns:wpg="http://schemas.microsoft.com/office/word/2010/wordprocessingGroup" xmlns:wpi="http://schemas.microsoft.com/office/word/2010/wordprocessingInk" xmlns:wne="http://schemas.microsoft.com/office/word/2006/wordml" xmlns:wps="http://schemas.microsoft.com/office/word/2010/wordprocessingShape" mc:Ignorable="w14 w15 w16se w16cid w16 w16cex w16sdtdh w16sdtfl w16du wp14">
   <w:p/>
 </w:hdr>
 </file>
 
 <file path=word/header3.xml><?xml version="1.0" encoding="utf-8"?>
-<w:hdr xmlns:wpc="http://schemas.microsoft.com/office/word/2010/wordprocessingCanvas" xmlns:cx="http://schemas.microsoft.com/office/drawing/2014/chartex" xmlns:cx1="http://schemas.microsoft.com/office/drawing/2015/9/8/chartex" xmlns:cx2="http://schemas.microsoft.com/office/drawing/2015/10/21/chartex" xmlns:cx3="http://schemas.microsoft.com/office/drawing/2016/5/9/chartex" xmlns:cx4="http://schemas.microsoft.com/office/drawing/2016/5/10/chartex" xmlns:cx5="http://schemas.microsoft.com/office/drawing/2016/5/11/chartex" xmlns:cx6="http://schemas.microsoft.com/office/drawing/2016/5/12/chartex" xmlns:cx7="http://schemas.microsoft.com/office/drawing/2016/5/13/chartex" xmlns:cx8="http://schemas.microsoft.com/office/drawing/2016/5/14/chartex" xmlns:mc="http://schemas.openxmlformats.org/markup-compatibility/2006" xmlns:m="http://schemas.openxmlformats.org/officeDocument/2006/math" xmlns:aink="http://schemas.microsoft.com/office/drawing/2016/ink" xmlns:am3d="http://schemas.microsoft.com/office/drawing/2017/model3d" xmlns:oel="http://schemas.microsoft.com/office/2019/extlst" xmlns:r="http://schemas.openxmlformats.org/officeDocument/2006/relationships" xmlns:wp14="http://schemas.microsoft.com/office/word/2010/wordprocessingDrawing" xmlns:wp="http://schemas.openxmlformats.org/drawingml/2006/wordprocessingDrawing" xmlns:wpg="http://schemas.microsoft.com/office/word/2010/wordprocessingGroup" xmlns:wpi="http://schemas.microsoft.com/office/word/2010/wordprocessingInk" xmlns:wps="http://schemas.microsoft.com/office/word/2010/wordprocessingShape" xmlns:o="urn:schemas-microsoft-com:office:office" xmlns:v="urn:schemas-microsoft-com:vml" xmlns:w10="urn:schemas-microsoft-com:office:word" xmlns:w="http://schemas.openxmlformats.org/wordprocessingml/2006/main" xmlns:w14="http://schemas.microsoft.com/office/word/2010/wordml" xmlns:w15="http://schemas.microsoft.com/office/word/2012/wordml" xmlns:w16cex="http://schemas.microsoft.com/office/word/2018/wordml/cex" xmlns:w16cid="http://schemas.microsoft.com/office/word/2016/wordml/cid" xmlns:w16="http://schemas.microsoft.com/office/word/2018/wordml" xmlns:w16sdtdh="http://schemas.microsoft.com/office/word/2020/wordml/sdtdatahash" xmlns:w16sdtfl="http://schemas.microsoft.com/office/word/2024/wordml/sdtformatlock" xmlns:w16se="http://schemas.microsoft.com/office/word/2015/wordml/symex" xmlns:w16du="http://schemas.microsoft.com/office/word/2023/wordml/word16du" xmlns:wne="http://schemas.microsoft.com/office/word/2006/wordml" mc:Ignorable="w14 w15 w16se w16cid w16 w16cex w16sdtdh w16sdtfl w16du wp14">
+<w:hdr xmlns:wpc="http://schemas.microsoft.com/office/word/2010/wordprocessingCanvas" xmlns:cx="http://schemas.microsoft.com/office/drawing/2014/chartex" xmlns:cx1="http://schemas.microsoft.com/office/drawing/2015/9/8/chartex" xmlns:cx2="http://schemas.microsoft.com/office/drawing/2015/10/21/chartex" xmlns:cx3="http://schemas.microsoft.com/office/drawing/2016/5/9/chartex" xmlns:cx4="http://schemas.microsoft.com/office/drawing/2016/5/10/chartex" xmlns:cx5="http://schemas.microsoft.com/office/drawing/2016/5/11/chartex" xmlns:cx6="http://schemas.microsoft.com/office/drawing/2016/5/12/chartex" xmlns:cx7="http://schemas.microsoft.com/office/drawing/2016/5/13/chartex" xmlns:cx8="http://schemas.microsoft.com/office/drawing/2016/5/14/chartex" xmlns:mc="http://schemas.openxmlformats.org/markup-compatibility/2006" xmlns:aink="http://schemas.microsoft.com/office/drawing/2016/ink" xmlns:am3d="http://schemas.microsoft.com/office/drawing/2017/model3d" xmlns:o="urn:schemas-microsoft-com:office:office" xmlns:oel="http://schemas.microsoft.com/office/2019/extlst" xmlns:r="http://schemas.openxmlformats.org/officeDocument/2006/relationships" xmlns:m="http://schemas.openxmlformats.org/officeDocument/2006/math" xmlns:v="urn:schemas-microsoft-com:vml" xmlns:wp14="http://schemas.microsoft.com/office/word/2010/wordprocessingDrawing" xmlns:wp="http://schemas.openxmlformats.org/drawingml/2006/wordprocessingDrawing" xmlns:w10="urn:schemas-microsoft-com:office:word" xmlns:w="http://schemas.openxmlformats.org/wordprocessingml/2006/main" xmlns:w14="http://schemas.microsoft.com/office/word/2010/wordml" xmlns:w15="http://schemas.microsoft.com/office/word/2012/wordml" xmlns:w16cex="http://schemas.microsoft.com/office/word/2018/wordml/cex" xmlns:w16cid="http://schemas.microsoft.com/office/word/2016/wordml/cid" xmlns:w16="http://schemas.microsoft.com/office/word/2018/wordml" xmlns:w16du="http://schemas.microsoft.com/office/word/2023/wordml/word16du" xmlns:w16sdtdh="http://schemas.microsoft.com/office/word/2020/wordml/sdtdatahash" xmlns:w16sdtfl="http://schemas.microsoft.com/office/word/2024/wordml/sdtformatlock" xmlns:w16se="http://schemas.microsoft.com/office/word/2015/wordml/symex" xmlns:wpg="http://schemas.microsoft.com/office/word/2010/wordprocessingGroup" xmlns:wpi="http://schemas.microsoft.com/office/word/2010/wordprocessingInk" xmlns:wne="http://schemas.microsoft.com/office/word/2006/wordml" xmlns:wps="http://schemas.microsoft.com/office/word/2010/wordprocessingShape" mc:Ignorable="w14 w15 w16se w16cid w16 w16cex w16sdtdh w16sdtfl w16du wp14">
   <w:p>
     <w:pPr>
       <w:pStyle w:val="Header"/>
@@ -8426,37 +9057,43 @@
 </file>
 
 <file path=word/header4.xml><?xml version="1.0" encoding="utf-8"?>
-<w:hdr xmlns:wpc="http://schemas.microsoft.com/office/word/2010/wordprocessingCanvas" xmlns:cx="http://schemas.microsoft.com/office/drawing/2014/chartex" xmlns:cx1="http://schemas.microsoft.com/office/drawing/2015/9/8/chartex" xmlns:cx2="http://schemas.microsoft.com/office/drawing/2015/10/21/chartex" xmlns:cx3="http://schemas.microsoft.com/office/drawing/2016/5/9/chartex" xmlns:cx4="http://schemas.microsoft.com/office/drawing/2016/5/10/chartex" xmlns:cx5="http://schemas.microsoft.com/office/drawing/2016/5/11/chartex" xmlns:cx6="http://schemas.microsoft.com/office/drawing/2016/5/12/chartex" xmlns:cx7="http://schemas.microsoft.com/office/drawing/2016/5/13/chartex" xmlns:cx8="http://schemas.microsoft.com/office/drawing/2016/5/14/chartex" xmlns:mc="http://schemas.openxmlformats.org/markup-compatibility/2006" xmlns:m="http://schemas.openxmlformats.org/officeDocument/2006/math" xmlns:aink="http://schemas.microsoft.com/office/drawing/2016/ink" xmlns:am3d="http://schemas.microsoft.com/office/drawing/2017/model3d" xmlns:oel="http://schemas.microsoft.com/office/2019/extlst" xmlns:r="http://schemas.openxmlformats.org/officeDocument/2006/relationships" xmlns:wp14="http://schemas.microsoft.com/office/word/2010/wordprocessingDrawing" xmlns:wp="http://schemas.openxmlformats.org/drawingml/2006/wordprocessingDrawing" xmlns:wpg="http://schemas.microsoft.com/office/word/2010/wordprocessingGroup" xmlns:wpi="http://schemas.microsoft.com/office/word/2010/wordprocessingInk" xmlns:wps="http://schemas.microsoft.com/office/word/2010/wordprocessingShape" xmlns:o="urn:schemas-microsoft-com:office:office" xmlns:v="urn:schemas-microsoft-com:vml" xmlns:w10="urn:schemas-microsoft-com:office:word" xmlns:w="http://schemas.openxmlformats.org/wordprocessingml/2006/main" xmlns:w14="http://schemas.microsoft.com/office/word/2010/wordml" xmlns:w15="http://schemas.microsoft.com/office/word/2012/wordml" xmlns:w16cex="http://schemas.microsoft.com/office/word/2018/wordml/cex" xmlns:w16cid="http://schemas.microsoft.com/office/word/2016/wordml/cid" xmlns:w16="http://schemas.microsoft.com/office/word/2018/wordml" xmlns:w16sdtdh="http://schemas.microsoft.com/office/word/2020/wordml/sdtdatahash" xmlns:w16sdtfl="http://schemas.microsoft.com/office/word/2024/wordml/sdtformatlock" xmlns:w16se="http://schemas.microsoft.com/office/word/2015/wordml/symex" xmlns:w16du="http://schemas.microsoft.com/office/word/2023/wordml/word16du" xmlns:wne="http://schemas.microsoft.com/office/word/2006/wordml" mc:Ignorable="w14 w15 w16se w16cid w16 w16cex w16sdtdh w16sdtfl w16du wp14">
+<w:hdr xmlns:wpc="http://schemas.microsoft.com/office/word/2010/wordprocessingCanvas" xmlns:cx="http://schemas.microsoft.com/office/drawing/2014/chartex" xmlns:cx1="http://schemas.microsoft.com/office/drawing/2015/9/8/chartex" xmlns:cx2="http://schemas.microsoft.com/office/drawing/2015/10/21/chartex" xmlns:cx3="http://schemas.microsoft.com/office/drawing/2016/5/9/chartex" xmlns:cx4="http://schemas.microsoft.com/office/drawing/2016/5/10/chartex" xmlns:cx5="http://schemas.microsoft.com/office/drawing/2016/5/11/chartex" xmlns:cx6="http://schemas.microsoft.com/office/drawing/2016/5/12/chartex" xmlns:cx7="http://schemas.microsoft.com/office/drawing/2016/5/13/chartex" xmlns:cx8="http://schemas.microsoft.com/office/drawing/2016/5/14/chartex" xmlns:mc="http://schemas.openxmlformats.org/markup-compatibility/2006" xmlns:aink="http://schemas.microsoft.com/office/drawing/2016/ink" xmlns:am3d="http://schemas.microsoft.com/office/drawing/2017/model3d" xmlns:o="urn:schemas-microsoft-com:office:office" xmlns:oel="http://schemas.microsoft.com/office/2019/extlst" xmlns:r="http://schemas.openxmlformats.org/officeDocument/2006/relationships" xmlns:m="http://schemas.openxmlformats.org/officeDocument/2006/math" xmlns:v="urn:schemas-microsoft-com:vml" xmlns:wp14="http://schemas.microsoft.com/office/word/2010/wordprocessingDrawing" xmlns:wp="http://schemas.openxmlformats.org/drawingml/2006/wordprocessingDrawing" xmlns:w10="urn:schemas-microsoft-com:office:word" xmlns:w="http://schemas.openxmlformats.org/wordprocessingml/2006/main" xmlns:w14="http://schemas.microsoft.com/office/word/2010/wordml" xmlns:w15="http://schemas.microsoft.com/office/word/2012/wordml" xmlns:w16cex="http://schemas.microsoft.com/office/word/2018/wordml/cex" xmlns:w16cid="http://schemas.microsoft.com/office/word/2016/wordml/cid" xmlns:w16="http://schemas.microsoft.com/office/word/2018/wordml" xmlns:w16du="http://schemas.microsoft.com/office/word/2023/wordml/word16du" xmlns:w16sdtdh="http://schemas.microsoft.com/office/word/2020/wordml/sdtdatahash" xmlns:w16sdtfl="http://schemas.microsoft.com/office/word/2024/wordml/sdtformatlock" xmlns:w16se="http://schemas.microsoft.com/office/word/2015/wordml/symex" xmlns:wpg="http://schemas.microsoft.com/office/word/2010/wordprocessingGroup" xmlns:wpi="http://schemas.microsoft.com/office/word/2010/wordprocessingInk" xmlns:wne="http://schemas.microsoft.com/office/word/2006/wordml" xmlns:wps="http://schemas.microsoft.com/office/word/2010/wordprocessingShape" mc:Ignorable="w14 w15 w16se w16cid w16 w16cex w16sdtdh w16sdtfl w16du wp14">
   <w:p/>
 </w:hdr>
 </file>
 
 <file path=word/header5.xml><?xml version="1.0" encoding="utf-8"?>
-<w:hdr xmlns:wpc="http://schemas.microsoft.com/office/word/2010/wordprocessingCanvas" xmlns:cx="http://schemas.microsoft.com/office/drawing/2014/chartex" xmlns:cx1="http://schemas.microsoft.com/office/drawing/2015/9/8/chartex" xmlns:cx2="http://schemas.microsoft.com/office/drawing/2015/10/21/chartex" xmlns:cx3="http://schemas.microsoft.com/office/drawing/2016/5/9/chartex" xmlns:cx4="http://schemas.microsoft.com/office/drawing/2016/5/10/chartex" xmlns:cx5="http://schemas.microsoft.com/office/drawing/2016/5/11/chartex" xmlns:cx6="http://schemas.microsoft.com/office/drawing/2016/5/12/chartex" xmlns:cx7="http://schemas.microsoft.com/office/drawing/2016/5/13/chartex" xmlns:cx8="http://schemas.microsoft.com/office/drawing/2016/5/14/chartex" xmlns:mc="http://schemas.openxmlformats.org/markup-compatibility/2006" xmlns:m="http://schemas.openxmlformats.org/officeDocument/2006/math" xmlns:aink="http://schemas.microsoft.com/office/drawing/2016/ink" xmlns:am3d="http://schemas.microsoft.com/office/drawing/2017/model3d" xmlns:oel="http://schemas.microsoft.com/office/2019/extlst" xmlns:r="http://schemas.openxmlformats.org/officeDocument/2006/relationships" xmlns:wp14="http://schemas.microsoft.com/office/word/2010/wordprocessingDrawing" xmlns:wp="http://schemas.openxmlformats.org/drawingml/2006/wordprocessingDrawing" xmlns:wpg="http://schemas.microsoft.com/office/word/2010/wordprocessingGroup" xmlns:wpi="http://schemas.microsoft.com/office/word/2010/wordprocessingInk" xmlns:wps="http://schemas.microsoft.com/office/word/2010/wordprocessingShape" xmlns:o="urn:schemas-microsoft-com:office:office" xmlns:v="urn:schemas-microsoft-com:vml" xmlns:w10="urn:schemas-microsoft-com:office:word" xmlns:w="http://schemas.openxmlformats.org/wordprocessingml/2006/main" xmlns:w14="http://schemas.microsoft.com/office/word/2010/wordml" xmlns:w15="http://schemas.microsoft.com/office/word/2012/wordml" xmlns:w16cex="http://schemas.microsoft.com/office/word/2018/wordml/cex" xmlns:w16cid="http://schemas.microsoft.com/office/word/2016/wordml/cid" xmlns:w16="http://schemas.microsoft.com/office/word/2018/wordml" xmlns:w16sdtdh="http://schemas.microsoft.com/office/word/2020/wordml/sdtdatahash" xmlns:w16sdtfl="http://schemas.microsoft.com/office/word/2024/wordml/sdtformatlock" xmlns:w16se="http://schemas.microsoft.com/office/word/2015/wordml/symex" xmlns:w16du="http://schemas.microsoft.com/office/word/2023/wordml/word16du" xmlns:wne="http://schemas.microsoft.com/office/word/2006/wordml" mc:Ignorable="w14 w15 w16se w16cid w16 w16cex w16sdtdh w16sdtfl w16du wp14">
+<w:hdr xmlns:wpc="http://schemas.microsoft.com/office/word/2010/wordprocessingCanvas" xmlns:cx="http://schemas.microsoft.com/office/drawing/2014/chartex" xmlns:cx1="http://schemas.microsoft.com/office/drawing/2015/9/8/chartex" xmlns:cx2="http://schemas.microsoft.com/office/drawing/2015/10/21/chartex" xmlns:cx3="http://schemas.microsoft.com/office/drawing/2016/5/9/chartex" xmlns:cx4="http://schemas.microsoft.com/office/drawing/2016/5/10/chartex" xmlns:cx5="http://schemas.microsoft.com/office/drawing/2016/5/11/chartex" xmlns:cx6="http://schemas.microsoft.com/office/drawing/2016/5/12/chartex" xmlns:cx7="http://schemas.microsoft.com/office/drawing/2016/5/13/chartex" xmlns:cx8="http://schemas.microsoft.com/office/drawing/2016/5/14/chartex" xmlns:mc="http://schemas.openxmlformats.org/markup-compatibility/2006" xmlns:aink="http://schemas.microsoft.com/office/drawing/2016/ink" xmlns:am3d="http://schemas.microsoft.com/office/drawing/2017/model3d" xmlns:o="urn:schemas-microsoft-com:office:office" xmlns:oel="http://schemas.microsoft.com/office/2019/extlst" xmlns:r="http://schemas.openxmlformats.org/officeDocument/2006/relationships" xmlns:m="http://schemas.openxmlformats.org/officeDocument/2006/math" xmlns:v="urn:schemas-microsoft-com:vml" xmlns:wp14="http://schemas.microsoft.com/office/word/2010/wordprocessingDrawing" xmlns:wp="http://schemas.openxmlformats.org/drawingml/2006/wordprocessingDrawing" xmlns:w10="urn:schemas-microsoft-com:office:word" xmlns:w="http://schemas.openxmlformats.org/wordprocessingml/2006/main" xmlns:w14="http://schemas.microsoft.com/office/word/2010/wordml" xmlns:w15="http://schemas.microsoft.com/office/word/2012/wordml" xmlns:w16cex="http://schemas.microsoft.com/office/word/2018/wordml/cex" xmlns:w16cid="http://schemas.microsoft.com/office/word/2016/wordml/cid" xmlns:w16="http://schemas.microsoft.com/office/word/2018/wordml" xmlns:w16du="http://schemas.microsoft.com/office/word/2023/wordml/word16du" xmlns:w16sdtdh="http://schemas.microsoft.com/office/word/2020/wordml/sdtdatahash" xmlns:w16sdtfl="http://schemas.microsoft.com/office/word/2024/wordml/sdtformatlock" xmlns:w16se="http://schemas.microsoft.com/office/word/2015/wordml/symex" xmlns:wpg="http://schemas.microsoft.com/office/word/2010/wordprocessingGroup" xmlns:wpi="http://schemas.microsoft.com/office/word/2010/wordprocessingInk" xmlns:wne="http://schemas.microsoft.com/office/word/2006/wordml" xmlns:wps="http://schemas.microsoft.com/office/word/2010/wordprocessingShape" mc:Ignorable="w14 w15 w16se w16cid w16 w16cex w16sdtdh w16sdtfl w16du wp14">
   <w:p/>
 </w:hdr>
 </file>
 
 <file path=word/header6.xml><?xml version="1.0" encoding="utf-8"?>
-<w:hdr xmlns:wpc="http://schemas.microsoft.com/office/word/2010/wordprocessingCanvas" xmlns:cx="http://schemas.microsoft.com/office/drawing/2014/chartex" xmlns:cx1="http://schemas.microsoft.com/office/drawing/2015/9/8/chartex" xmlns:cx2="http://schemas.microsoft.com/office/drawing/2015/10/21/chartex" xmlns:cx3="http://schemas.microsoft.com/office/drawing/2016/5/9/chartex" xmlns:cx4="http://schemas.microsoft.com/office/drawing/2016/5/10/chartex" xmlns:cx5="http://schemas.microsoft.com/office/drawing/2016/5/11/chartex" xmlns:cx6="http://schemas.microsoft.com/office/drawing/2016/5/12/chartex" xmlns:cx7="http://schemas.microsoft.com/office/drawing/2016/5/13/chartex" xmlns:cx8="http://schemas.microsoft.com/office/drawing/2016/5/14/chartex" xmlns:mc="http://schemas.openxmlformats.org/markup-compatibility/2006" xmlns:m="http://schemas.openxmlformats.org/officeDocument/2006/math" xmlns:aink="http://schemas.microsoft.com/office/drawing/2016/ink" xmlns:am3d="http://schemas.microsoft.com/office/drawing/2017/model3d" xmlns:oel="http://schemas.microsoft.com/office/2019/extlst" xmlns:r="http://schemas.openxmlformats.org/officeDocument/2006/relationships" xmlns:wp14="http://schemas.microsoft.com/office/word/2010/wordprocessingDrawing" xmlns:wp="http://schemas.openxmlformats.org/drawingml/2006/wordprocessingDrawing" xmlns:wpg="http://schemas.microsoft.com/office/word/2010/wordprocessingGroup" xmlns:wpi="http://schemas.microsoft.com/office/word/2010/wordprocessingInk" xmlns:wps="http://schemas.microsoft.com/office/word/2010/wordprocessingShape" xmlns:o="urn:schemas-microsoft-com:office:office" xmlns:v="urn:schemas-microsoft-com:vml" xmlns:w10="urn:schemas-microsoft-com:office:word" xmlns:w="http://schemas.openxmlformats.org/wordprocessingml/2006/main" xmlns:w14="http://schemas.microsoft.com/office/word/2010/wordml" xmlns:w15="http://schemas.microsoft.com/office/word/2012/wordml" xmlns:w16cex="http://schemas.microsoft.com/office/word/2018/wordml/cex" xmlns:w16cid="http://schemas.microsoft.com/office/word/2016/wordml/cid" xmlns:w16="http://schemas.microsoft.com/office/word/2018/wordml" xmlns:w16sdtdh="http://schemas.microsoft.com/office/word/2020/wordml/sdtdatahash" xmlns:w16sdtfl="http://schemas.microsoft.com/office/word/2024/wordml/sdtformatlock" xmlns:w16se="http://schemas.microsoft.com/office/word/2015/wordml/symex" xmlns:w16du="http://schemas.microsoft.com/office/word/2023/wordml/word16du" xmlns:wne="http://schemas.microsoft.com/office/word/2006/wordml" mc:Ignorable="w14 w15 w16se w16cid w16 w16cex w16sdtdh w16sdtfl w16du wp14">
+<w:hdr xmlns:wpc="http://schemas.microsoft.com/office/word/2010/wordprocessingCanvas" xmlns:cx="http://schemas.microsoft.com/office/drawing/2014/chartex" xmlns:cx1="http://schemas.microsoft.com/office/drawing/2015/9/8/chartex" xmlns:cx2="http://schemas.microsoft.com/office/drawing/2015/10/21/chartex" xmlns:cx3="http://schemas.microsoft.com/office/drawing/2016/5/9/chartex" xmlns:cx4="http://schemas.microsoft.com/office/drawing/2016/5/10/chartex" xmlns:cx5="http://schemas.microsoft.com/office/drawing/2016/5/11/chartex" xmlns:cx6="http://schemas.microsoft.com/office/drawing/2016/5/12/chartex" xmlns:cx7="http://schemas.microsoft.com/office/drawing/2016/5/13/chartex" xmlns:cx8="http://schemas.microsoft.com/office/drawing/2016/5/14/chartex" xmlns:mc="http://schemas.openxmlformats.org/markup-compatibility/2006" xmlns:aink="http://schemas.microsoft.com/office/drawing/2016/ink" xmlns:am3d="http://schemas.microsoft.com/office/drawing/2017/model3d" xmlns:o="urn:schemas-microsoft-com:office:office" xmlns:oel="http://schemas.microsoft.com/office/2019/extlst" xmlns:r="http://schemas.openxmlformats.org/officeDocument/2006/relationships" xmlns:m="http://schemas.openxmlformats.org/officeDocument/2006/math" xmlns:v="urn:schemas-microsoft-com:vml" xmlns:wp14="http://schemas.microsoft.com/office/word/2010/wordprocessingDrawing" xmlns:wp="http://schemas.openxmlformats.org/drawingml/2006/wordprocessingDrawing" xmlns:w10="urn:schemas-microsoft-com:office:word" xmlns:w="http://schemas.openxmlformats.org/wordprocessingml/2006/main" xmlns:w14="http://schemas.microsoft.com/office/word/2010/wordml" xmlns:w15="http://schemas.microsoft.com/office/word/2012/wordml" xmlns:w16cex="http://schemas.microsoft.com/office/word/2018/wordml/cex" xmlns:w16cid="http://schemas.microsoft.com/office/word/2016/wordml/cid" xmlns:w16="http://schemas.microsoft.com/office/word/2018/wordml" xmlns:w16du="http://schemas.microsoft.com/office/word/2023/wordml/word16du" xmlns:w16sdtdh="http://schemas.microsoft.com/office/word/2020/wordml/sdtdatahash" xmlns:w16sdtfl="http://schemas.microsoft.com/office/word/2024/wordml/sdtformatlock" xmlns:w16se="http://schemas.microsoft.com/office/word/2015/wordml/symex" xmlns:wpg="http://schemas.microsoft.com/office/word/2010/wordprocessingGroup" xmlns:wpi="http://schemas.microsoft.com/office/word/2010/wordprocessingInk" xmlns:wne="http://schemas.microsoft.com/office/word/2006/wordml" xmlns:wps="http://schemas.microsoft.com/office/word/2010/wordprocessingShape" mc:Ignorable="w14 w15 w16se w16cid w16 w16cex w16sdtdh w16sdtfl w16du wp14">
   <w:p/>
 </w:hdr>
 </file>
 
 <file path=word/header7.xml><?xml version="1.0" encoding="utf-8"?>
-<w:hdr xmlns:wpc="http://schemas.microsoft.com/office/word/2010/wordprocessingCanvas" xmlns:cx="http://schemas.microsoft.com/office/drawing/2014/chartex" xmlns:cx1="http://schemas.microsoft.com/office/drawing/2015/9/8/chartex" xmlns:cx2="http://schemas.microsoft.com/office/drawing/2015/10/21/chartex" xmlns:cx3="http://schemas.microsoft.com/office/drawing/2016/5/9/chartex" xmlns:cx4="http://schemas.microsoft.com/office/drawing/2016/5/10/chartex" xmlns:cx5="http://schemas.microsoft.com/office/drawing/2016/5/11/chartex" xmlns:cx6="http://schemas.microsoft.com/office/drawing/2016/5/12/chartex" xmlns:cx7="http://schemas.microsoft.com/office/drawing/2016/5/13/chartex" xmlns:cx8="http://schemas.microsoft.com/office/drawing/2016/5/14/chartex" xmlns:mc="http://schemas.openxmlformats.org/markup-compatibility/2006" xmlns:m="http://schemas.openxmlformats.org/officeDocument/2006/math" xmlns:aink="http://schemas.microsoft.com/office/drawing/2016/ink" xmlns:am3d="http://schemas.microsoft.com/office/drawing/2017/model3d" xmlns:oel="http://schemas.microsoft.com/office/2019/extlst" xmlns:r="http://schemas.openxmlformats.org/officeDocument/2006/relationships" xmlns:wp14="http://schemas.microsoft.com/office/word/2010/wordprocessingDrawing" xmlns:wp="http://schemas.openxmlformats.org/drawingml/2006/wordprocessingDrawing" xmlns:wpg="http://schemas.microsoft.com/office/word/2010/wordprocessingGroup" xmlns:wpi="http://schemas.microsoft.com/office/word/2010/wordprocessingInk" xmlns:wps="http://schemas.microsoft.com/office/word/2010/wordprocessingShape" xmlns:o="urn:schemas-microsoft-com:office:office" xmlns:v="urn:schemas-microsoft-com:vml" xmlns:w10="urn:schemas-microsoft-com:office:word" xmlns:w="http://schemas.openxmlformats.org/wordprocessingml/2006/main" xmlns:w14="http://schemas.microsoft.com/office/word/2010/wordml" xmlns:w15="http://schemas.microsoft.com/office/word/2012/wordml" xmlns:w16cex="http://schemas.microsoft.com/office/word/2018/wordml/cex" xmlns:w16cid="http://schemas.microsoft.com/office/word/2016/wordml/cid" xmlns:w16="http://schemas.microsoft.com/office/word/2018/wordml" xmlns:w16sdtdh="http://schemas.microsoft.com/office/word/2020/wordml/sdtdatahash" xmlns:w16sdtfl="http://schemas.microsoft.com/office/word/2024/wordml/sdtformatlock" xmlns:w16se="http://schemas.microsoft.com/office/word/2015/wordml/symex" xmlns:w16du="http://schemas.microsoft.com/office/word/2023/wordml/word16du" xmlns:wne="http://schemas.microsoft.com/office/word/2006/wordml" mc:Ignorable="w14 w15 w16se w16cid w16 w16cex w16sdtdh w16sdtfl w16du wp14">
+<w:hdr xmlns:wpc="http://schemas.microsoft.com/office/word/2010/wordprocessingCanvas" xmlns:cx="http://schemas.microsoft.com/office/drawing/2014/chartex" xmlns:cx1="http://schemas.microsoft.com/office/drawing/2015/9/8/chartex" xmlns:cx2="http://schemas.microsoft.com/office/drawing/2015/10/21/chartex" xmlns:cx3="http://schemas.microsoft.com/office/drawing/2016/5/9/chartex" xmlns:cx4="http://schemas.microsoft.com/office/drawing/2016/5/10/chartex" xmlns:cx5="http://schemas.microsoft.com/office/drawing/2016/5/11/chartex" xmlns:cx6="http://schemas.microsoft.com/office/drawing/2016/5/12/chartex" xmlns:cx7="http://schemas.microsoft.com/office/drawing/2016/5/13/chartex" xmlns:cx8="http://schemas.microsoft.com/office/drawing/2016/5/14/chartex" xmlns:mc="http://schemas.openxmlformats.org/markup-compatibility/2006" xmlns:aink="http://schemas.microsoft.com/office/drawing/2016/ink" xmlns:am3d="http://schemas.microsoft.com/office/drawing/2017/model3d" xmlns:o="urn:schemas-microsoft-com:office:office" xmlns:oel="http://schemas.microsoft.com/office/2019/extlst" xmlns:r="http://schemas.openxmlformats.org/officeDocument/2006/relationships" xmlns:m="http://schemas.openxmlformats.org/officeDocument/2006/math" xmlns:v="urn:schemas-microsoft-com:vml" xmlns:wp14="http://schemas.microsoft.com/office/word/2010/wordprocessingDrawing" xmlns:wp="http://schemas.openxmlformats.org/drawingml/2006/wordprocessingDrawing" xmlns:w10="urn:schemas-microsoft-com:office:word" xmlns:w="http://schemas.openxmlformats.org/wordprocessingml/2006/main" xmlns:w14="http://schemas.microsoft.com/office/word/2010/wordml" xmlns:w15="http://schemas.microsoft.com/office/word/2012/wordml" xmlns:w16cex="http://schemas.microsoft.com/office/word/2018/wordml/cex" xmlns:w16cid="http://schemas.microsoft.com/office/word/2016/wordml/cid" xmlns:w16="http://schemas.microsoft.com/office/word/2018/wordml" xmlns:w16du="http://schemas.microsoft.com/office/word/2023/wordml/word16du" xmlns:w16sdtdh="http://schemas.microsoft.com/office/word/2020/wordml/sdtdatahash" xmlns:w16sdtfl="http://schemas.microsoft.com/office/word/2024/wordml/sdtformatlock" xmlns:w16se="http://schemas.microsoft.com/office/word/2015/wordml/symex" xmlns:wpg="http://schemas.microsoft.com/office/word/2010/wordprocessingGroup" xmlns:wpi="http://schemas.microsoft.com/office/word/2010/wordprocessingInk" xmlns:wne="http://schemas.microsoft.com/office/word/2006/wordml" xmlns:wps="http://schemas.microsoft.com/office/word/2010/wordprocessingShape" mc:Ignorable="w14 w15 w16se w16cid w16 w16cex w16sdtdh w16sdtfl w16du wp14">
   <w:p/>
 </w:hdr>
 </file>
 
 <file path=word/header8.xml><?xml version="1.0" encoding="utf-8"?>
-<w:hdr xmlns:wpc="http://schemas.microsoft.com/office/word/2010/wordprocessingCanvas" xmlns:cx="http://schemas.microsoft.com/office/drawing/2014/chartex" xmlns:cx1="http://schemas.microsoft.com/office/drawing/2015/9/8/chartex" xmlns:cx2="http://schemas.microsoft.com/office/drawing/2015/10/21/chartex" xmlns:cx3="http://schemas.microsoft.com/office/drawing/2016/5/9/chartex" xmlns:cx4="http://schemas.microsoft.com/office/drawing/2016/5/10/chartex" xmlns:cx5="http://schemas.microsoft.com/office/drawing/2016/5/11/chartex" xmlns:cx6="http://schemas.microsoft.com/office/drawing/2016/5/12/chartex" xmlns:cx7="http://schemas.microsoft.com/office/drawing/2016/5/13/chartex" xmlns:cx8="http://schemas.microsoft.com/office/drawing/2016/5/14/chartex" xmlns:mc="http://schemas.openxmlformats.org/markup-compatibility/2006" xmlns:m="http://schemas.openxmlformats.org/officeDocument/2006/math" xmlns:aink="http://schemas.microsoft.com/office/drawing/2016/ink" xmlns:am3d="http://schemas.microsoft.com/office/drawing/2017/model3d" xmlns:oel="http://schemas.microsoft.com/office/2019/extlst" xmlns:r="http://schemas.openxmlformats.org/officeDocument/2006/relationships" xmlns:wp14="http://schemas.microsoft.com/office/word/2010/wordprocessingDrawing" xmlns:wp="http://schemas.openxmlformats.org/drawingml/2006/wordprocessingDrawing" xmlns:wpg="http://schemas.microsoft.com/office/word/2010/wordprocessingGroup" xmlns:wpi="http://schemas.microsoft.com/office/word/2010/wordprocessingInk" xmlns:wps="http://schemas.microsoft.com/office/word/2010/wordprocessingShape" xmlns:o="urn:schemas-microsoft-com:office:office" xmlns:v="urn:schemas-microsoft-com:vml" xmlns:w10="urn:schemas-microsoft-com:office:word" xmlns:w="http://schemas.openxmlformats.org/wordprocessingml/2006/main" xmlns:w14="http://schemas.microsoft.com/office/word/2010/wordml" xmlns:w15="http://schemas.microsoft.com/office/word/2012/wordml" xmlns:w16cex="http://schemas.microsoft.com/office/word/2018/wordml/cex" xmlns:w16cid="http://schemas.microsoft.com/office/word/2016/wordml/cid" xmlns:w16="http://schemas.microsoft.com/office/word/2018/wordml" xmlns:w16sdtdh="http://schemas.microsoft.com/office/word/2020/wordml/sdtdatahash" xmlns:w16sdtfl="http://schemas.microsoft.com/office/word/2024/wordml/sdtformatlock" xmlns:w16se="http://schemas.microsoft.com/office/word/2015/wordml/symex" xmlns:w16du="http://schemas.microsoft.com/office/word/2023/wordml/word16du" xmlns:wne="http://schemas.microsoft.com/office/word/2006/wordml" mc:Ignorable="w14 w15 w16se w16cid w16 w16cex w16sdtdh w16sdtfl w16du wp14">
+<w:hdr xmlns:wpc="http://schemas.microsoft.com/office/word/2010/wordprocessingCanvas" xmlns:cx="http://schemas.microsoft.com/office/drawing/2014/chartex" xmlns:cx1="http://schemas.microsoft.com/office/drawing/2015/9/8/chartex" xmlns:cx2="http://schemas.microsoft.com/office/drawing/2015/10/21/chartex" xmlns:cx3="http://schemas.microsoft.com/office/drawing/2016/5/9/chartex" xmlns:cx4="http://schemas.microsoft.com/office/drawing/2016/5/10/chartex" xmlns:cx5="http://schemas.microsoft.com/office/drawing/2016/5/11/chartex" xmlns:cx6="http://schemas.microsoft.com/office/drawing/2016/5/12/chartex" xmlns:cx7="http://schemas.microsoft.com/office/drawing/2016/5/13/chartex" xmlns:cx8="http://schemas.microsoft.com/office/drawing/2016/5/14/chartex" xmlns:mc="http://schemas.openxmlformats.org/markup-compatibility/2006" xmlns:aink="http://schemas.microsoft.com/office/drawing/2016/ink" xmlns:am3d="http://schemas.microsoft.com/office/drawing/2017/model3d" xmlns:o="urn:schemas-microsoft-com:office:office" xmlns:oel="http://schemas.microsoft.com/office/2019/extlst" xmlns:r="http://schemas.openxmlformats.org/officeDocument/2006/relationships" xmlns:m="http://schemas.openxmlformats.org/officeDocument/2006/math" xmlns:v="urn:schemas-microsoft-com:vml" xmlns:wp14="http://schemas.microsoft.com/office/word/2010/wordprocessingDrawing" xmlns:wp="http://schemas.openxmlformats.org/drawingml/2006/wordprocessingDrawing" xmlns:w10="urn:schemas-microsoft-com:office:word" xmlns:w="http://schemas.openxmlformats.org/wordprocessingml/2006/main" xmlns:w14="http://schemas.microsoft.com/office/word/2010/wordml" xmlns:w15="http://schemas.microsoft.com/office/word/2012/wordml" xmlns:w16cex="http://schemas.microsoft.com/office/word/2018/wordml/cex" xmlns:w16cid="http://schemas.microsoft.com/office/word/2016/wordml/cid" xmlns:w16="http://schemas.microsoft.com/office/word/2018/wordml" xmlns:w16du="http://schemas.microsoft.com/office/word/2023/wordml/word16du" xmlns:w16sdtdh="http://schemas.microsoft.com/office/word/2020/wordml/sdtdatahash" xmlns:w16sdtfl="http://schemas.microsoft.com/office/word/2024/wordml/sdtformatlock" xmlns:w16se="http://schemas.microsoft.com/office/word/2015/wordml/symex" xmlns:wpg="http://schemas.microsoft.com/office/word/2010/wordprocessingGroup" xmlns:wpi="http://schemas.microsoft.com/office/word/2010/wordprocessingInk" xmlns:wne="http://schemas.microsoft.com/office/word/2006/wordml" xmlns:wps="http://schemas.microsoft.com/office/word/2010/wordprocessingShape" mc:Ignorable="w14 w15 w16se w16cid w16 w16cex w16sdtdh w16sdtfl w16du wp14">
+  <w:p/>
+</w:hdr>
+</file>
+
+<file path=word/header9.xml><?xml version="1.0" encoding="utf-8"?>
+<w:hdr xmlns:wpc="http://schemas.microsoft.com/office/word/2010/wordprocessingCanvas" xmlns:cx="http://schemas.microsoft.com/office/drawing/2014/chartex" xmlns:cx1="http://schemas.microsoft.com/office/drawing/2015/9/8/chartex" xmlns:cx2="http://schemas.microsoft.com/office/drawing/2015/10/21/chartex" xmlns:cx3="http://schemas.microsoft.com/office/drawing/2016/5/9/chartex" xmlns:cx4="http://schemas.microsoft.com/office/drawing/2016/5/10/chartex" xmlns:cx5="http://schemas.microsoft.com/office/drawing/2016/5/11/chartex" xmlns:cx6="http://schemas.microsoft.com/office/drawing/2016/5/12/chartex" xmlns:cx7="http://schemas.microsoft.com/office/drawing/2016/5/13/chartex" xmlns:cx8="http://schemas.microsoft.com/office/drawing/2016/5/14/chartex" xmlns:mc="http://schemas.openxmlformats.org/markup-compatibility/2006" xmlns:aink="http://schemas.microsoft.com/office/drawing/2016/ink" xmlns:am3d="http://schemas.microsoft.com/office/drawing/2017/model3d" xmlns:o="urn:schemas-microsoft-com:office:office" xmlns:oel="http://schemas.microsoft.com/office/2019/extlst" xmlns:r="http://schemas.openxmlformats.org/officeDocument/2006/relationships" xmlns:m="http://schemas.openxmlformats.org/officeDocument/2006/math" xmlns:v="urn:schemas-microsoft-com:vml" xmlns:wp14="http://schemas.microsoft.com/office/word/2010/wordprocessingDrawing" xmlns:wp="http://schemas.openxmlformats.org/drawingml/2006/wordprocessingDrawing" xmlns:w10="urn:schemas-microsoft-com:office:word" xmlns:w="http://schemas.openxmlformats.org/wordprocessingml/2006/main" xmlns:w14="http://schemas.microsoft.com/office/word/2010/wordml" xmlns:w15="http://schemas.microsoft.com/office/word/2012/wordml" xmlns:w16cex="http://schemas.microsoft.com/office/word/2018/wordml/cex" xmlns:w16cid="http://schemas.microsoft.com/office/word/2016/wordml/cid" xmlns:w16="http://schemas.microsoft.com/office/word/2018/wordml" xmlns:w16du="http://schemas.microsoft.com/office/word/2023/wordml/word16du" xmlns:w16sdtdh="http://schemas.microsoft.com/office/word/2020/wordml/sdtdatahash" xmlns:w16sdtfl="http://schemas.microsoft.com/office/word/2024/wordml/sdtformatlock" xmlns:w16se="http://schemas.microsoft.com/office/word/2015/wordml/symex" xmlns:wpg="http://schemas.microsoft.com/office/word/2010/wordprocessingGroup" xmlns:wpi="http://schemas.microsoft.com/office/word/2010/wordprocessingInk" xmlns:wne="http://schemas.microsoft.com/office/word/2006/wordml" xmlns:wps="http://schemas.microsoft.com/office/word/2010/wordprocessingShape" mc:Ignorable="w14 w15 w16se w16cid w16 w16cex w16sdtdh w16sdtfl w16du wp14">
   <w:p/>
 </w:hdr>
 </file>
 
 <file path=word/numbering.xml><?xml version="1.0" encoding="utf-8"?>
-<w:numbering xmlns:wpc="http://schemas.microsoft.com/office/word/2010/wordprocessingCanvas" xmlns:cx="http://schemas.microsoft.com/office/drawing/2014/chartex" xmlns:cx1="http://schemas.microsoft.com/office/drawing/2015/9/8/chartex" xmlns:cx2="http://schemas.microsoft.com/office/drawing/2015/10/21/chartex" xmlns:cx3="http://schemas.microsoft.com/office/drawing/2016/5/9/chartex" xmlns:cx4="http://schemas.microsoft.com/office/drawing/2016/5/10/chartex" xmlns:cx5="http://schemas.microsoft.com/office/drawing/2016/5/11/chartex" xmlns:cx6="http://schemas.microsoft.com/office/drawing/2016/5/12/chartex" xmlns:cx7="http://schemas.microsoft.com/office/drawing/2016/5/13/chartex" xmlns:cx8="http://schemas.microsoft.com/office/drawing/2016/5/14/chartex" xmlns:mc="http://schemas.openxmlformats.org/markup-compatibility/2006" xmlns:m="http://schemas.openxmlformats.org/officeDocument/2006/math" xmlns:aink="http://schemas.microsoft.com/office/drawing/2016/ink" xmlns:am3d="http://schemas.microsoft.com/office/drawing/2017/model3d" xmlns:oel="http://schemas.microsoft.com/office/2019/extlst" xmlns:r="http://schemas.openxmlformats.org/officeDocument/2006/relationships" xmlns:wp14="http://schemas.microsoft.com/office/word/2010/wordprocessingDrawing" xmlns:wp="http://schemas.openxmlformats.org/drawingml/2006/wordprocessingDrawing" xmlns:wpg="http://schemas.microsoft.com/office/word/2010/wordprocessingGroup" xmlns:wpi="http://schemas.microsoft.com/office/word/2010/wordprocessingInk" xmlns:wps="http://schemas.microsoft.com/office/word/2010/wordprocessingShape" xmlns:o="urn:schemas-microsoft-com:office:office" xmlns:v="urn:schemas-microsoft-com:vml" xmlns:w10="urn:schemas-microsoft-com:office:word" xmlns:w="http://schemas.openxmlformats.org/wordprocessingml/2006/main" xmlns:w14="http://schemas.microsoft.com/office/word/2010/wordml" xmlns:w15="http://schemas.microsoft.com/office/word/2012/wordml" xmlns:w16cex="http://schemas.microsoft.com/office/word/2018/wordml/cex" xmlns:w16cid="http://schemas.microsoft.com/office/word/2016/wordml/cid" xmlns:w16="http://schemas.microsoft.com/office/word/2018/wordml" xmlns:w16sdtdh="http://schemas.microsoft.com/office/word/2020/wordml/sdtdatahash" xmlns:w16sdtfl="http://schemas.microsoft.com/office/word/2024/wordml/sdtformatlock" xmlns:w16se="http://schemas.microsoft.com/office/word/2015/wordml/symex" xmlns:w16du="http://schemas.microsoft.com/office/word/2023/wordml/word16du" xmlns:wne="http://schemas.microsoft.com/office/word/2006/wordml" mc:Ignorable="w14 w15 w16se w16cid w16 w16cex w16sdtdh w16sdtfl w16du wp14">
+<w:numbering xmlns:wpc="http://schemas.microsoft.com/office/word/2010/wordprocessingCanvas" xmlns:cx="http://schemas.microsoft.com/office/drawing/2014/chartex" xmlns:cx1="http://schemas.microsoft.com/office/drawing/2015/9/8/chartex" xmlns:cx2="http://schemas.microsoft.com/office/drawing/2015/10/21/chartex" xmlns:cx3="http://schemas.microsoft.com/office/drawing/2016/5/9/chartex" xmlns:cx4="http://schemas.microsoft.com/office/drawing/2016/5/10/chartex" xmlns:cx5="http://schemas.microsoft.com/office/drawing/2016/5/11/chartex" xmlns:cx6="http://schemas.microsoft.com/office/drawing/2016/5/12/chartex" xmlns:cx7="http://schemas.microsoft.com/office/drawing/2016/5/13/chartex" xmlns:cx8="http://schemas.microsoft.com/office/drawing/2016/5/14/chartex" xmlns:mc="http://schemas.openxmlformats.org/markup-compatibility/2006" xmlns:aink="http://schemas.microsoft.com/office/drawing/2016/ink" xmlns:am3d="http://schemas.microsoft.com/office/drawing/2017/model3d" xmlns:o="urn:schemas-microsoft-com:office:office" xmlns:oel="http://schemas.microsoft.com/office/2019/extlst" xmlns:r="http://schemas.openxmlformats.org/officeDocument/2006/relationships" xmlns:m="http://schemas.openxmlformats.org/officeDocument/2006/math" xmlns:v="urn:schemas-microsoft-com:vml" xmlns:wp14="http://schemas.microsoft.com/office/word/2010/wordprocessingDrawing" xmlns:wp="http://schemas.openxmlformats.org/drawingml/2006/wordprocessingDrawing" xmlns:w10="urn:schemas-microsoft-com:office:word" xmlns:w="http://schemas.openxmlformats.org/wordprocessingml/2006/main" xmlns:w14="http://schemas.microsoft.com/office/word/2010/wordml" xmlns:w15="http://schemas.microsoft.com/office/word/2012/wordml" xmlns:w16cex="http://schemas.microsoft.com/office/word/2018/wordml/cex" xmlns:w16cid="http://schemas.microsoft.com/office/word/2016/wordml/cid" xmlns:w16="http://schemas.microsoft.com/office/word/2018/wordml" xmlns:w16du="http://schemas.microsoft.com/office/word/2023/wordml/word16du" xmlns:w16sdtdh="http://schemas.microsoft.com/office/word/2020/wordml/sdtdatahash" xmlns:w16sdtfl="http://schemas.microsoft.com/office/word/2024/wordml/sdtformatlock" xmlns:w16se="http://schemas.microsoft.com/office/word/2015/wordml/symex" xmlns:wpg="http://schemas.microsoft.com/office/word/2010/wordprocessingGroup" xmlns:wpi="http://schemas.microsoft.com/office/word/2010/wordprocessingInk" xmlns:wne="http://schemas.microsoft.com/office/word/2006/wordml" xmlns:wps="http://schemas.microsoft.com/office/word/2010/wordprocessingShape" mc:Ignorable="w14 w15 w16se w16cid w16 w16cex w16sdtdh w16sdtfl w16du wp14">
   <w:abstractNum w:abstractNumId="0" w15:restartNumberingAfterBreak="0">
     <w:nsid w:val="4B497C10"/>
     <w:multiLevelType w:val="hybridMultilevel"/>
@@ -8616,7 +9253,7 @@
 </file>
 
 <file path=word/styles.xml><?xml version="1.0" encoding="utf-8"?>
-<w:styles xmlns:mc="http://schemas.openxmlformats.org/markup-compatibility/2006" xmlns:r="http://schemas.openxmlformats.org/officeDocument/2006/relationships" xmlns:w="http://schemas.openxmlformats.org/wordprocessingml/2006/main" xmlns:w14="http://schemas.microsoft.com/office/word/2010/wordml" xmlns:w15="http://schemas.microsoft.com/office/word/2012/wordml" xmlns:w16cex="http://schemas.microsoft.com/office/word/2018/wordml/cex" xmlns:w16cid="http://schemas.microsoft.com/office/word/2016/wordml/cid" xmlns:w16="http://schemas.microsoft.com/office/word/2018/wordml" xmlns:w16sdtdh="http://schemas.microsoft.com/office/word/2020/wordml/sdtdatahash" xmlns:w16sdtfl="http://schemas.microsoft.com/office/word/2024/wordml/sdtformatlock" xmlns:w16se="http://schemas.microsoft.com/office/word/2015/wordml/symex" xmlns:w16du="http://schemas.microsoft.com/office/word/2023/wordml/word16du" mc:Ignorable="w14 w15 w16se w16cid w16 w16cex w16sdtdh w16sdtfl w16du">
+<w:styles xmlns:mc="http://schemas.openxmlformats.org/markup-compatibility/2006" xmlns:r="http://schemas.openxmlformats.org/officeDocument/2006/relationships" xmlns:w="http://schemas.openxmlformats.org/wordprocessingml/2006/main" xmlns:w14="http://schemas.microsoft.com/office/word/2010/wordml" xmlns:w15="http://schemas.microsoft.com/office/word/2012/wordml" xmlns:w16cex="http://schemas.microsoft.com/office/word/2018/wordml/cex" xmlns:w16cid="http://schemas.microsoft.com/office/word/2016/wordml/cid" xmlns:w16="http://schemas.microsoft.com/office/word/2018/wordml" xmlns:w16du="http://schemas.microsoft.com/office/word/2023/wordml/word16du" xmlns:w16sdtdh="http://schemas.microsoft.com/office/word/2020/wordml/sdtdatahash" xmlns:w16sdtfl="http://schemas.microsoft.com/office/word/2024/wordml/sdtformatlock" xmlns:w16se="http://schemas.microsoft.com/office/word/2015/wordml/symex" mc:Ignorable="w14 w15 w16se w16cid w16 w16cex w16sdtdh w16sdtfl w16du">
   <w:docDefaults>
     <w:rPrDefault>
       <w:rPr>
@@ -9563,6 +10200,26 @@
 </file>
 
 <file path=customXml/item1.xml><?xml version="1.0" encoding="utf-8"?>
+<p:properties xmlns:p="http://schemas.microsoft.com/office/2006/metadata/properties" xmlns:xsi="http://www.w3.org/2001/XMLSchema-instance" xmlns:pc="http://schemas.microsoft.com/office/infopath/2007/PartnerControls">
+  <documentManagement>
+    <TaxCatchAll xmlns="cc335e2b-7f42-41d0-87ab-ac8237d9a47e" xsi:nil="true"/>
+    <lcf76f155ced4ddcb4097134ff3c332f xmlns="6287a675-f086-4c05-9b8c-42540f50c347">
+      <Terms xmlns="http://schemas.microsoft.com/office/infopath/2007/PartnerControls"/>
+    </lcf76f155ced4ddcb4097134ff3c332f>
+  </documentManagement>
+</p:properties>
+</file>
+
+<file path=customXml/item2.xml><?xml version="1.0" encoding="utf-8"?>
+<?mso-contentType ?>
+<FormTemplates xmlns="http://schemas.microsoft.com/sharepoint/v3/contenttype/forms">
+  <Display>DocumentLibraryForm</Display>
+  <Edit>DocumentLibraryForm</Edit>
+  <New>DocumentLibraryForm</New>
+</FormTemplates>
+</file>
+
+<file path=customXml/item3.xml><?xml version="1.0" encoding="utf-8"?>
 <ct:contentTypeSchema xmlns:ct="http://schemas.microsoft.com/office/2006/metadata/contentType" xmlns:ma="http://schemas.microsoft.com/office/2006/metadata/properties/metaAttributes" ct:_="" ma:_="" ma:contentTypeName="Document" ma:contentTypeID="0x010100B65015FF0C4D0D4A84ACD5C5EC18BC34" ma:contentTypeVersion="19" ma:contentTypeDescription="Create a new document." ma:contentTypeScope="" ma:versionID="48ad552dc4ee1b4fa7ea69b2730e5273">
   <xsd:schema xmlns:xsd="http://www.w3.org/2001/XMLSchema" xmlns:xs="http://www.w3.org/2001/XMLSchema" xmlns:p="http://schemas.microsoft.com/office/2006/metadata/properties" xmlns:ns2="6287a675-f086-4c05-9b8c-42540f50c347" xmlns:ns3="cc335e2b-7f42-41d0-87ab-ac8237d9a47e" targetNamespace="http://schemas.microsoft.com/office/2006/metadata/properties" ma:root="true" ma:fieldsID="e2c4e7ddbc6a9a755bb796a3d33b9e2d" ns2:_="" ns3:_="">
     <xsd:import namespace="6287a675-f086-4c05-9b8c-42540f50c347"/>
@@ -9823,27 +10480,26 @@
 </ct:contentTypeSchema>
 </file>
 
-<file path=customXml/item2.xml><?xml version="1.0" encoding="utf-8"?>
-<p:properties xmlns:p="http://schemas.microsoft.com/office/2006/metadata/properties" xmlns:xsi="http://www.w3.org/2001/XMLSchema-instance" xmlns:pc="http://schemas.microsoft.com/office/infopath/2007/PartnerControls">
-  <documentManagement>
-    <TaxCatchAll xmlns="cc335e2b-7f42-41d0-87ab-ac8237d9a47e" xsi:nil="true"/>
-    <lcf76f155ced4ddcb4097134ff3c332f xmlns="6287a675-f086-4c05-9b8c-42540f50c347">
-      <Terms xmlns="http://schemas.microsoft.com/office/infopath/2007/PartnerControls"/>
-    </lcf76f155ced4ddcb4097134ff3c332f>
-  </documentManagement>
-</p:properties>
+<file path=customXml/itemProps1.xml><?xml version="1.0" encoding="utf-8"?>
+<ds:datastoreItem xmlns:ds="http://schemas.openxmlformats.org/officeDocument/2006/customXml" ds:itemID="{38001403-355D-4DE0-840C-86E830DA14BB}">
+  <ds:schemaRefs>
+    <ds:schemaRef ds:uri="http://schemas.microsoft.com/office/2006/metadata/properties"/>
+    <ds:schemaRef ds:uri="http://schemas.microsoft.com/office/infopath/2007/PartnerControls"/>
+    <ds:schemaRef ds:uri="cc335e2b-7f42-41d0-87ab-ac8237d9a47e"/>
+    <ds:schemaRef ds:uri="6287a675-f086-4c05-9b8c-42540f50c347"/>
+  </ds:schemaRefs>
+</ds:datastoreItem>
 </file>
 
-<file path=customXml/item3.xml><?xml version="1.0" encoding="utf-8"?>
-<?mso-contentType ?>
-<FormTemplates xmlns="http://schemas.microsoft.com/sharepoint/v3/contenttype/forms">
-  <Display>DocumentLibraryForm</Display>
-  <Edit>DocumentLibraryForm</Edit>
-  <New>DocumentLibraryForm</New>
-</FormTemplates>
+<file path=customXml/itemProps2.xml><?xml version="1.0" encoding="utf-8"?>
+<ds:datastoreItem xmlns:ds="http://schemas.openxmlformats.org/officeDocument/2006/customXml" ds:itemID="{F64691E1-293C-4525-ADF2-7ADD5BB47A48}">
+  <ds:schemaRefs>
+    <ds:schemaRef ds:uri="http://schemas.microsoft.com/sharepoint/v3/contenttype/forms"/>
+  </ds:schemaRefs>
+</ds:datastoreItem>
 </file>
 
-<file path=customXml/itemProps1.xml><?xml version="1.0" encoding="utf-8"?>
+<file path=customXml/itemProps3.xml><?xml version="1.0" encoding="utf-8"?>
 <ds:datastoreItem xmlns:ds="http://schemas.openxmlformats.org/officeDocument/2006/customXml" ds:itemID="{6D693DBE-FF3B-46E7-81A4-04A0339CADC9}">
   <ds:schemaRefs>
     <ds:schemaRef ds:uri="http://schemas.microsoft.com/office/2006/metadata/contentType"/>
@@ -9860,23 +10516,4 @@
     <ds:schemaRef ds:uri="http://schemas.microsoft.com/internal/obd"/>
   </ds:schemaRefs>
 </ds:datastoreItem>
-</file>
-
-<file path=customXml/itemProps2.xml><?xml version="1.0" encoding="utf-8"?>
-<ds:datastoreItem xmlns:ds="http://schemas.openxmlformats.org/officeDocument/2006/customXml" ds:itemID="{38001403-355D-4DE0-840C-86E830DA14BB}">
-  <ds:schemaRefs>
-    <ds:schemaRef ds:uri="http://schemas.microsoft.com/office/2006/metadata/properties"/>
-    <ds:schemaRef ds:uri="http://schemas.microsoft.com/office/infopath/2007/PartnerControls"/>
-    <ds:schemaRef ds:uri="cc335e2b-7f42-41d0-87ab-ac8237d9a47e"/>
-    <ds:schemaRef ds:uri="6287a675-f086-4c05-9b8c-42540f50c347"/>
-  </ds:schemaRefs>
-</ds:datastoreItem>
-</file>
-
-<file path=customXml/itemProps3.xml><?xml version="1.0" encoding="utf-8"?>
-<ds:datastoreItem xmlns:ds="http://schemas.openxmlformats.org/officeDocument/2006/customXml" ds:itemID="{F64691E1-293C-4525-ADF2-7ADD5BB47A48}">
-  <ds:schemaRefs>
-    <ds:schemaRef ds:uri="http://schemas.microsoft.com/sharepoint/v3/contenttype/forms"/>
-  </ds:schemaRefs>
-</ds:datastoreItem>
 </file>
</xml_diff>